<commit_message>
Finished working on cwgs
</commit_message>
<xml_diff>
--- a/cgw/cgw_1[var11].docx
+++ b/cgw/cgw_1[var11].docx
@@ -700,7 +700,6 @@
           <w:kern w:val="2"/>
           <w:sz w:val="28"/>
           <w:szCs w:val="28"/>
-          <w:lang w:val="en-US"/>
           <w14:ligatures w14:val="standardContextual"/>
         </w:rPr>
       </w:pPr>
@@ -1661,9 +1660,11 @@
             <m:t>-1)</m:t>
           </m:r>
           <m:r>
+            <m:rPr>
+              <m:sty m:val="p"/>
+            </m:rPr>
             <w:rPr>
               <w:rFonts w:ascii="Cambria Math" w:eastAsia="Times New Roman" w:hAnsi="Cambria Math" w:cs="Times New Roman"/>
-              <w:i/>
               <w:sz w:val="24"/>
               <w:szCs w:val="24"/>
               <w:lang w:eastAsia="ru-RU"/>
@@ -1783,9 +1784,11 @@
             <m:t>-1)</m:t>
           </m:r>
           <m:r>
+            <m:rPr>
+              <m:sty m:val="p"/>
+            </m:rPr>
             <w:rPr>
               <w:rFonts w:ascii="Cambria Math" w:eastAsia="Times New Roman" w:hAnsi="Cambria Math" w:cs="Times New Roman"/>
-              <w:i/>
               <w:sz w:val="24"/>
               <w:szCs w:val="24"/>
               <w:lang w:eastAsia="ru-RU"/>
@@ -1833,6 +1836,80 @@
     </w:p>
     <w:p>
       <w:pPr>
+        <w:spacing w:before="100" w:beforeAutospacing="1" w:after="100" w:afterAutospacing="1" w:line="240" w:lineRule="auto"/>
+        <w:rPr>
+          <w:rFonts w:ascii="Times New Roman" w:eastAsia="Times New Roman" w:hAnsi="Times New Roman" w:cs="Times New Roman"/>
+          <w:sz w:val="24"/>
+          <w:szCs w:val="24"/>
+          <w:lang w:eastAsia="ru-RU"/>
+        </w:rPr>
+      </w:pPr>
+      <w:r>
+        <w:rPr>
+          <w:rFonts w:ascii="Times New Roman" w:eastAsia="Times New Roman" w:hAnsi="Times New Roman" w:cs="Times New Roman"/>
+          <w:sz w:val="24"/>
+          <w:szCs w:val="24"/>
+          <w:lang w:eastAsia="ru-RU"/>
+        </w:rPr>
+        <w:t xml:space="preserve">Для построения графика найдём максимальный ток при заданном напряжении </w:t>
+      </w:r>
+      <m:oMath>
+        <m:sSub>
+          <m:sSubPr>
+            <m:ctrlPr>
+              <w:rPr>
+                <w:rFonts w:ascii="Cambria Math" w:eastAsia="Times New Roman" w:hAnsi="Cambria Math" w:cs="Times New Roman"/>
+                <w:sz w:val="24"/>
+                <w:szCs w:val="24"/>
+                <w:lang w:eastAsia="ru-RU"/>
+              </w:rPr>
+            </m:ctrlPr>
+          </m:sSubPr>
+          <m:e>
+            <m:r>
+              <w:rPr>
+                <w:rFonts w:ascii="Cambria Math" w:eastAsia="Times New Roman" w:hAnsi="Cambria Math" w:cs="Times New Roman"/>
+                <w:sz w:val="24"/>
+                <w:szCs w:val="24"/>
+                <w:lang w:eastAsia="ru-RU"/>
+              </w:rPr>
+              <m:t>U</m:t>
+            </m:r>
+          </m:e>
+          <m:sub>
+            <m:r>
+              <w:rPr>
+                <w:rFonts w:ascii="Cambria Math" w:eastAsia="Times New Roman" w:hAnsi="Cambria Math" w:cs="Times New Roman"/>
+                <w:sz w:val="24"/>
+                <w:szCs w:val="24"/>
+                <w:lang w:eastAsia="ru-RU"/>
+              </w:rPr>
+              <m:t>m</m:t>
+            </m:r>
+          </m:sub>
+        </m:sSub>
+        <m:r>
+          <w:rPr>
+            <w:rFonts w:ascii="Cambria Math" w:eastAsia="Times New Roman" w:hAnsi="Cambria Math" w:cs="Times New Roman"/>
+            <w:sz w:val="24"/>
+            <w:szCs w:val="24"/>
+            <w:lang w:eastAsia="ru-RU"/>
+          </w:rPr>
+          <m:t>=1.5</m:t>
+        </m:r>
+      </m:oMath>
+      <w:r>
+        <w:rPr>
+          <w:rFonts w:ascii="Times New Roman" w:eastAsia="Times New Roman" w:hAnsi="Times New Roman" w:cs="Times New Roman"/>
+          <w:sz w:val="24"/>
+          <w:szCs w:val="24"/>
+          <w:lang w:eastAsia="ru-RU"/>
+        </w:rPr>
+        <w:t>В:</w:t>
+      </w:r>
+    </w:p>
+    <w:p>
+      <w:pPr>
         <w:spacing w:after="0" w:line="240" w:lineRule="auto"/>
         <w:rPr>
           <w:rFonts w:ascii="Times New Roman" w:eastAsia="Times New Roman" w:hAnsi="Times New Roman" w:cs="Times New Roman"/>
@@ -1884,7 +1961,7 @@
               <w:szCs w:val="24"/>
               <w:lang w:eastAsia="ru-RU"/>
             </w:rPr>
-            <m:t>=0.04(</m:t>
+            <m:t>=0.04⋅(</m:t>
           </m:r>
           <m:sSup>
             <m:sSupPr>
@@ -1948,62 +2025,7 @@
               <w:szCs w:val="24"/>
               <w:lang w:eastAsia="ru-RU"/>
             </w:rPr>
-            <m:t>-1)</m:t>
-          </m:r>
-          <m:r>
-            <w:rPr>
-              <w:rFonts w:ascii="Cambria Math" w:eastAsia="Times New Roman" w:hAnsi="Cambria Math" w:cs="Times New Roman"/>
-              <w:i/>
-              <w:sz w:val="24"/>
-              <w:szCs w:val="24"/>
-              <w:lang w:eastAsia="ru-RU"/>
-            </w:rPr>
-            <w:br/>
-          </m:r>
-        </m:oMath>
-        <m:oMath>
-          <m:sSub>
-            <m:sSubPr>
-              <m:ctrlPr>
-                <w:rPr>
-                  <w:rFonts w:ascii="Cambria Math" w:eastAsia="Times New Roman" w:hAnsi="Cambria Math" w:cs="Times New Roman"/>
-                  <w:sz w:val="24"/>
-                  <w:szCs w:val="24"/>
-                  <w:lang w:eastAsia="ru-RU"/>
-                </w:rPr>
-              </m:ctrlPr>
-            </m:sSubPr>
-            <m:e>
-              <m:r>
-                <w:rPr>
-                  <w:rFonts w:ascii="Cambria Math" w:eastAsia="Times New Roman" w:hAnsi="Cambria Math" w:cs="Times New Roman"/>
-                  <w:sz w:val="24"/>
-                  <w:szCs w:val="24"/>
-                  <w:lang w:eastAsia="ru-RU"/>
-                </w:rPr>
-                <m:t>I</m:t>
-              </m:r>
-            </m:e>
-            <m:sub>
-              <m:r>
-                <w:rPr>
-                  <w:rFonts w:ascii="Cambria Math" w:eastAsia="Times New Roman" w:hAnsi="Cambria Math" w:cs="Times New Roman"/>
-                  <w:sz w:val="24"/>
-                  <w:szCs w:val="24"/>
-                  <w:lang w:eastAsia="ru-RU"/>
-                </w:rPr>
-                <m:t>m</m:t>
-              </m:r>
-            </m:sub>
-          </m:sSub>
-          <m:r>
-            <w:rPr>
-              <w:rFonts w:ascii="Cambria Math" w:eastAsia="Times New Roman" w:hAnsi="Cambria Math" w:cs="Times New Roman"/>
-              <w:sz w:val="24"/>
-              <w:szCs w:val="24"/>
-              <w:lang w:eastAsia="ru-RU"/>
-            </w:rPr>
-            <m:t>=0.04(</m:t>
+            <m:t>-1)=0.04⋅(</m:t>
           </m:r>
           <m:sSup>
             <m:sSupPr>
@@ -2060,15 +2082,6 @@
             </w:rPr>
             <m:t> мА</m:t>
           </m:r>
-          <m:r>
-            <w:rPr>
-              <w:rFonts w:ascii="Times New Roman" w:eastAsia="Times New Roman" w:hAnsi="Times New Roman" w:cs="Times New Roman"/>
-              <w:sz w:val="24"/>
-              <w:szCs w:val="24"/>
-              <w:lang w:eastAsia="ru-RU"/>
-            </w:rPr>
-            <w:br/>
-          </m:r>
         </m:oMath>
       </m:oMathPara>
     </w:p>
@@ -2518,7 +2531,7 @@
     </w:tbl>
     <w:p>
       <w:pPr>
-        <w:spacing w:after="0" w:line="240" w:lineRule="auto"/>
+        <w:spacing w:before="100" w:beforeAutospacing="1" w:after="100" w:afterAutospacing="1" w:line="240" w:lineRule="auto"/>
         <w:rPr>
           <w:rFonts w:ascii="Times New Roman" w:eastAsia="Times New Roman" w:hAnsi="Times New Roman" w:cs="Times New Roman"/>
           <w:sz w:val="24"/>
@@ -2526,30 +2539,135 @@
           <w:lang w:eastAsia="ru-RU"/>
         </w:rPr>
       </w:pPr>
-    </w:p>
-    <w:p>
-      <w:pPr>
-        <w:spacing w:before="100" w:beforeAutospacing="1" w:after="100" w:afterAutospacing="1" w:line="240" w:lineRule="auto"/>
-        <w:outlineLvl w:val="1"/>
+      <w:r>
         <w:rPr>
           <w:rFonts w:ascii="Times New Roman" w:eastAsia="Times New Roman" w:hAnsi="Times New Roman" w:cs="Times New Roman"/>
           <w:b/>
           <w:bCs/>
-          <w:sz w:val="36"/>
-          <w:szCs w:val="36"/>
+          <w:sz w:val="24"/>
+          <w:szCs w:val="24"/>
           <w:lang w:eastAsia="ru-RU"/>
         </w:rPr>
-      </w:pPr>
+        <w:t>Расчет параметров в рабочей точке PT1</w:t>
+      </w:r>
       <w:r>
         <w:rPr>
           <w:rFonts w:ascii="Times New Roman" w:eastAsia="Times New Roman" w:hAnsi="Times New Roman" w:cs="Times New Roman"/>
-          <w:b/>
-          <w:bCs/>
-          <w:sz w:val="36"/>
-          <w:szCs w:val="36"/>
+          <w:sz w:val="24"/>
+          <w:szCs w:val="24"/>
           <w:lang w:eastAsia="ru-RU"/>
         </w:rPr>
-        <w:t>Расчёт статического и динамического сопротивления в рабочих точках 1 и 2:</w:t>
+        <w:br/>
+        <w:t xml:space="preserve">Точка задана напряжением </w:t>
+      </w:r>
+      <m:oMath>
+        <m:sSub>
+          <m:sSubPr>
+            <m:ctrlPr>
+              <w:rPr>
+                <w:rFonts w:ascii="Cambria Math" w:eastAsia="Times New Roman" w:hAnsi="Cambria Math" w:cs="Times New Roman"/>
+                <w:sz w:val="24"/>
+                <w:szCs w:val="24"/>
+                <w:lang w:eastAsia="ru-RU"/>
+              </w:rPr>
+            </m:ctrlPr>
+          </m:sSubPr>
+          <m:e>
+            <m:r>
+              <w:rPr>
+                <w:rFonts w:ascii="Cambria Math" w:eastAsia="Times New Roman" w:hAnsi="Cambria Math" w:cs="Times New Roman"/>
+                <w:sz w:val="24"/>
+                <w:szCs w:val="24"/>
+                <w:lang w:eastAsia="ru-RU"/>
+              </w:rPr>
+              <m:t>U</m:t>
+            </m:r>
+          </m:e>
+          <m:sub>
+            <m:r>
+              <w:rPr>
+                <w:rFonts w:ascii="Cambria Math" w:eastAsia="Times New Roman" w:hAnsi="Cambria Math" w:cs="Times New Roman"/>
+                <w:sz w:val="24"/>
+                <w:szCs w:val="24"/>
+                <w:lang w:eastAsia="ru-RU"/>
+              </w:rPr>
+              <m:t>1</m:t>
+            </m:r>
+          </m:sub>
+        </m:sSub>
+        <m:r>
+          <w:rPr>
+            <w:rFonts w:ascii="Cambria Math" w:eastAsia="Times New Roman" w:hAnsi="Cambria Math" w:cs="Times New Roman"/>
+            <w:sz w:val="24"/>
+            <w:szCs w:val="24"/>
+            <w:lang w:eastAsia="ru-RU"/>
+          </w:rPr>
+          <m:t>=1.2</m:t>
+        </m:r>
+      </m:oMath>
+      <w:r>
+        <w:rPr>
+          <w:rFonts w:ascii="Times New Roman" w:eastAsia="Times New Roman" w:hAnsi="Times New Roman" w:cs="Times New Roman"/>
+          <w:sz w:val="24"/>
+          <w:szCs w:val="24"/>
+          <w:lang w:eastAsia="ru-RU"/>
+        </w:rPr>
+        <w:t>В.</w:t>
+      </w:r>
+      <w:r>
+        <w:rPr>
+          <w:rFonts w:ascii="Times New Roman" w:eastAsia="Times New Roman" w:hAnsi="Times New Roman" w:cs="Times New Roman"/>
+          <w:sz w:val="24"/>
+          <w:szCs w:val="24"/>
+          <w:lang w:eastAsia="ru-RU"/>
+        </w:rPr>
+        <w:br/>
+        <w:t xml:space="preserve">Найдём ток </w:t>
+      </w:r>
+      <m:oMath>
+        <m:sSub>
+          <m:sSubPr>
+            <m:ctrlPr>
+              <w:rPr>
+                <w:rFonts w:ascii="Cambria Math" w:eastAsia="Times New Roman" w:hAnsi="Cambria Math" w:cs="Times New Roman"/>
+                <w:sz w:val="24"/>
+                <w:szCs w:val="24"/>
+                <w:lang w:eastAsia="ru-RU"/>
+              </w:rPr>
+            </m:ctrlPr>
+          </m:sSubPr>
+          <m:e>
+            <m:r>
+              <w:rPr>
+                <w:rFonts w:ascii="Cambria Math" w:eastAsia="Times New Roman" w:hAnsi="Cambria Math" w:cs="Times New Roman"/>
+                <w:sz w:val="24"/>
+                <w:szCs w:val="24"/>
+                <w:lang w:eastAsia="ru-RU"/>
+              </w:rPr>
+              <m:t>I</m:t>
+            </m:r>
+          </m:e>
+          <m:sub>
+            <m:r>
+              <w:rPr>
+                <w:rFonts w:ascii="Cambria Math" w:eastAsia="Times New Roman" w:hAnsi="Cambria Math" w:cs="Times New Roman"/>
+                <w:sz w:val="24"/>
+                <w:szCs w:val="24"/>
+                <w:lang w:eastAsia="ru-RU"/>
+              </w:rPr>
+              <m:t>1</m:t>
+            </m:r>
+          </m:sub>
+        </m:sSub>
+      </m:oMath>
+      <w:r>
+        <w:rPr>
+          <w:rFonts w:ascii="Times New Roman" w:eastAsia="Times New Roman" w:hAnsi="Times New Roman" w:cs="Times New Roman"/>
+          <w:sz w:val="24"/>
+          <w:szCs w:val="24"/>
+          <w:lang w:eastAsia="ru-RU"/>
+        </w:rPr>
+        <w:t>в этой точке:</w:t>
       </w:r>
     </w:p>
     <w:p>
@@ -2559,47 +2677,45 @@
           <w:rFonts w:ascii="Times New Roman" w:eastAsia="Times New Roman" w:hAnsi="Times New Roman" w:cs="Times New Roman"/>
           <w:sz w:val="24"/>
           <w:szCs w:val="24"/>
-          <w:lang w:eastAsia="ru-RU"/>
-        </w:rPr>
-      </w:pPr>
-    </w:p>
-    <w:p>
-      <w:pPr>
-        <w:spacing w:before="100" w:beforeAutospacing="1" w:after="100" w:afterAutospacing="1" w:line="240" w:lineRule="auto"/>
-        <w:outlineLvl w:val="2"/>
-        <w:rPr>
-          <w:rFonts w:ascii="Times New Roman" w:eastAsia="Times New Roman" w:hAnsi="Times New Roman" w:cs="Times New Roman"/>
-          <w:b/>
-          <w:bCs/>
-          <w:sz w:val="27"/>
-          <w:szCs w:val="27"/>
-          <w:lang w:eastAsia="ru-RU"/>
-        </w:rPr>
-      </w:pPr>
-      <w:r>
-        <w:rPr>
-          <w:rFonts w:ascii="Times New Roman" w:eastAsia="Times New Roman" w:hAnsi="Times New Roman" w:cs="Times New Roman"/>
-          <w:b/>
-          <w:bCs/>
-          <w:sz w:val="27"/>
-          <w:szCs w:val="27"/>
-          <w:lang w:eastAsia="ru-RU"/>
-        </w:rPr>
-        <w:t>РТ1:</w:t>
-      </w:r>
-    </w:p>
-    <w:p>
-      <w:pPr>
-        <w:spacing w:after="0" w:line="240" w:lineRule="auto"/>
-        <w:rPr>
-          <w:rFonts w:ascii="Times New Roman" w:eastAsia="Times New Roman" w:hAnsi="Times New Roman" w:cs="Times New Roman"/>
-          <w:sz w:val="24"/>
-          <w:szCs w:val="24"/>
-          <w:lang w:eastAsia="ru-RU"/>
+          <w:lang w:val="en-US" w:eastAsia="ru-RU"/>
         </w:rPr>
       </w:pPr>
       <m:oMathPara>
         <m:oMath>
+          <m:sSub>
+            <m:sSubPr>
+              <m:ctrlPr>
+                <w:rPr>
+                  <w:rFonts w:ascii="Cambria Math" w:eastAsia="Times New Roman" w:hAnsi="Cambria Math" w:cs="Times New Roman"/>
+                  <w:sz w:val="24"/>
+                  <w:szCs w:val="24"/>
+                  <w:lang w:eastAsia="ru-RU"/>
+                </w:rPr>
+              </m:ctrlPr>
+            </m:sSubPr>
+            <m:e>
+              <m:r>
+                <w:rPr>
+                  <w:rFonts w:ascii="Cambria Math" w:eastAsia="Times New Roman" w:hAnsi="Cambria Math" w:cs="Times New Roman"/>
+                  <w:sz w:val="24"/>
+                  <w:szCs w:val="24"/>
+                  <w:lang w:eastAsia="ru-RU"/>
+                </w:rPr>
+                <m:t>I</m:t>
+              </m:r>
+            </m:e>
+            <m:sub>
+              <m:r>
+                <w:rPr>
+                  <w:rFonts w:ascii="Cambria Math" w:eastAsia="Times New Roman" w:hAnsi="Cambria Math" w:cs="Times New Roman"/>
+                  <w:sz w:val="24"/>
+                  <w:szCs w:val="24"/>
+                  <w:lang w:eastAsia="ru-RU"/>
+                </w:rPr>
+                <m:t>1</m:t>
+              </m:r>
+            </m:sub>
+          </m:sSub>
           <m:r>
             <w:rPr>
               <w:rFonts w:ascii="Cambria Math" w:eastAsia="Times New Roman" w:hAnsi="Cambria Math" w:cs="Times New Roman"/>
@@ -2607,7 +2723,114 @@
               <w:szCs w:val="24"/>
               <w:lang w:eastAsia="ru-RU"/>
             </w:rPr>
-            <m:t>U1=1.2</m:t>
+            <m:t>=0.04⋅(</m:t>
+          </m:r>
+          <m:sSup>
+            <m:sSupPr>
+              <m:ctrlPr>
+                <w:rPr>
+                  <w:rFonts w:ascii="Cambria Math" w:eastAsia="Times New Roman" w:hAnsi="Cambria Math" w:cs="Times New Roman"/>
+                  <w:sz w:val="24"/>
+                  <w:szCs w:val="24"/>
+                  <w:lang w:eastAsia="ru-RU"/>
+                </w:rPr>
+              </m:ctrlPr>
+            </m:sSupPr>
+            <m:e>
+              <m:r>
+                <w:rPr>
+                  <w:rFonts w:ascii="Cambria Math" w:eastAsia="Times New Roman" w:hAnsi="Cambria Math" w:cs="Times New Roman"/>
+                  <w:sz w:val="24"/>
+                  <w:szCs w:val="24"/>
+                  <w:lang w:eastAsia="ru-RU"/>
+                </w:rPr>
+                <m:t>e</m:t>
+              </m:r>
+            </m:e>
+            <m:sup>
+              <m:r>
+                <w:rPr>
+                  <w:rFonts w:ascii="Cambria Math" w:eastAsia="Times New Roman" w:hAnsi="Cambria Math" w:cs="Times New Roman"/>
+                  <w:sz w:val="24"/>
+                  <w:szCs w:val="24"/>
+                  <w:lang w:eastAsia="ru-RU"/>
+                </w:rPr>
+                <m:t>1.2</m:t>
+              </m:r>
+              <m:r>
+                <m:rPr>
+                  <m:sty m:val="p"/>
+                </m:rPr>
+                <w:rPr>
+                  <w:rFonts w:ascii="Cambria Math" w:eastAsia="Times New Roman" w:hAnsi="Cambria Math" w:cs="Times New Roman"/>
+                  <w:sz w:val="24"/>
+                  <w:szCs w:val="24"/>
+                  <w:lang w:eastAsia="ru-RU"/>
+                </w:rPr>
+                <m:t>/</m:t>
+              </m:r>
+              <m:r>
+                <w:rPr>
+                  <w:rFonts w:ascii="Cambria Math" w:eastAsia="Times New Roman" w:hAnsi="Cambria Math" w:cs="Times New Roman"/>
+                  <w:sz w:val="24"/>
+                  <w:szCs w:val="24"/>
+                  <w:lang w:eastAsia="ru-RU"/>
+                </w:rPr>
+                <m:t>0.25</m:t>
+              </m:r>
+            </m:sup>
+          </m:sSup>
+          <m:r>
+            <w:rPr>
+              <w:rFonts w:ascii="Cambria Math" w:eastAsia="Times New Roman" w:hAnsi="Cambria Math" w:cs="Times New Roman"/>
+              <w:sz w:val="24"/>
+              <w:szCs w:val="24"/>
+              <w:lang w:eastAsia="ru-RU"/>
+            </w:rPr>
+            <m:t>-1)=0.04⋅(</m:t>
+          </m:r>
+          <m:sSup>
+            <m:sSupPr>
+              <m:ctrlPr>
+                <w:rPr>
+                  <w:rFonts w:ascii="Cambria Math" w:eastAsia="Times New Roman" w:hAnsi="Cambria Math" w:cs="Times New Roman"/>
+                  <w:sz w:val="24"/>
+                  <w:szCs w:val="24"/>
+                  <w:lang w:eastAsia="ru-RU"/>
+                </w:rPr>
+              </m:ctrlPr>
+            </m:sSupPr>
+            <m:e>
+              <m:r>
+                <w:rPr>
+                  <w:rFonts w:ascii="Cambria Math" w:eastAsia="Times New Roman" w:hAnsi="Cambria Math" w:cs="Times New Roman"/>
+                  <w:sz w:val="24"/>
+                  <w:szCs w:val="24"/>
+                  <w:lang w:eastAsia="ru-RU"/>
+                </w:rPr>
+                <m:t>e</m:t>
+              </m:r>
+            </m:e>
+            <m:sup>
+              <m:r>
+                <w:rPr>
+                  <w:rFonts w:ascii="Cambria Math" w:eastAsia="Times New Roman" w:hAnsi="Cambria Math" w:cs="Times New Roman"/>
+                  <w:sz w:val="24"/>
+                  <w:szCs w:val="24"/>
+                  <w:lang w:eastAsia="ru-RU"/>
+                </w:rPr>
+                <m:t>4.8</m:t>
+              </m:r>
+            </m:sup>
+          </m:sSup>
+          <m:r>
+            <w:rPr>
+              <w:rFonts w:ascii="Cambria Math" w:eastAsia="Times New Roman" w:hAnsi="Cambria Math" w:cs="Times New Roman"/>
+              <w:sz w:val="24"/>
+              <w:szCs w:val="24"/>
+              <w:lang w:eastAsia="ru-RU"/>
+            </w:rPr>
+            <m:t>-1)≈0.04⋅(121.51-1)=4.8</m:t>
           </m:r>
           <m:r>
             <m:rPr>
@@ -2619,39 +2842,113 @@
               <w:szCs w:val="24"/>
               <w:lang w:eastAsia="ru-RU"/>
             </w:rPr>
-            <m:t>В</m:t>
-          </m:r>
-          <m:r>
-            <w:rPr>
-              <w:rFonts w:ascii="Cambria Math" w:eastAsia="Times New Roman" w:hAnsi="Cambria Math" w:cs="Times New Roman"/>
-              <w:sz w:val="24"/>
-              <w:szCs w:val="24"/>
-              <w:lang w:eastAsia="ru-RU"/>
-            </w:rPr>
-            <m:t>,I1=4.8</m:t>
-          </m:r>
-          <m:r>
-            <m:rPr>
-              <m:nor/>
-            </m:rPr>
-            <w:rPr>
-              <w:rFonts w:ascii="Times New Roman" w:eastAsia="Times New Roman" w:hAnsi="Times New Roman" w:cs="Times New Roman"/>
-              <w:sz w:val="24"/>
-              <w:szCs w:val="24"/>
-              <w:lang w:eastAsia="ru-RU"/>
-            </w:rPr>
-            <m:t>мА</m:t>
-          </m:r>
-          <m:r>
-            <w:rPr>
-              <w:rFonts w:ascii="Times New Roman" w:eastAsia="Times New Roman" w:hAnsi="Times New Roman" w:cs="Times New Roman"/>
-              <w:sz w:val="24"/>
-              <w:szCs w:val="24"/>
-              <w:lang w:eastAsia="ru-RU"/>
-            </w:rPr>
-            <w:br/>
+            <m:t> мА</m:t>
           </m:r>
         </m:oMath>
+      </m:oMathPara>
+    </w:p>
+    <w:p>
+      <w:pPr>
+        <w:spacing w:before="100" w:beforeAutospacing="1" w:after="100" w:afterAutospacing="1" w:line="240" w:lineRule="auto"/>
+        <w:rPr>
+          <w:rFonts w:ascii="Times New Roman" w:eastAsia="Times New Roman" w:hAnsi="Times New Roman" w:cs="Times New Roman"/>
+          <w:sz w:val="24"/>
+          <w:szCs w:val="24"/>
+          <w:lang w:eastAsia="ru-RU"/>
+        </w:rPr>
+      </w:pPr>
+      <w:r>
+        <w:rPr>
+          <w:rFonts w:ascii="Times New Roman" w:eastAsia="Times New Roman" w:hAnsi="Times New Roman" w:cs="Times New Roman"/>
+          <w:b/>
+          <w:bCs/>
+          <w:sz w:val="24"/>
+          <w:szCs w:val="24"/>
+          <w:lang w:eastAsia="ru-RU"/>
+        </w:rPr>
+        <w:t xml:space="preserve">Статическое сопротивление </w:t>
+      </w:r>
+      <m:oMath>
+        <m:sSub>
+          <m:sSubPr>
+            <m:ctrlPr>
+              <w:rPr>
+                <w:rFonts w:ascii="Cambria Math" w:eastAsia="Times New Roman" w:hAnsi="Cambria Math" w:cs="Times New Roman"/>
+                <w:sz w:val="24"/>
+                <w:szCs w:val="24"/>
+                <w:lang w:eastAsia="ru-RU"/>
+              </w:rPr>
+            </m:ctrlPr>
+          </m:sSubPr>
+          <m:e>
+            <m:r>
+              <w:rPr>
+                <w:rFonts w:ascii="Cambria Math" w:eastAsia="Times New Roman" w:hAnsi="Cambria Math" w:cs="Times New Roman"/>
+                <w:sz w:val="24"/>
+                <w:szCs w:val="24"/>
+                <w:lang w:eastAsia="ru-RU"/>
+              </w:rPr>
+              <m:t>R</m:t>
+            </m:r>
+          </m:e>
+          <m:sub>
+            <m:r>
+              <m:rPr>
+                <m:nor/>
+              </m:rPr>
+              <w:rPr>
+                <w:rFonts w:ascii="Times New Roman" w:eastAsia="Times New Roman" w:hAnsi="Times New Roman" w:cs="Times New Roman"/>
+                <w:sz w:val="24"/>
+                <w:szCs w:val="24"/>
+                <w:lang w:eastAsia="ru-RU"/>
+              </w:rPr>
+              <m:t>ст</m:t>
+            </m:r>
+            <m:r>
+              <w:rPr>
+                <w:rFonts w:ascii="Cambria Math" w:eastAsia="Times New Roman" w:hAnsi="Cambria Math" w:cs="Times New Roman"/>
+                <w:sz w:val="24"/>
+                <w:szCs w:val="24"/>
+                <w:lang w:eastAsia="ru-RU"/>
+              </w:rPr>
+              <m:t>1</m:t>
+            </m:r>
+          </m:sub>
+        </m:sSub>
+      </m:oMath>
+      <w:r>
+        <w:rPr>
+          <w:rFonts w:ascii="Times New Roman" w:eastAsia="Times New Roman" w:hAnsi="Times New Roman" w:cs="Times New Roman"/>
+          <w:b/>
+          <w:bCs/>
+          <w:sz w:val="24"/>
+          <w:szCs w:val="24"/>
+          <w:lang w:eastAsia="ru-RU"/>
+        </w:rPr>
+        <w:t>:</w:t>
+      </w:r>
+      <w:r>
+        <w:rPr>
+          <w:rFonts w:ascii="Times New Roman" w:eastAsia="Times New Roman" w:hAnsi="Times New Roman" w:cs="Times New Roman"/>
+          <w:sz w:val="24"/>
+          <w:szCs w:val="24"/>
+          <w:lang w:eastAsia="ru-RU"/>
+        </w:rPr>
+        <w:br/>
+        <w:t>Статическое сопротивление определяется как отношение напряжения к току в рабочей точке (постоянный ток):</w:t>
+      </w:r>
+    </w:p>
+    <w:p>
+      <w:pPr>
+        <w:spacing w:after="0" w:line="240" w:lineRule="auto"/>
+        <w:rPr>
+          <w:rFonts w:ascii="Times New Roman" w:eastAsia="Times New Roman" w:hAnsi="Times New Roman" w:cs="Times New Roman"/>
+          <w:sz w:val="24"/>
+          <w:szCs w:val="24"/>
+          <w:lang w:val="en-US" w:eastAsia="ru-RU"/>
+        </w:rPr>
+      </w:pPr>
+      <m:oMathPara>
         <m:oMath>
           <m:sSub>
             <m:sSubPr>
@@ -2720,26 +3017,76 @@
               </m:ctrlPr>
             </m:fPr>
             <m:num>
-              <m:r>
-                <w:rPr>
-                  <w:rFonts w:ascii="Cambria Math" w:eastAsia="Times New Roman" w:hAnsi="Cambria Math" w:cs="Times New Roman"/>
-                  <w:sz w:val="24"/>
-                  <w:szCs w:val="24"/>
-                  <w:lang w:eastAsia="ru-RU"/>
-                </w:rPr>
-                <m:t>U1</m:t>
-              </m:r>
+              <m:sSub>
+                <m:sSubPr>
+                  <m:ctrlPr>
+                    <w:rPr>
+                      <w:rFonts w:ascii="Cambria Math" w:eastAsia="Times New Roman" w:hAnsi="Cambria Math" w:cs="Times New Roman"/>
+                      <w:sz w:val="24"/>
+                      <w:szCs w:val="24"/>
+                      <w:lang w:eastAsia="ru-RU"/>
+                    </w:rPr>
+                  </m:ctrlPr>
+                </m:sSubPr>
+                <m:e>
+                  <m:r>
+                    <w:rPr>
+                      <w:rFonts w:ascii="Cambria Math" w:eastAsia="Times New Roman" w:hAnsi="Cambria Math" w:cs="Times New Roman"/>
+                      <w:sz w:val="24"/>
+                      <w:szCs w:val="24"/>
+                      <w:lang w:eastAsia="ru-RU"/>
+                    </w:rPr>
+                    <m:t>U</m:t>
+                  </m:r>
+                </m:e>
+                <m:sub>
+                  <m:r>
+                    <w:rPr>
+                      <w:rFonts w:ascii="Cambria Math" w:eastAsia="Times New Roman" w:hAnsi="Cambria Math" w:cs="Times New Roman"/>
+                      <w:sz w:val="24"/>
+                      <w:szCs w:val="24"/>
+                      <w:lang w:eastAsia="ru-RU"/>
+                    </w:rPr>
+                    <m:t>1</m:t>
+                  </m:r>
+                </m:sub>
+              </m:sSub>
             </m:num>
             <m:den>
-              <m:r>
-                <w:rPr>
-                  <w:rFonts w:ascii="Cambria Math" w:eastAsia="Times New Roman" w:hAnsi="Cambria Math" w:cs="Times New Roman"/>
-                  <w:sz w:val="24"/>
-                  <w:szCs w:val="24"/>
-                  <w:lang w:eastAsia="ru-RU"/>
-                </w:rPr>
-                <m:t>I1</m:t>
-              </m:r>
+              <m:sSub>
+                <m:sSubPr>
+                  <m:ctrlPr>
+                    <w:rPr>
+                      <w:rFonts w:ascii="Cambria Math" w:eastAsia="Times New Roman" w:hAnsi="Cambria Math" w:cs="Times New Roman"/>
+                      <w:sz w:val="24"/>
+                      <w:szCs w:val="24"/>
+                      <w:lang w:eastAsia="ru-RU"/>
+                    </w:rPr>
+                  </m:ctrlPr>
+                </m:sSubPr>
+                <m:e>
+                  <m:r>
+                    <w:rPr>
+                      <w:rFonts w:ascii="Cambria Math" w:eastAsia="Times New Roman" w:hAnsi="Cambria Math" w:cs="Times New Roman"/>
+                      <w:sz w:val="24"/>
+                      <w:szCs w:val="24"/>
+                      <w:lang w:eastAsia="ru-RU"/>
+                    </w:rPr>
+                    <m:t>I</m:t>
+                  </m:r>
+                </m:e>
+                <m:sub>
+                  <m:r>
+                    <w:rPr>
+                      <w:rFonts w:ascii="Cambria Math" w:eastAsia="Times New Roman" w:hAnsi="Cambria Math" w:cs="Times New Roman"/>
+                      <w:sz w:val="24"/>
+                      <w:szCs w:val="24"/>
+                      <w:lang w:eastAsia="ru-RU"/>
+                    </w:rPr>
+                    <m:t>1</m:t>
+                  </m:r>
+                </m:sub>
+              </m:sSub>
             </m:den>
           </m:f>
           <m:r>
@@ -2771,6 +3118,18 @@
                   <w:lang w:eastAsia="ru-RU"/>
                 </w:rPr>
                 <m:t>1.2</m:t>
+              </m:r>
+              <m:r>
+                <m:rPr>
+                  <m:nor/>
+                </m:rPr>
+                <w:rPr>
+                  <w:rFonts w:ascii="Times New Roman" w:eastAsia="Times New Roman" w:hAnsi="Times New Roman" w:cs="Times New Roman"/>
+                  <w:sz w:val="24"/>
+                  <w:szCs w:val="24"/>
+                  <w:lang w:eastAsia="ru-RU"/>
+                </w:rPr>
+                <m:t> В</m:t>
               </m:r>
             </m:num>
             <m:den>
@@ -2817,6 +3176,18 @@
                   </m:r>
                 </m:sup>
               </m:sSup>
+              <m:r>
+                <m:rPr>
+                  <m:nor/>
+                </m:rPr>
+                <w:rPr>
+                  <w:rFonts w:ascii="Times New Roman" w:eastAsia="Times New Roman" w:hAnsi="Times New Roman" w:cs="Times New Roman"/>
+                  <w:sz w:val="24"/>
+                  <w:szCs w:val="24"/>
+                  <w:lang w:eastAsia="ru-RU"/>
+                </w:rPr>
+                <m:t> А</m:t>
+              </m:r>
             </m:den>
           </m:f>
           <m:r>
@@ -2861,17 +3232,592 @@
             </w:rPr>
             <m:t> кОм</m:t>
           </m:r>
+        </m:oMath>
+      </m:oMathPara>
+    </w:p>
+    <w:p>
+      <w:pPr>
+        <w:spacing w:before="100" w:beforeAutospacing="1" w:after="100" w:afterAutospacing="1" w:line="240" w:lineRule="auto"/>
+        <w:rPr>
+          <w:rFonts w:ascii="Times New Roman" w:eastAsia="Times New Roman" w:hAnsi="Times New Roman" w:cs="Times New Roman"/>
+          <w:sz w:val="24"/>
+          <w:szCs w:val="24"/>
+          <w:lang w:eastAsia="ru-RU"/>
+        </w:rPr>
+      </w:pPr>
+      <w:r>
+        <w:rPr>
+          <w:rFonts w:ascii="Times New Roman" w:eastAsia="Times New Roman" w:hAnsi="Times New Roman" w:cs="Times New Roman"/>
+          <w:b/>
+          <w:bCs/>
+          <w:sz w:val="24"/>
+          <w:szCs w:val="24"/>
+          <w:lang w:eastAsia="ru-RU"/>
+        </w:rPr>
+        <w:t xml:space="preserve">Динамическое сопротивление </w:t>
+      </w:r>
+      <m:oMath>
+        <m:sSub>
+          <m:sSubPr>
+            <m:ctrlPr>
+              <w:rPr>
+                <w:rFonts w:ascii="Cambria Math" w:eastAsia="Times New Roman" w:hAnsi="Cambria Math" w:cs="Times New Roman"/>
+                <w:sz w:val="24"/>
+                <w:szCs w:val="24"/>
+                <w:lang w:eastAsia="ru-RU"/>
+              </w:rPr>
+            </m:ctrlPr>
+          </m:sSubPr>
+          <m:e>
+            <m:r>
+              <w:rPr>
+                <w:rFonts w:ascii="Cambria Math" w:eastAsia="Times New Roman" w:hAnsi="Cambria Math" w:cs="Times New Roman"/>
+                <w:sz w:val="24"/>
+                <w:szCs w:val="24"/>
+                <w:lang w:eastAsia="ru-RU"/>
+              </w:rPr>
+              <m:t>R</m:t>
+            </m:r>
+          </m:e>
+          <m:sub>
+            <m:r>
+              <m:rPr>
+                <m:nor/>
+              </m:rPr>
+              <w:rPr>
+                <w:rFonts w:ascii="Times New Roman" w:eastAsia="Times New Roman" w:hAnsi="Times New Roman" w:cs="Times New Roman"/>
+                <w:sz w:val="24"/>
+                <w:szCs w:val="24"/>
+                <w:lang w:eastAsia="ru-RU"/>
+              </w:rPr>
+              <m:t>д</m:t>
+            </m:r>
+            <m:r>
+              <w:rPr>
+                <w:rFonts w:ascii="Cambria Math" w:eastAsia="Times New Roman" w:hAnsi="Cambria Math" w:cs="Times New Roman"/>
+                <w:sz w:val="24"/>
+                <w:szCs w:val="24"/>
+                <w:lang w:eastAsia="ru-RU"/>
+              </w:rPr>
+              <m:t>1</m:t>
+            </m:r>
+          </m:sub>
+        </m:sSub>
+      </m:oMath>
+      <w:r>
+        <w:rPr>
+          <w:rFonts w:ascii="Times New Roman" w:eastAsia="Times New Roman" w:hAnsi="Times New Roman" w:cs="Times New Roman"/>
+          <w:b/>
+          <w:bCs/>
+          <w:sz w:val="24"/>
+          <w:szCs w:val="24"/>
+          <w:lang w:eastAsia="ru-RU"/>
+        </w:rPr>
+        <w:t>:</w:t>
+      </w:r>
+      <w:r>
+        <w:rPr>
+          <w:rFonts w:ascii="Times New Roman" w:eastAsia="Times New Roman" w:hAnsi="Times New Roman" w:cs="Times New Roman"/>
+          <w:sz w:val="24"/>
+          <w:szCs w:val="24"/>
+          <w:lang w:eastAsia="ru-RU"/>
+        </w:rPr>
+        <w:br/>
+        <w:t>Динамическое сопротивление определяется как производная напряжения по току в рабочей точке</w:t>
+      </w:r>
+      <w:r>
+        <w:rPr>
+          <w:rFonts w:ascii="Times New Roman" w:eastAsia="Times New Roman" w:hAnsi="Times New Roman" w:cs="Times New Roman"/>
+          <w:sz w:val="24"/>
+          <w:szCs w:val="24"/>
+          <w:lang w:eastAsia="ru-RU"/>
+        </w:rPr>
+        <w:t xml:space="preserve">. </w:t>
+      </w:r>
+      <w:r>
+        <w:rPr>
+          <w:rFonts w:ascii="Times New Roman" w:eastAsia="Times New Roman" w:hAnsi="Times New Roman" w:cs="Times New Roman"/>
+          <w:sz w:val="24"/>
+          <w:szCs w:val="24"/>
+          <w:lang w:eastAsia="ru-RU"/>
+        </w:rPr>
+        <w:t xml:space="preserve">Для диода </w:t>
+      </w:r>
+      <m:oMath>
+        <m:sSub>
+          <m:sSubPr>
+            <m:ctrlPr>
+              <w:rPr>
+                <w:rFonts w:ascii="Cambria Math" w:eastAsia="Times New Roman" w:hAnsi="Cambria Math" w:cs="Times New Roman"/>
+                <w:sz w:val="24"/>
+                <w:szCs w:val="24"/>
+                <w:lang w:eastAsia="ru-RU"/>
+              </w:rPr>
+            </m:ctrlPr>
+          </m:sSubPr>
+          <m:e>
+            <m:r>
+              <w:rPr>
+                <w:rFonts w:ascii="Cambria Math" w:eastAsia="Times New Roman" w:hAnsi="Cambria Math" w:cs="Times New Roman"/>
+                <w:sz w:val="24"/>
+                <w:szCs w:val="24"/>
+                <w:lang w:eastAsia="ru-RU"/>
+              </w:rPr>
+              <m:t>R</m:t>
+            </m:r>
+          </m:e>
+          <m:sub>
+            <m:r>
+              <m:rPr>
+                <m:nor/>
+              </m:rPr>
+              <w:rPr>
+                <w:rFonts w:ascii="Times New Roman" w:eastAsia="Times New Roman" w:hAnsi="Times New Roman" w:cs="Times New Roman"/>
+                <w:sz w:val="24"/>
+                <w:szCs w:val="24"/>
+                <w:lang w:eastAsia="ru-RU"/>
+              </w:rPr>
+              <m:t>д</m:t>
+            </m:r>
+          </m:sub>
+        </m:sSub>
+        <m:r>
+          <w:rPr>
+            <w:rFonts w:ascii="Cambria Math" w:eastAsia="Times New Roman" w:hAnsi="Cambria Math" w:cs="Times New Roman"/>
+            <w:sz w:val="24"/>
+            <w:szCs w:val="24"/>
+            <w:lang w:eastAsia="ru-RU"/>
+          </w:rPr>
+          <m:t>=</m:t>
+        </m:r>
+        <m:f>
+          <m:fPr>
+            <m:ctrlPr>
+              <w:rPr>
+                <w:rFonts w:ascii="Cambria Math" w:eastAsia="Times New Roman" w:hAnsi="Cambria Math" w:cs="Times New Roman"/>
+                <w:sz w:val="24"/>
+                <w:szCs w:val="24"/>
+                <w:lang w:eastAsia="ru-RU"/>
+              </w:rPr>
+            </m:ctrlPr>
+          </m:fPr>
+          <m:num>
+            <m:r>
+              <w:rPr>
+                <w:rFonts w:ascii="Cambria Math" w:eastAsia="Times New Roman" w:hAnsi="Cambria Math" w:cs="Times New Roman"/>
+                <w:sz w:val="24"/>
+                <w:szCs w:val="24"/>
+                <w:lang w:eastAsia="ru-RU"/>
+              </w:rPr>
+              <m:t>dU</m:t>
+            </m:r>
+          </m:num>
+          <m:den>
+            <m:r>
+              <w:rPr>
+                <w:rFonts w:ascii="Cambria Math" w:eastAsia="Times New Roman" w:hAnsi="Cambria Math" w:cs="Times New Roman"/>
+                <w:sz w:val="24"/>
+                <w:szCs w:val="24"/>
+                <w:lang w:eastAsia="ru-RU"/>
+              </w:rPr>
+              <m:t>dI</m:t>
+            </m:r>
+          </m:den>
+        </m:f>
+      </m:oMath>
+      <w:r>
+        <w:rPr>
+          <w:rFonts w:ascii="Times New Roman" w:eastAsia="Times New Roman" w:hAnsi="Times New Roman" w:cs="Times New Roman"/>
+          <w:sz w:val="24"/>
+          <w:szCs w:val="24"/>
+          <w:lang w:eastAsia="ru-RU"/>
+        </w:rPr>
+        <w:t>.</w:t>
+      </w:r>
+      <w:r>
+        <w:rPr>
+          <w:rFonts w:ascii="Times New Roman" w:eastAsia="Times New Roman" w:hAnsi="Times New Roman" w:cs="Times New Roman"/>
+          <w:sz w:val="24"/>
+          <w:szCs w:val="24"/>
+          <w:lang w:eastAsia="ru-RU"/>
+        </w:rPr>
+        <w:br/>
+        <w:t>Возьмем производную от функции ВАХ:</w:t>
+      </w:r>
+    </w:p>
+    <w:p>
+      <w:pPr>
+        <w:spacing w:after="0" w:line="240" w:lineRule="auto"/>
+        <w:rPr>
+          <w:rFonts w:ascii="Times New Roman" w:eastAsia="Times New Roman" w:hAnsi="Times New Roman" w:cs="Times New Roman"/>
+          <w:sz w:val="24"/>
+          <w:szCs w:val="24"/>
+          <w:lang w:val="en-US" w:eastAsia="ru-RU"/>
+        </w:rPr>
+      </w:pPr>
+      <m:oMathPara>
+        <m:oMath>
+          <m:f>
+            <m:fPr>
+              <m:ctrlPr>
+                <w:rPr>
+                  <w:rFonts w:ascii="Cambria Math" w:eastAsia="Times New Roman" w:hAnsi="Cambria Math" w:cs="Times New Roman"/>
+                  <w:sz w:val="24"/>
+                  <w:szCs w:val="24"/>
+                  <w:lang w:eastAsia="ru-RU"/>
+                </w:rPr>
+              </m:ctrlPr>
+            </m:fPr>
+            <m:num>
+              <m:r>
+                <w:rPr>
+                  <w:rFonts w:ascii="Cambria Math" w:eastAsia="Times New Roman" w:hAnsi="Cambria Math" w:cs="Times New Roman"/>
+                  <w:sz w:val="24"/>
+                  <w:szCs w:val="24"/>
+                  <w:lang w:eastAsia="ru-RU"/>
+                </w:rPr>
+                <m:t>dI</m:t>
+              </m:r>
+            </m:num>
+            <m:den>
+              <m:r>
+                <w:rPr>
+                  <w:rFonts w:ascii="Cambria Math" w:eastAsia="Times New Roman" w:hAnsi="Cambria Math" w:cs="Times New Roman"/>
+                  <w:sz w:val="24"/>
+                  <w:szCs w:val="24"/>
+                  <w:lang w:eastAsia="ru-RU"/>
+                </w:rPr>
+                <m:t>dU</m:t>
+              </m:r>
+            </m:den>
+          </m:f>
           <m:r>
+            <w:rPr>
+              <w:rFonts w:ascii="Cambria Math" w:eastAsia="Times New Roman" w:hAnsi="Cambria Math" w:cs="Times New Roman"/>
+              <w:sz w:val="24"/>
+              <w:szCs w:val="24"/>
+              <w:lang w:eastAsia="ru-RU"/>
+            </w:rPr>
+            <m:t>=</m:t>
+          </m:r>
+          <m:f>
+            <m:fPr>
+              <m:ctrlPr>
+                <w:rPr>
+                  <w:rFonts w:ascii="Cambria Math" w:eastAsia="Times New Roman" w:hAnsi="Cambria Math" w:cs="Times New Roman"/>
+                  <w:sz w:val="24"/>
+                  <w:szCs w:val="24"/>
+                  <w:lang w:eastAsia="ru-RU"/>
+                </w:rPr>
+              </m:ctrlPr>
+            </m:fPr>
+            <m:num>
+              <m:r>
+                <w:rPr>
+                  <w:rFonts w:ascii="Cambria Math" w:eastAsia="Times New Roman" w:hAnsi="Cambria Math" w:cs="Times New Roman"/>
+                  <w:sz w:val="24"/>
+                  <w:szCs w:val="24"/>
+                  <w:lang w:eastAsia="ru-RU"/>
+                </w:rPr>
+                <m:t>A</m:t>
+              </m:r>
+            </m:num>
+            <m:den>
+              <m:r>
+                <w:rPr>
+                  <w:rFonts w:ascii="Cambria Math" w:eastAsia="Times New Roman" w:hAnsi="Cambria Math" w:cs="Times New Roman"/>
+                  <w:sz w:val="24"/>
+                  <w:szCs w:val="24"/>
+                  <w:lang w:eastAsia="ru-RU"/>
+                </w:rPr>
+                <m:t>φ</m:t>
+              </m:r>
+            </m:den>
+          </m:f>
+          <m:sSup>
+            <m:sSupPr>
+              <m:ctrlPr>
+                <w:rPr>
+                  <w:rFonts w:ascii="Cambria Math" w:eastAsia="Times New Roman" w:hAnsi="Cambria Math" w:cs="Times New Roman"/>
+                  <w:sz w:val="24"/>
+                  <w:szCs w:val="24"/>
+                  <w:lang w:eastAsia="ru-RU"/>
+                </w:rPr>
+              </m:ctrlPr>
+            </m:sSupPr>
+            <m:e>
+              <m:r>
+                <w:rPr>
+                  <w:rFonts w:ascii="Cambria Math" w:eastAsia="Times New Roman" w:hAnsi="Cambria Math" w:cs="Times New Roman"/>
+                  <w:sz w:val="24"/>
+                  <w:szCs w:val="24"/>
+                  <w:lang w:eastAsia="ru-RU"/>
+                </w:rPr>
+                <m:t>e</m:t>
+              </m:r>
+            </m:e>
+            <m:sup>
+              <m:r>
+                <w:rPr>
+                  <w:rFonts w:ascii="Cambria Math" w:eastAsia="Times New Roman" w:hAnsi="Cambria Math" w:cs="Times New Roman"/>
+                  <w:sz w:val="24"/>
+                  <w:szCs w:val="24"/>
+                  <w:lang w:eastAsia="ru-RU"/>
+                </w:rPr>
+                <m:t>U</m:t>
+              </m:r>
+              <m:r>
+                <m:rPr>
+                  <m:sty m:val="p"/>
+                </m:rPr>
+                <w:rPr>
+                  <w:rFonts w:ascii="Cambria Math" w:eastAsia="Times New Roman" w:hAnsi="Cambria Math" w:cs="Times New Roman"/>
+                  <w:sz w:val="24"/>
+                  <w:szCs w:val="24"/>
+                  <w:lang w:eastAsia="ru-RU"/>
+                </w:rPr>
+                <m:t>/</m:t>
+              </m:r>
+              <m:r>
+                <w:rPr>
+                  <w:rFonts w:ascii="Cambria Math" w:eastAsia="Times New Roman" w:hAnsi="Cambria Math" w:cs="Times New Roman"/>
+                  <w:sz w:val="24"/>
+                  <w:szCs w:val="24"/>
+                  <w:lang w:eastAsia="ru-RU"/>
+                </w:rPr>
+                <m:t>φ</m:t>
+              </m:r>
+            </m:sup>
+          </m:sSup>
+        </m:oMath>
+      </m:oMathPara>
+    </w:p>
+    <w:p>
+      <w:pPr>
+        <w:spacing w:before="100" w:beforeAutospacing="1" w:after="100" w:afterAutospacing="1" w:line="240" w:lineRule="auto"/>
+        <w:rPr>
+          <w:rFonts w:ascii="Times New Roman" w:eastAsia="Times New Roman" w:hAnsi="Times New Roman" w:cs="Times New Roman"/>
+          <w:sz w:val="24"/>
+          <w:szCs w:val="24"/>
+          <w:lang w:eastAsia="ru-RU"/>
+        </w:rPr>
+      </w:pPr>
+      <w:r>
+        <w:rPr>
+          <w:rFonts w:ascii="Times New Roman" w:eastAsia="Times New Roman" w:hAnsi="Times New Roman" w:cs="Times New Roman"/>
+          <w:sz w:val="24"/>
+          <w:szCs w:val="24"/>
+          <w:lang w:eastAsia="ru-RU"/>
+        </w:rPr>
+        <w:t xml:space="preserve">Поскольку </w:t>
+      </w:r>
+      <m:oMath>
+        <m:r>
+          <w:rPr>
+            <w:rFonts w:ascii="Cambria Math" w:eastAsia="Times New Roman" w:hAnsi="Cambria Math" w:cs="Times New Roman"/>
+            <w:sz w:val="24"/>
+            <w:szCs w:val="24"/>
+            <w:lang w:eastAsia="ru-RU"/>
+          </w:rPr>
+          <m:t>A</m:t>
+        </m:r>
+        <m:sSup>
+          <m:sSupPr>
+            <m:ctrlPr>
+              <w:rPr>
+                <w:rFonts w:ascii="Cambria Math" w:eastAsia="Times New Roman" w:hAnsi="Cambria Math" w:cs="Times New Roman"/>
+                <w:sz w:val="24"/>
+                <w:szCs w:val="24"/>
+                <w:lang w:eastAsia="ru-RU"/>
+              </w:rPr>
+            </m:ctrlPr>
+          </m:sSupPr>
+          <m:e>
+            <m:r>
+              <w:rPr>
+                <w:rFonts w:ascii="Cambria Math" w:eastAsia="Times New Roman" w:hAnsi="Cambria Math" w:cs="Times New Roman"/>
+                <w:sz w:val="24"/>
+                <w:szCs w:val="24"/>
+                <w:lang w:eastAsia="ru-RU"/>
+              </w:rPr>
+              <m:t>e</m:t>
+            </m:r>
+          </m:e>
+          <m:sup>
+            <m:r>
+              <w:rPr>
+                <w:rFonts w:ascii="Cambria Math" w:eastAsia="Times New Roman" w:hAnsi="Cambria Math" w:cs="Times New Roman"/>
+                <w:sz w:val="24"/>
+                <w:szCs w:val="24"/>
+                <w:lang w:eastAsia="ru-RU"/>
+              </w:rPr>
+              <m:t>U</m:t>
+            </m:r>
+            <m:r>
+              <m:rPr>
+                <m:sty m:val="p"/>
+              </m:rPr>
+              <w:rPr>
+                <w:rFonts w:ascii="Cambria Math" w:eastAsia="Times New Roman" w:hAnsi="Cambria Math" w:cs="Times New Roman"/>
+                <w:sz w:val="24"/>
+                <w:szCs w:val="24"/>
+                <w:lang w:eastAsia="ru-RU"/>
+              </w:rPr>
+              <m:t>/</m:t>
+            </m:r>
+            <m:r>
+              <w:rPr>
+                <w:rFonts w:ascii="Cambria Math" w:eastAsia="Times New Roman" w:hAnsi="Cambria Math" w:cs="Times New Roman"/>
+                <w:sz w:val="24"/>
+                <w:szCs w:val="24"/>
+                <w:lang w:eastAsia="ru-RU"/>
+              </w:rPr>
+              <m:t>φ</m:t>
+            </m:r>
+          </m:sup>
+        </m:sSup>
+        <m:r>
+          <w:rPr>
+            <w:rFonts w:ascii="Cambria Math" w:eastAsia="Times New Roman" w:hAnsi="Cambria Math" w:cs="Times New Roman"/>
+            <w:sz w:val="24"/>
+            <w:szCs w:val="24"/>
+            <w:lang w:eastAsia="ru-RU"/>
+          </w:rPr>
+          <m:t>≈I</m:t>
+        </m:r>
+      </m:oMath>
+      <w:r>
+        <w:rPr>
+          <w:rFonts w:ascii="Times New Roman" w:eastAsia="Times New Roman" w:hAnsi="Times New Roman" w:cs="Times New Roman"/>
+          <w:sz w:val="24"/>
+          <w:szCs w:val="24"/>
+          <w:lang w:eastAsia="ru-RU"/>
+        </w:rPr>
+        <w:t>, получаем:</w:t>
+      </w:r>
+    </w:p>
+    <w:p>
+      <w:pPr>
+        <w:spacing w:after="0" w:line="240" w:lineRule="auto"/>
+        <w:rPr>
+          <w:rFonts w:ascii="Times New Roman" w:eastAsia="Times New Roman" w:hAnsi="Times New Roman" w:cs="Times New Roman"/>
+          <w:sz w:val="24"/>
+          <w:szCs w:val="24"/>
+          <w:lang w:val="en-US" w:eastAsia="ru-RU"/>
+        </w:rPr>
+      </w:pPr>
+      <m:oMathPara>
+        <m:oMath>
+          <m:f>
+            <m:fPr>
+              <m:ctrlPr>
+                <w:rPr>
+                  <w:rFonts w:ascii="Cambria Math" w:eastAsia="Times New Roman" w:hAnsi="Cambria Math" w:cs="Times New Roman"/>
+                  <w:sz w:val="24"/>
+                  <w:szCs w:val="24"/>
+                  <w:lang w:eastAsia="ru-RU"/>
+                </w:rPr>
+              </m:ctrlPr>
+            </m:fPr>
+            <m:num>
+              <m:r>
+                <w:rPr>
+                  <w:rFonts w:ascii="Cambria Math" w:eastAsia="Times New Roman" w:hAnsi="Cambria Math" w:cs="Times New Roman"/>
+                  <w:sz w:val="24"/>
+                  <w:szCs w:val="24"/>
+                  <w:lang w:eastAsia="ru-RU"/>
+                </w:rPr>
+                <m:t>dI</m:t>
+              </m:r>
+            </m:num>
+            <m:den>
+              <m:r>
+                <w:rPr>
+                  <w:rFonts w:ascii="Cambria Math" w:eastAsia="Times New Roman" w:hAnsi="Cambria Math" w:cs="Times New Roman"/>
+                  <w:sz w:val="24"/>
+                  <w:szCs w:val="24"/>
+                  <w:lang w:eastAsia="ru-RU"/>
+                </w:rPr>
+                <m:t>dU</m:t>
+              </m:r>
+            </m:den>
+          </m:f>
+          <m:r>
+            <w:rPr>
+              <w:rFonts w:ascii="Cambria Math" w:eastAsia="Times New Roman" w:hAnsi="Cambria Math" w:cs="Times New Roman"/>
+              <w:sz w:val="24"/>
+              <w:szCs w:val="24"/>
+              <w:lang w:eastAsia="ru-RU"/>
+            </w:rPr>
+            <m:t>≈</m:t>
+          </m:r>
+          <m:f>
+            <m:fPr>
+              <m:ctrlPr>
+                <w:rPr>
+                  <w:rFonts w:ascii="Cambria Math" w:eastAsia="Times New Roman" w:hAnsi="Cambria Math" w:cs="Times New Roman"/>
+                  <w:sz w:val="24"/>
+                  <w:szCs w:val="24"/>
+                  <w:lang w:eastAsia="ru-RU"/>
+                </w:rPr>
+              </m:ctrlPr>
+            </m:fPr>
+            <m:num>
+              <m:r>
+                <w:rPr>
+                  <w:rFonts w:ascii="Cambria Math" w:eastAsia="Times New Roman" w:hAnsi="Cambria Math" w:cs="Times New Roman"/>
+                  <w:sz w:val="24"/>
+                  <w:szCs w:val="24"/>
+                  <w:lang w:eastAsia="ru-RU"/>
+                </w:rPr>
+                <m:t>I</m:t>
+              </m:r>
+            </m:num>
+            <m:den>
+              <m:r>
+                <w:rPr>
+                  <w:rFonts w:ascii="Cambria Math" w:eastAsia="Times New Roman" w:hAnsi="Cambria Math" w:cs="Times New Roman"/>
+                  <w:sz w:val="24"/>
+                  <w:szCs w:val="24"/>
+                  <w:lang w:eastAsia="ru-RU"/>
+                </w:rPr>
+                <m:t>φ</m:t>
+              </m:r>
+            </m:den>
+          </m:f>
+          <m:r>
+            <m:rPr>
+              <m:nor/>
+            </m:rPr>
             <w:rPr>
               <w:rFonts w:ascii="Times New Roman" w:eastAsia="Times New Roman" w:hAnsi="Times New Roman" w:cs="Times New Roman"/>
               <w:sz w:val="24"/>
               <w:szCs w:val="24"/>
               <w:lang w:eastAsia="ru-RU"/>
             </w:rPr>
-            <w:br/>
+            <m:t>  </m:t>
           </m:r>
-        </m:oMath>
-        <m:oMath>
+          <m:r>
+            <w:rPr>
+              <w:rFonts w:ascii="Cambria Math" w:eastAsia="Times New Roman" w:hAnsi="Cambria Math" w:cs="Times New Roman"/>
+              <w:sz w:val="24"/>
+              <w:szCs w:val="24"/>
+              <w:lang w:eastAsia="ru-RU"/>
+            </w:rPr>
+            <m:t>⟹</m:t>
+          </m:r>
+          <m:r>
+            <m:rPr>
+              <m:nor/>
+            </m:rPr>
+            <w:rPr>
+              <w:rFonts w:ascii="Times New Roman" w:eastAsia="Times New Roman" w:hAnsi="Times New Roman" w:cs="Times New Roman"/>
+              <w:sz w:val="24"/>
+              <w:szCs w:val="24"/>
+              <w:lang w:eastAsia="ru-RU"/>
+            </w:rPr>
+            <m:t>  </m:t>
+          </m:r>
           <m:sSub>
             <m:sSubPr>
               <m:ctrlPr>
@@ -2906,15 +3852,6 @@
                   <w:lang w:eastAsia="ru-RU"/>
                 </w:rPr>
                 <m:t>д</m:t>
-              </m:r>
-              <m:r>
-                <w:rPr>
-                  <w:rFonts w:ascii="Cambria Math" w:eastAsia="Times New Roman" w:hAnsi="Cambria Math" w:cs="Times New Roman"/>
-                  <w:sz w:val="24"/>
-                  <w:szCs w:val="24"/>
-                  <w:lang w:eastAsia="ru-RU"/>
-                </w:rPr>
-                <m:t>1</m:t>
               </m:r>
             </m:sub>
           </m:sSub>
@@ -2957,10 +3894,91 @@
                   <w:szCs w:val="24"/>
                   <w:lang w:eastAsia="ru-RU"/>
                 </w:rPr>
-                <m:t>I1</m:t>
+                <m:t>I</m:t>
               </m:r>
             </m:den>
           </m:f>
+        </m:oMath>
+      </m:oMathPara>
+    </w:p>
+    <w:p>
+      <w:pPr>
+        <w:spacing w:before="100" w:beforeAutospacing="1" w:after="100" w:afterAutospacing="1" w:line="240" w:lineRule="auto"/>
+        <w:rPr>
+          <w:rFonts w:ascii="Times New Roman" w:eastAsia="Times New Roman" w:hAnsi="Times New Roman" w:cs="Times New Roman"/>
+          <w:sz w:val="24"/>
+          <w:szCs w:val="24"/>
+          <w:lang w:eastAsia="ru-RU"/>
+        </w:rPr>
+      </w:pPr>
+      <w:r>
+        <w:rPr>
+          <w:rFonts w:ascii="Times New Roman" w:eastAsia="Times New Roman" w:hAnsi="Times New Roman" w:cs="Times New Roman"/>
+          <w:sz w:val="24"/>
+          <w:szCs w:val="24"/>
+          <w:lang w:eastAsia="ru-RU"/>
+        </w:rPr>
+        <w:t>Подставляем значения:</w:t>
+      </w:r>
+    </w:p>
+    <w:p>
+      <w:pPr>
+        <w:spacing w:after="0" w:line="240" w:lineRule="auto"/>
+        <w:rPr>
+          <w:rFonts w:ascii="Times New Roman" w:eastAsia="Times New Roman" w:hAnsi="Times New Roman" w:cs="Times New Roman"/>
+          <w:sz w:val="24"/>
+          <w:szCs w:val="24"/>
+          <w:lang w:val="en-US" w:eastAsia="ru-RU"/>
+        </w:rPr>
+      </w:pPr>
+      <m:oMathPara>
+        <m:oMath>
+          <m:sSub>
+            <m:sSubPr>
+              <m:ctrlPr>
+                <w:rPr>
+                  <w:rFonts w:ascii="Cambria Math" w:eastAsia="Times New Roman" w:hAnsi="Cambria Math" w:cs="Times New Roman"/>
+                  <w:sz w:val="24"/>
+                  <w:szCs w:val="24"/>
+                  <w:lang w:eastAsia="ru-RU"/>
+                </w:rPr>
+              </m:ctrlPr>
+            </m:sSubPr>
+            <m:e>
+              <m:r>
+                <w:rPr>
+                  <w:rFonts w:ascii="Cambria Math" w:eastAsia="Times New Roman" w:hAnsi="Cambria Math" w:cs="Times New Roman"/>
+                  <w:sz w:val="24"/>
+                  <w:szCs w:val="24"/>
+                  <w:lang w:eastAsia="ru-RU"/>
+                </w:rPr>
+                <m:t>R</m:t>
+              </m:r>
+            </m:e>
+            <m:sub>
+              <m:r>
+                <m:rPr>
+                  <m:nor/>
+                </m:rPr>
+                <w:rPr>
+                  <w:rFonts w:ascii="Times New Roman" w:eastAsia="Times New Roman" w:hAnsi="Times New Roman" w:cs="Times New Roman"/>
+                  <w:sz w:val="24"/>
+                  <w:szCs w:val="24"/>
+                  <w:lang w:eastAsia="ru-RU"/>
+                </w:rPr>
+                <m:t>д</m:t>
+              </m:r>
+              <m:r>
+                <w:rPr>
+                  <w:rFonts w:ascii="Cambria Math" w:eastAsia="Times New Roman" w:hAnsi="Cambria Math" w:cs="Times New Roman"/>
+                  <w:sz w:val="24"/>
+                  <w:szCs w:val="24"/>
+                  <w:lang w:eastAsia="ru-RU"/>
+                </w:rPr>
+                <m:t>1</m:t>
+              </m:r>
+            </m:sub>
+          </m:sSub>
           <m:r>
             <w:rPr>
               <w:rFonts w:ascii="Cambria Math" w:eastAsia="Times New Roman" w:hAnsi="Cambria Math" w:cs="Times New Roman"/>
@@ -2990,6 +4008,18 @@
                   <w:lang w:eastAsia="ru-RU"/>
                 </w:rPr>
                 <m:t>0.25</m:t>
+              </m:r>
+              <m:r>
+                <m:rPr>
+                  <m:nor/>
+                </m:rPr>
+                <w:rPr>
+                  <w:rFonts w:ascii="Times New Roman" w:eastAsia="Times New Roman" w:hAnsi="Times New Roman" w:cs="Times New Roman"/>
+                  <w:sz w:val="24"/>
+                  <w:szCs w:val="24"/>
+                  <w:lang w:eastAsia="ru-RU"/>
+                </w:rPr>
+                <m:t> В</m:t>
               </m:r>
             </m:num>
             <m:den>
@@ -3036,6 +4066,18 @@
                   </m:r>
                 </m:sup>
               </m:sSup>
+              <m:r>
+                <m:rPr>
+                  <m:nor/>
+                </m:rPr>
+                <w:rPr>
+                  <w:rFonts w:ascii="Times New Roman" w:eastAsia="Times New Roman" w:hAnsi="Times New Roman" w:cs="Times New Roman"/>
+                  <w:sz w:val="24"/>
+                  <w:szCs w:val="24"/>
+                  <w:lang w:eastAsia="ru-RU"/>
+                </w:rPr>
+                <m:t> А</m:t>
+              </m:r>
             </m:den>
           </m:f>
           <m:r>
@@ -3045,7 +4087,7 @@
               <w:szCs w:val="24"/>
               <w:lang w:eastAsia="ru-RU"/>
             </w:rPr>
-            <m:t>=52</m:t>
+            <m:t>≈52</m:t>
           </m:r>
           <m:r>
             <m:rPr>
@@ -3080,21 +4122,12 @@
             </w:rPr>
             <m:t> кОм</m:t>
           </m:r>
-          <m:r>
-            <w:rPr>
-              <w:rFonts w:ascii="Times New Roman" w:eastAsia="Times New Roman" w:hAnsi="Times New Roman" w:cs="Times New Roman"/>
-              <w:sz w:val="24"/>
-              <w:szCs w:val="24"/>
-              <w:lang w:eastAsia="ru-RU"/>
-            </w:rPr>
-            <w:br/>
-          </m:r>
         </m:oMath>
       </m:oMathPara>
     </w:p>
     <w:p>
       <w:pPr>
-        <w:spacing w:after="0" w:line="240" w:lineRule="auto"/>
+        <w:spacing w:before="100" w:beforeAutospacing="1" w:after="100" w:afterAutospacing="1" w:line="240" w:lineRule="auto"/>
         <w:rPr>
           <w:rFonts w:ascii="Times New Roman" w:eastAsia="Times New Roman" w:hAnsi="Times New Roman" w:cs="Times New Roman"/>
           <w:sz w:val="24"/>
@@ -3102,30 +4135,135 @@
           <w:lang w:eastAsia="ru-RU"/>
         </w:rPr>
       </w:pPr>
-    </w:p>
-    <w:p>
-      <w:pPr>
-        <w:spacing w:before="100" w:beforeAutospacing="1" w:after="100" w:afterAutospacing="1" w:line="240" w:lineRule="auto"/>
-        <w:outlineLvl w:val="2"/>
+      <w:r>
         <w:rPr>
           <w:rFonts w:ascii="Times New Roman" w:eastAsia="Times New Roman" w:hAnsi="Times New Roman" w:cs="Times New Roman"/>
           <w:b/>
           <w:bCs/>
-          <w:sz w:val="27"/>
-          <w:szCs w:val="27"/>
+          <w:sz w:val="24"/>
+          <w:szCs w:val="24"/>
           <w:lang w:eastAsia="ru-RU"/>
         </w:rPr>
-      </w:pPr>
+        <w:t>Расчет параметров в рабочей точке PT2</w:t>
+      </w:r>
       <w:r>
         <w:rPr>
           <w:rFonts w:ascii="Times New Roman" w:eastAsia="Times New Roman" w:hAnsi="Times New Roman" w:cs="Times New Roman"/>
-          <w:b/>
-          <w:bCs/>
-          <w:sz w:val="27"/>
-          <w:szCs w:val="27"/>
+          <w:sz w:val="24"/>
+          <w:szCs w:val="24"/>
           <w:lang w:eastAsia="ru-RU"/>
         </w:rPr>
-        <w:t>РТ2:</w:t>
+        <w:br/>
+        <w:t xml:space="preserve">Точка задана током </w:t>
+      </w:r>
+      <m:oMath>
+        <m:sSub>
+          <m:sSubPr>
+            <m:ctrlPr>
+              <w:rPr>
+                <w:rFonts w:ascii="Cambria Math" w:eastAsia="Times New Roman" w:hAnsi="Cambria Math" w:cs="Times New Roman"/>
+                <w:sz w:val="24"/>
+                <w:szCs w:val="24"/>
+                <w:lang w:eastAsia="ru-RU"/>
+              </w:rPr>
+            </m:ctrlPr>
+          </m:sSubPr>
+          <m:e>
+            <m:r>
+              <w:rPr>
+                <w:rFonts w:ascii="Cambria Math" w:eastAsia="Times New Roman" w:hAnsi="Cambria Math" w:cs="Times New Roman"/>
+                <w:sz w:val="24"/>
+                <w:szCs w:val="24"/>
+                <w:lang w:eastAsia="ru-RU"/>
+              </w:rPr>
+              <m:t>I</m:t>
+            </m:r>
+          </m:e>
+          <m:sub>
+            <m:r>
+              <w:rPr>
+                <w:rFonts w:ascii="Cambria Math" w:eastAsia="Times New Roman" w:hAnsi="Cambria Math" w:cs="Times New Roman"/>
+                <w:sz w:val="24"/>
+                <w:szCs w:val="24"/>
+                <w:lang w:eastAsia="ru-RU"/>
+              </w:rPr>
+              <m:t>2</m:t>
+            </m:r>
+          </m:sub>
+        </m:sSub>
+        <m:r>
+          <w:rPr>
+            <w:rFonts w:ascii="Cambria Math" w:eastAsia="Times New Roman" w:hAnsi="Cambria Math" w:cs="Times New Roman"/>
+            <w:sz w:val="24"/>
+            <w:szCs w:val="24"/>
+            <w:lang w:eastAsia="ru-RU"/>
+          </w:rPr>
+          <m:t>=6</m:t>
+        </m:r>
+      </m:oMath>
+      <w:r>
+        <w:rPr>
+          <w:rFonts w:ascii="Times New Roman" w:eastAsia="Times New Roman" w:hAnsi="Times New Roman" w:cs="Times New Roman"/>
+          <w:sz w:val="24"/>
+          <w:szCs w:val="24"/>
+          <w:lang w:eastAsia="ru-RU"/>
+        </w:rPr>
+        <w:t>мА.</w:t>
+      </w:r>
+      <w:r>
+        <w:rPr>
+          <w:rFonts w:ascii="Times New Roman" w:eastAsia="Times New Roman" w:hAnsi="Times New Roman" w:cs="Times New Roman"/>
+          <w:sz w:val="24"/>
+          <w:szCs w:val="24"/>
+          <w:lang w:eastAsia="ru-RU"/>
+        </w:rPr>
+        <w:br/>
+        <w:t xml:space="preserve">Найдём соответствующее напряжение </w:t>
+      </w:r>
+      <m:oMath>
+        <m:sSub>
+          <m:sSubPr>
+            <m:ctrlPr>
+              <w:rPr>
+                <w:rFonts w:ascii="Cambria Math" w:eastAsia="Times New Roman" w:hAnsi="Cambria Math" w:cs="Times New Roman"/>
+                <w:sz w:val="24"/>
+                <w:szCs w:val="24"/>
+                <w:lang w:eastAsia="ru-RU"/>
+              </w:rPr>
+            </m:ctrlPr>
+          </m:sSubPr>
+          <m:e>
+            <m:r>
+              <w:rPr>
+                <w:rFonts w:ascii="Cambria Math" w:eastAsia="Times New Roman" w:hAnsi="Cambria Math" w:cs="Times New Roman"/>
+                <w:sz w:val="24"/>
+                <w:szCs w:val="24"/>
+                <w:lang w:eastAsia="ru-RU"/>
+              </w:rPr>
+              <m:t>U</m:t>
+            </m:r>
+          </m:e>
+          <m:sub>
+            <m:r>
+              <w:rPr>
+                <w:rFonts w:ascii="Cambria Math" w:eastAsia="Times New Roman" w:hAnsi="Cambria Math" w:cs="Times New Roman"/>
+                <w:sz w:val="24"/>
+                <w:szCs w:val="24"/>
+                <w:lang w:eastAsia="ru-RU"/>
+              </w:rPr>
+              <m:t>2</m:t>
+            </m:r>
+          </m:sub>
+        </m:sSub>
+      </m:oMath>
+      <w:r>
+        <w:rPr>
+          <w:rFonts w:ascii="Times New Roman" w:eastAsia="Times New Roman" w:hAnsi="Times New Roman" w:cs="Times New Roman"/>
+          <w:sz w:val="24"/>
+          <w:szCs w:val="24"/>
+          <w:lang w:eastAsia="ru-RU"/>
+        </w:rPr>
+        <w:t>из уравнения ВАХ:</w:t>
       </w:r>
     </w:p>
     <w:p>
@@ -3135,7 +4273,7 @@
           <w:rFonts w:ascii="Times New Roman" w:eastAsia="Times New Roman" w:hAnsi="Times New Roman" w:cs="Times New Roman"/>
           <w:sz w:val="24"/>
           <w:szCs w:val="24"/>
-          <w:lang w:eastAsia="ru-RU"/>
+          <w:lang w:val="en-US" w:eastAsia="ru-RU"/>
         </w:rPr>
       </w:pPr>
       <m:oMathPara>
@@ -3147,8 +4285,96 @@
               <w:szCs w:val="24"/>
               <w:lang w:eastAsia="ru-RU"/>
             </w:rPr>
-            <w:lastRenderedPageBreak/>
-            <m:t>I2=6</m:t>
+            <m:t>6=0.04⋅(</m:t>
+          </m:r>
+          <m:sSup>
+            <m:sSupPr>
+              <m:ctrlPr>
+                <w:rPr>
+                  <w:rFonts w:ascii="Cambria Math" w:eastAsia="Times New Roman" w:hAnsi="Cambria Math" w:cs="Times New Roman"/>
+                  <w:sz w:val="24"/>
+                  <w:szCs w:val="24"/>
+                  <w:lang w:eastAsia="ru-RU"/>
+                </w:rPr>
+              </m:ctrlPr>
+            </m:sSupPr>
+            <m:e>
+              <m:r>
+                <w:rPr>
+                  <w:rFonts w:ascii="Cambria Math" w:eastAsia="Times New Roman" w:hAnsi="Cambria Math" w:cs="Times New Roman"/>
+                  <w:sz w:val="24"/>
+                  <w:szCs w:val="24"/>
+                  <w:lang w:eastAsia="ru-RU"/>
+                </w:rPr>
+                <m:t>e</m:t>
+              </m:r>
+            </m:e>
+            <m:sup>
+              <m:sSub>
+                <m:sSubPr>
+                  <m:ctrlPr>
+                    <w:rPr>
+                      <w:rFonts w:ascii="Cambria Math" w:eastAsia="Times New Roman" w:hAnsi="Cambria Math" w:cs="Times New Roman"/>
+                      <w:sz w:val="24"/>
+                      <w:szCs w:val="24"/>
+                      <w:lang w:eastAsia="ru-RU"/>
+                    </w:rPr>
+                  </m:ctrlPr>
+                </m:sSubPr>
+                <m:e>
+                  <m:r>
+                    <w:rPr>
+                      <w:rFonts w:ascii="Cambria Math" w:eastAsia="Times New Roman" w:hAnsi="Cambria Math" w:cs="Times New Roman"/>
+                      <w:sz w:val="24"/>
+                      <w:szCs w:val="24"/>
+                      <w:lang w:eastAsia="ru-RU"/>
+                    </w:rPr>
+                    <m:t>U</m:t>
+                  </m:r>
+                </m:e>
+                <m:sub>
+                  <m:r>
+                    <w:rPr>
+                      <w:rFonts w:ascii="Cambria Math" w:eastAsia="Times New Roman" w:hAnsi="Cambria Math" w:cs="Times New Roman"/>
+                      <w:sz w:val="24"/>
+                      <w:szCs w:val="24"/>
+                      <w:lang w:eastAsia="ru-RU"/>
+                    </w:rPr>
+                    <m:t>2</m:t>
+                  </m:r>
+                </m:sub>
+              </m:sSub>
+              <m:r>
+                <m:rPr>
+                  <m:sty m:val="p"/>
+                </m:rPr>
+                <w:rPr>
+                  <w:rFonts w:ascii="Cambria Math" w:eastAsia="Times New Roman" w:hAnsi="Cambria Math" w:cs="Times New Roman"/>
+                  <w:sz w:val="24"/>
+                  <w:szCs w:val="24"/>
+                  <w:lang w:eastAsia="ru-RU"/>
+                </w:rPr>
+                <m:t>/</m:t>
+              </m:r>
+              <m:r>
+                <w:rPr>
+                  <w:rFonts w:ascii="Cambria Math" w:eastAsia="Times New Roman" w:hAnsi="Cambria Math" w:cs="Times New Roman"/>
+                  <w:sz w:val="24"/>
+                  <w:szCs w:val="24"/>
+                  <w:lang w:eastAsia="ru-RU"/>
+                </w:rPr>
+                <m:t>0.25</m:t>
+              </m:r>
+            </m:sup>
+          </m:sSup>
+          <m:r>
+            <w:rPr>
+              <w:rFonts w:ascii="Cambria Math" w:eastAsia="Times New Roman" w:hAnsi="Cambria Math" w:cs="Times New Roman"/>
+              <w:sz w:val="24"/>
+              <w:szCs w:val="24"/>
+              <w:lang w:eastAsia="ru-RU"/>
+            </w:rPr>
+            <m:t>-1)</m:t>
           </m:r>
           <m:r>
             <m:rPr>
@@ -3160,19 +4386,8 @@
               <w:szCs w:val="24"/>
               <w:lang w:eastAsia="ru-RU"/>
             </w:rPr>
-            <m:t>мА</m:t>
+            <m:t>  </m:t>
           </m:r>
-          <m:r>
-            <w:rPr>
-              <w:rFonts w:ascii="Times New Roman" w:eastAsia="Times New Roman" w:hAnsi="Times New Roman" w:cs="Times New Roman"/>
-              <w:sz w:val="24"/>
-              <w:szCs w:val="24"/>
-              <w:lang w:eastAsia="ru-RU"/>
-            </w:rPr>
-            <w:br/>
-          </m:r>
-        </m:oMath>
-        <m:oMath>
           <m:r>
             <w:rPr>
               <w:rFonts w:ascii="Cambria Math" w:eastAsia="Times New Roman" w:hAnsi="Cambria Math" w:cs="Times New Roman"/>
@@ -3180,7 +4395,7 @@
               <w:szCs w:val="24"/>
               <w:lang w:eastAsia="ru-RU"/>
             </w:rPr>
-            <m:t>U2=1.26</m:t>
+            <m:t>⟹</m:t>
           </m:r>
           <m:r>
             <m:rPr>
@@ -3192,11 +4407,144 @@
               <w:szCs w:val="24"/>
               <w:lang w:eastAsia="ru-RU"/>
             </w:rPr>
-            <m:t>В</m:t>
+            <m:t>  </m:t>
+          </m:r>
+          <m:sSup>
+            <m:sSupPr>
+              <m:ctrlPr>
+                <w:rPr>
+                  <w:rFonts w:ascii="Cambria Math" w:eastAsia="Times New Roman" w:hAnsi="Cambria Math" w:cs="Times New Roman"/>
+                  <w:sz w:val="24"/>
+                  <w:szCs w:val="24"/>
+                  <w:lang w:eastAsia="ru-RU"/>
+                </w:rPr>
+              </m:ctrlPr>
+            </m:sSupPr>
+            <m:e>
+              <m:r>
+                <w:rPr>
+                  <w:rFonts w:ascii="Cambria Math" w:eastAsia="Times New Roman" w:hAnsi="Cambria Math" w:cs="Times New Roman"/>
+                  <w:sz w:val="24"/>
+                  <w:szCs w:val="24"/>
+                  <w:lang w:eastAsia="ru-RU"/>
+                </w:rPr>
+                <m:t>e</m:t>
+              </m:r>
+            </m:e>
+            <m:sup>
+              <m:sSub>
+                <m:sSubPr>
+                  <m:ctrlPr>
+                    <w:rPr>
+                      <w:rFonts w:ascii="Cambria Math" w:eastAsia="Times New Roman" w:hAnsi="Cambria Math" w:cs="Times New Roman"/>
+                      <w:sz w:val="24"/>
+                      <w:szCs w:val="24"/>
+                      <w:lang w:eastAsia="ru-RU"/>
+                    </w:rPr>
+                  </m:ctrlPr>
+                </m:sSubPr>
+                <m:e>
+                  <m:r>
+                    <w:rPr>
+                      <w:rFonts w:ascii="Cambria Math" w:eastAsia="Times New Roman" w:hAnsi="Cambria Math" w:cs="Times New Roman"/>
+                      <w:sz w:val="24"/>
+                      <w:szCs w:val="24"/>
+                      <w:lang w:eastAsia="ru-RU"/>
+                    </w:rPr>
+                    <m:t>U</m:t>
+                  </m:r>
+                </m:e>
+                <m:sub>
+                  <m:r>
+                    <w:rPr>
+                      <w:rFonts w:ascii="Cambria Math" w:eastAsia="Times New Roman" w:hAnsi="Cambria Math" w:cs="Times New Roman"/>
+                      <w:sz w:val="24"/>
+                      <w:szCs w:val="24"/>
+                      <w:lang w:eastAsia="ru-RU"/>
+                    </w:rPr>
+                    <m:t>2</m:t>
+                  </m:r>
+                </m:sub>
+              </m:sSub>
+              <m:r>
+                <m:rPr>
+                  <m:sty m:val="p"/>
+                </m:rPr>
+                <w:rPr>
+                  <w:rFonts w:ascii="Cambria Math" w:eastAsia="Times New Roman" w:hAnsi="Cambria Math" w:cs="Times New Roman"/>
+                  <w:sz w:val="24"/>
+                  <w:szCs w:val="24"/>
+                  <w:lang w:eastAsia="ru-RU"/>
+                </w:rPr>
+                <m:t>/</m:t>
+              </m:r>
+              <m:r>
+                <w:rPr>
+                  <w:rFonts w:ascii="Cambria Math" w:eastAsia="Times New Roman" w:hAnsi="Cambria Math" w:cs="Times New Roman"/>
+                  <w:sz w:val="24"/>
+                  <w:szCs w:val="24"/>
+                  <w:lang w:eastAsia="ru-RU"/>
+                </w:rPr>
+                <m:t>0.25</m:t>
+              </m:r>
+            </m:sup>
+          </m:sSup>
+          <m:r>
+            <w:rPr>
+              <w:rFonts w:ascii="Cambria Math" w:eastAsia="Times New Roman" w:hAnsi="Cambria Math" w:cs="Times New Roman"/>
+              <w:sz w:val="24"/>
+              <w:szCs w:val="24"/>
+              <w:lang w:eastAsia="ru-RU"/>
+            </w:rPr>
+            <m:t>=</m:t>
+          </m:r>
+          <m:f>
+            <m:fPr>
+              <m:ctrlPr>
+                <w:rPr>
+                  <w:rFonts w:ascii="Cambria Math" w:eastAsia="Times New Roman" w:hAnsi="Cambria Math" w:cs="Times New Roman"/>
+                  <w:sz w:val="24"/>
+                  <w:szCs w:val="24"/>
+                  <w:lang w:eastAsia="ru-RU"/>
+                </w:rPr>
+              </m:ctrlPr>
+            </m:fPr>
+            <m:num>
+              <m:r>
+                <w:rPr>
+                  <w:rFonts w:ascii="Cambria Math" w:eastAsia="Times New Roman" w:hAnsi="Cambria Math" w:cs="Times New Roman"/>
+                  <w:sz w:val="24"/>
+                  <w:szCs w:val="24"/>
+                  <w:lang w:eastAsia="ru-RU"/>
+                </w:rPr>
+                <m:t>6</m:t>
+              </m:r>
+            </m:num>
+            <m:den>
+              <m:r>
+                <w:rPr>
+                  <w:rFonts w:ascii="Cambria Math" w:eastAsia="Times New Roman" w:hAnsi="Cambria Math" w:cs="Times New Roman"/>
+                  <w:sz w:val="24"/>
+                  <w:szCs w:val="24"/>
+                  <w:lang w:eastAsia="ru-RU"/>
+                </w:rPr>
+                <m:t>0.04</m:t>
+              </m:r>
+            </m:den>
+          </m:f>
+          <m:r>
+            <w:rPr>
+              <w:rFonts w:ascii="Cambria Math" w:eastAsia="Times New Roman" w:hAnsi="Cambria Math" w:cs="Times New Roman"/>
+              <w:sz w:val="24"/>
+              <w:szCs w:val="24"/>
+              <w:lang w:eastAsia="ru-RU"/>
+            </w:rPr>
+            <m:t>+1=151</m:t>
           </m:r>
           <m:r>
             <w:rPr>
-              <w:rFonts w:ascii="Times New Roman" w:eastAsia="Times New Roman" w:hAnsi="Times New Roman" w:cs="Times New Roman"/>
+              <w:rFonts w:ascii="Cambria Math" w:eastAsia="Times New Roman" w:hAnsi="Cambria Math" w:cs="Times New Roman"/>
+              <w:i/>
               <w:sz w:val="24"/>
               <w:szCs w:val="24"/>
               <w:lang w:eastAsia="ru-RU"/>
@@ -3204,6 +4552,178 @@
             <w:br/>
           </m:r>
         </m:oMath>
+        <m:oMath>
+          <m:sSub>
+            <m:sSubPr>
+              <m:ctrlPr>
+                <w:rPr>
+                  <w:rFonts w:ascii="Cambria Math" w:eastAsia="Times New Roman" w:hAnsi="Cambria Math" w:cs="Times New Roman"/>
+                  <w:sz w:val="24"/>
+                  <w:szCs w:val="24"/>
+                  <w:lang w:eastAsia="ru-RU"/>
+                </w:rPr>
+              </m:ctrlPr>
+            </m:sSubPr>
+            <m:e>
+              <m:r>
+                <w:rPr>
+                  <w:rFonts w:ascii="Cambria Math" w:eastAsia="Times New Roman" w:hAnsi="Cambria Math" w:cs="Times New Roman"/>
+                  <w:sz w:val="24"/>
+                  <w:szCs w:val="24"/>
+                  <w:lang w:eastAsia="ru-RU"/>
+                </w:rPr>
+                <m:t>U</m:t>
+              </m:r>
+            </m:e>
+            <m:sub>
+              <m:r>
+                <w:rPr>
+                  <w:rFonts w:ascii="Cambria Math" w:eastAsia="Times New Roman" w:hAnsi="Cambria Math" w:cs="Times New Roman"/>
+                  <w:sz w:val="24"/>
+                  <w:szCs w:val="24"/>
+                  <w:lang w:eastAsia="ru-RU"/>
+                </w:rPr>
+                <m:t>2</m:t>
+              </m:r>
+            </m:sub>
+          </m:sSub>
+          <m:r>
+            <w:rPr>
+              <w:rFonts w:ascii="Cambria Math" w:eastAsia="Times New Roman" w:hAnsi="Cambria Math" w:cs="Times New Roman"/>
+              <w:sz w:val="24"/>
+              <w:szCs w:val="24"/>
+              <w:lang w:eastAsia="ru-RU"/>
+            </w:rPr>
+            <m:t>=0.25⋅</m:t>
+          </m:r>
+          <m:r>
+            <m:rPr>
+              <m:sty m:val="p"/>
+            </m:rPr>
+            <w:rPr>
+              <w:rFonts w:ascii="Cambria Math" w:eastAsia="Times New Roman" w:hAnsi="Cambria Math" w:cs="Times New Roman"/>
+              <w:sz w:val="24"/>
+              <w:szCs w:val="24"/>
+              <w:lang w:eastAsia="ru-RU"/>
+            </w:rPr>
+            <m:t>ln</m:t>
+          </m:r>
+          <m:r>
+            <w:rPr>
+              <w:rFonts w:ascii="Cambria Math" w:eastAsia="Times New Roman" w:hAnsi="Cambria Math" w:cs="Times New Roman"/>
+              <w:sz w:val="24"/>
+              <w:szCs w:val="24"/>
+              <w:lang w:eastAsia="ru-RU"/>
+            </w:rPr>
+            <m:t>⁡(151)≈0.25⋅5.017≈1.254</m:t>
+          </m:r>
+          <m:r>
+            <m:rPr>
+              <m:nor/>
+            </m:rPr>
+            <w:rPr>
+              <w:rFonts w:ascii="Times New Roman" w:eastAsia="Times New Roman" w:hAnsi="Times New Roman" w:cs="Times New Roman"/>
+              <w:sz w:val="24"/>
+              <w:szCs w:val="24"/>
+              <w:lang w:eastAsia="ru-RU"/>
+            </w:rPr>
+            <m:t> В</m:t>
+          </m:r>
+        </m:oMath>
+      </m:oMathPara>
+    </w:p>
+    <w:p>
+      <w:pPr>
+        <w:spacing w:before="100" w:beforeAutospacing="1" w:after="100" w:afterAutospacing="1" w:line="240" w:lineRule="auto"/>
+        <w:rPr>
+          <w:rFonts w:ascii="Times New Roman" w:eastAsia="Times New Roman" w:hAnsi="Times New Roman" w:cs="Times New Roman"/>
+          <w:sz w:val="24"/>
+          <w:szCs w:val="24"/>
+          <w:lang w:eastAsia="ru-RU"/>
+        </w:rPr>
+      </w:pPr>
+      <w:r>
+        <w:rPr>
+          <w:rFonts w:ascii="Times New Roman" w:eastAsia="Times New Roman" w:hAnsi="Times New Roman" w:cs="Times New Roman"/>
+          <w:b/>
+          <w:bCs/>
+          <w:sz w:val="24"/>
+          <w:szCs w:val="24"/>
+          <w:lang w:eastAsia="ru-RU"/>
+        </w:rPr>
+        <w:t xml:space="preserve">Статическое сопротивление </w:t>
+      </w:r>
+      <m:oMath>
+        <m:sSub>
+          <m:sSubPr>
+            <m:ctrlPr>
+              <w:rPr>
+                <w:rFonts w:ascii="Cambria Math" w:eastAsia="Times New Roman" w:hAnsi="Cambria Math" w:cs="Times New Roman"/>
+                <w:sz w:val="24"/>
+                <w:szCs w:val="24"/>
+                <w:lang w:eastAsia="ru-RU"/>
+              </w:rPr>
+            </m:ctrlPr>
+          </m:sSubPr>
+          <m:e>
+            <m:r>
+              <w:rPr>
+                <w:rFonts w:ascii="Cambria Math" w:eastAsia="Times New Roman" w:hAnsi="Cambria Math" w:cs="Times New Roman"/>
+                <w:sz w:val="24"/>
+                <w:szCs w:val="24"/>
+                <w:lang w:eastAsia="ru-RU"/>
+              </w:rPr>
+              <m:t>R</m:t>
+            </m:r>
+          </m:e>
+          <m:sub>
+            <m:r>
+              <m:rPr>
+                <m:nor/>
+              </m:rPr>
+              <w:rPr>
+                <w:rFonts w:ascii="Times New Roman" w:eastAsia="Times New Roman" w:hAnsi="Times New Roman" w:cs="Times New Roman"/>
+                <w:sz w:val="24"/>
+                <w:szCs w:val="24"/>
+                <w:lang w:eastAsia="ru-RU"/>
+              </w:rPr>
+              <m:t>ст</m:t>
+            </m:r>
+            <m:r>
+              <w:rPr>
+                <w:rFonts w:ascii="Cambria Math" w:eastAsia="Times New Roman" w:hAnsi="Cambria Math" w:cs="Times New Roman"/>
+                <w:sz w:val="24"/>
+                <w:szCs w:val="24"/>
+                <w:lang w:eastAsia="ru-RU"/>
+              </w:rPr>
+              <m:t>2</m:t>
+            </m:r>
+          </m:sub>
+        </m:sSub>
+      </m:oMath>
+      <w:r>
+        <w:rPr>
+          <w:rFonts w:ascii="Times New Roman" w:eastAsia="Times New Roman" w:hAnsi="Times New Roman" w:cs="Times New Roman"/>
+          <w:b/>
+          <w:bCs/>
+          <w:sz w:val="24"/>
+          <w:szCs w:val="24"/>
+          <w:lang w:eastAsia="ru-RU"/>
+        </w:rPr>
+        <w:t>:</w:t>
+      </w:r>
+    </w:p>
+    <w:p>
+      <w:pPr>
+        <w:spacing w:after="0" w:line="240" w:lineRule="auto"/>
+        <w:rPr>
+          <w:rFonts w:ascii="Times New Roman" w:eastAsia="Times New Roman" w:hAnsi="Times New Roman" w:cs="Times New Roman"/>
+          <w:sz w:val="24"/>
+          <w:szCs w:val="24"/>
+          <w:lang w:val="en-US" w:eastAsia="ru-RU"/>
+        </w:rPr>
+      </w:pPr>
+      <m:oMathPara>
         <m:oMath>
           <m:sSub>
             <m:sSubPr>
@@ -3272,26 +4792,76 @@
               </m:ctrlPr>
             </m:fPr>
             <m:num>
-              <m:r>
-                <w:rPr>
-                  <w:rFonts w:ascii="Cambria Math" w:eastAsia="Times New Roman" w:hAnsi="Cambria Math" w:cs="Times New Roman"/>
-                  <w:sz w:val="24"/>
-                  <w:szCs w:val="24"/>
-                  <w:lang w:eastAsia="ru-RU"/>
-                </w:rPr>
-                <m:t>U2</m:t>
-              </m:r>
+              <m:sSub>
+                <m:sSubPr>
+                  <m:ctrlPr>
+                    <w:rPr>
+                      <w:rFonts w:ascii="Cambria Math" w:eastAsia="Times New Roman" w:hAnsi="Cambria Math" w:cs="Times New Roman"/>
+                      <w:sz w:val="24"/>
+                      <w:szCs w:val="24"/>
+                      <w:lang w:eastAsia="ru-RU"/>
+                    </w:rPr>
+                  </m:ctrlPr>
+                </m:sSubPr>
+                <m:e>
+                  <m:r>
+                    <w:rPr>
+                      <w:rFonts w:ascii="Cambria Math" w:eastAsia="Times New Roman" w:hAnsi="Cambria Math" w:cs="Times New Roman"/>
+                      <w:sz w:val="24"/>
+                      <w:szCs w:val="24"/>
+                      <w:lang w:eastAsia="ru-RU"/>
+                    </w:rPr>
+                    <m:t>U</m:t>
+                  </m:r>
+                </m:e>
+                <m:sub>
+                  <m:r>
+                    <w:rPr>
+                      <w:rFonts w:ascii="Cambria Math" w:eastAsia="Times New Roman" w:hAnsi="Cambria Math" w:cs="Times New Roman"/>
+                      <w:sz w:val="24"/>
+                      <w:szCs w:val="24"/>
+                      <w:lang w:eastAsia="ru-RU"/>
+                    </w:rPr>
+                    <m:t>2</m:t>
+                  </m:r>
+                </m:sub>
+              </m:sSub>
             </m:num>
             <m:den>
-              <m:r>
-                <w:rPr>
-                  <w:rFonts w:ascii="Cambria Math" w:eastAsia="Times New Roman" w:hAnsi="Cambria Math" w:cs="Times New Roman"/>
-                  <w:sz w:val="24"/>
-                  <w:szCs w:val="24"/>
-                  <w:lang w:eastAsia="ru-RU"/>
-                </w:rPr>
-                <m:t>I2</m:t>
-              </m:r>
+              <m:sSub>
+                <m:sSubPr>
+                  <m:ctrlPr>
+                    <w:rPr>
+                      <w:rFonts w:ascii="Cambria Math" w:eastAsia="Times New Roman" w:hAnsi="Cambria Math" w:cs="Times New Roman"/>
+                      <w:sz w:val="24"/>
+                      <w:szCs w:val="24"/>
+                      <w:lang w:eastAsia="ru-RU"/>
+                    </w:rPr>
+                  </m:ctrlPr>
+                </m:sSubPr>
+                <m:e>
+                  <m:r>
+                    <w:rPr>
+                      <w:rFonts w:ascii="Cambria Math" w:eastAsia="Times New Roman" w:hAnsi="Cambria Math" w:cs="Times New Roman"/>
+                      <w:sz w:val="24"/>
+                      <w:szCs w:val="24"/>
+                      <w:lang w:eastAsia="ru-RU"/>
+                    </w:rPr>
+                    <m:t>I</m:t>
+                  </m:r>
+                </m:e>
+                <m:sub>
+                  <m:r>
+                    <w:rPr>
+                      <w:rFonts w:ascii="Cambria Math" w:eastAsia="Times New Roman" w:hAnsi="Cambria Math" w:cs="Times New Roman"/>
+                      <w:sz w:val="24"/>
+                      <w:szCs w:val="24"/>
+                      <w:lang w:eastAsia="ru-RU"/>
+                    </w:rPr>
+                    <m:t>2</m:t>
+                  </m:r>
+                </m:sub>
+              </m:sSub>
             </m:den>
           </m:f>
           <m:r>
@@ -3322,7 +4892,19 @@
                   <w:szCs w:val="24"/>
                   <w:lang w:eastAsia="ru-RU"/>
                 </w:rPr>
-                <m:t>1.26</m:t>
+                <m:t>1.254</m:t>
+              </m:r>
+              <m:r>
+                <m:rPr>
+                  <m:nor/>
+                </m:rPr>
+                <w:rPr>
+                  <w:rFonts w:ascii="Times New Roman" w:eastAsia="Times New Roman" w:hAnsi="Times New Roman" w:cs="Times New Roman"/>
+                  <w:sz w:val="24"/>
+                  <w:szCs w:val="24"/>
+                  <w:lang w:eastAsia="ru-RU"/>
+                </w:rPr>
+                <m:t> В</m:t>
               </m:r>
             </m:num>
             <m:den>
@@ -3369,6 +4951,18 @@
                   </m:r>
                 </m:sup>
               </m:sSup>
+              <m:r>
+                <m:rPr>
+                  <m:nor/>
+                </m:rPr>
+                <w:rPr>
+                  <w:rFonts w:ascii="Times New Roman" w:eastAsia="Times New Roman" w:hAnsi="Times New Roman" w:cs="Times New Roman"/>
+                  <w:sz w:val="24"/>
+                  <w:szCs w:val="24"/>
+                  <w:lang w:eastAsia="ru-RU"/>
+                </w:rPr>
+                <m:t> А</m:t>
+              </m:r>
             </m:den>
           </m:f>
           <m:r>
@@ -3378,7 +4972,7 @@
               <w:szCs w:val="24"/>
               <w:lang w:eastAsia="ru-RU"/>
             </w:rPr>
-            <m:t>=210</m:t>
+            <m:t>≈209</m:t>
           </m:r>
           <m:r>
             <m:rPr>
@@ -3399,7 +4993,7 @@
               <w:szCs w:val="24"/>
               <w:lang w:eastAsia="ru-RU"/>
             </w:rPr>
-            <m:t>=0.21</m:t>
+            <m:t>=0.209</m:t>
           </m:r>
           <m:r>
             <m:rPr>
@@ -3413,16 +5007,189 @@
             </w:rPr>
             <m:t> кОм</m:t>
           </m:r>
-          <m:r>
-            <w:rPr>
-              <w:rFonts w:ascii="Times New Roman" w:eastAsia="Times New Roman" w:hAnsi="Times New Roman" w:cs="Times New Roman"/>
-              <w:sz w:val="24"/>
-              <w:szCs w:val="24"/>
-              <w:lang w:eastAsia="ru-RU"/>
-            </w:rPr>
-            <w:br/>
-          </m:r>
         </m:oMath>
+      </m:oMathPara>
+    </w:p>
+    <w:p>
+      <w:pPr>
+        <w:spacing w:before="100" w:beforeAutospacing="1" w:after="100" w:afterAutospacing="1" w:line="240" w:lineRule="auto"/>
+        <w:rPr>
+          <w:rFonts w:ascii="Times New Roman" w:eastAsia="Times New Roman" w:hAnsi="Times New Roman" w:cs="Times New Roman"/>
+          <w:sz w:val="24"/>
+          <w:szCs w:val="24"/>
+          <w:lang w:eastAsia="ru-RU"/>
+        </w:rPr>
+      </w:pPr>
+      <w:r>
+        <w:rPr>
+          <w:rFonts w:ascii="Times New Roman" w:eastAsia="Times New Roman" w:hAnsi="Times New Roman" w:cs="Times New Roman"/>
+          <w:b/>
+          <w:bCs/>
+          <w:sz w:val="24"/>
+          <w:szCs w:val="24"/>
+          <w:lang w:eastAsia="ru-RU"/>
+        </w:rPr>
+        <w:t xml:space="preserve">Динамическое сопротивление </w:t>
+      </w:r>
+      <m:oMath>
+        <m:sSub>
+          <m:sSubPr>
+            <m:ctrlPr>
+              <w:rPr>
+                <w:rFonts w:ascii="Cambria Math" w:eastAsia="Times New Roman" w:hAnsi="Cambria Math" w:cs="Times New Roman"/>
+                <w:sz w:val="24"/>
+                <w:szCs w:val="24"/>
+                <w:lang w:eastAsia="ru-RU"/>
+              </w:rPr>
+            </m:ctrlPr>
+          </m:sSubPr>
+          <m:e>
+            <m:r>
+              <w:rPr>
+                <w:rFonts w:ascii="Cambria Math" w:eastAsia="Times New Roman" w:hAnsi="Cambria Math" w:cs="Times New Roman"/>
+                <w:sz w:val="24"/>
+                <w:szCs w:val="24"/>
+                <w:lang w:eastAsia="ru-RU"/>
+              </w:rPr>
+              <m:t>R</m:t>
+            </m:r>
+          </m:e>
+          <m:sub>
+            <m:r>
+              <m:rPr>
+                <m:nor/>
+              </m:rPr>
+              <w:rPr>
+                <w:rFonts w:ascii="Times New Roman" w:eastAsia="Times New Roman" w:hAnsi="Times New Roman" w:cs="Times New Roman"/>
+                <w:sz w:val="24"/>
+                <w:szCs w:val="24"/>
+                <w:lang w:eastAsia="ru-RU"/>
+              </w:rPr>
+              <m:t>д</m:t>
+            </m:r>
+            <m:r>
+              <w:rPr>
+                <w:rFonts w:ascii="Cambria Math" w:eastAsia="Times New Roman" w:hAnsi="Cambria Math" w:cs="Times New Roman"/>
+                <w:sz w:val="24"/>
+                <w:szCs w:val="24"/>
+                <w:lang w:eastAsia="ru-RU"/>
+              </w:rPr>
+              <m:t>2</m:t>
+            </m:r>
+          </m:sub>
+        </m:sSub>
+      </m:oMath>
+      <w:r>
+        <w:rPr>
+          <w:rFonts w:ascii="Times New Roman" w:eastAsia="Times New Roman" w:hAnsi="Times New Roman" w:cs="Times New Roman"/>
+          <w:b/>
+          <w:bCs/>
+          <w:sz w:val="24"/>
+          <w:szCs w:val="24"/>
+          <w:lang w:eastAsia="ru-RU"/>
+        </w:rPr>
+        <w:t>:</w:t>
+      </w:r>
+      <w:r>
+        <w:rPr>
+          <w:rFonts w:ascii="Times New Roman" w:eastAsia="Times New Roman" w:hAnsi="Times New Roman" w:cs="Times New Roman"/>
+          <w:sz w:val="24"/>
+          <w:szCs w:val="24"/>
+          <w:lang w:eastAsia="ru-RU"/>
+        </w:rPr>
+        <w:br/>
+        <w:t xml:space="preserve">Используем формулу </w:t>
+      </w:r>
+      <m:oMath>
+        <m:sSub>
+          <m:sSubPr>
+            <m:ctrlPr>
+              <w:rPr>
+                <w:rFonts w:ascii="Cambria Math" w:eastAsia="Times New Roman" w:hAnsi="Cambria Math" w:cs="Times New Roman"/>
+                <w:sz w:val="24"/>
+                <w:szCs w:val="24"/>
+                <w:lang w:eastAsia="ru-RU"/>
+              </w:rPr>
+            </m:ctrlPr>
+          </m:sSubPr>
+          <m:e>
+            <m:r>
+              <w:rPr>
+                <w:rFonts w:ascii="Cambria Math" w:eastAsia="Times New Roman" w:hAnsi="Cambria Math" w:cs="Times New Roman"/>
+                <w:sz w:val="24"/>
+                <w:szCs w:val="24"/>
+                <w:lang w:eastAsia="ru-RU"/>
+              </w:rPr>
+              <m:t>R</m:t>
+            </m:r>
+          </m:e>
+          <m:sub>
+            <m:r>
+              <m:rPr>
+                <m:nor/>
+              </m:rPr>
+              <w:rPr>
+                <w:rFonts w:ascii="Times New Roman" w:eastAsia="Times New Roman" w:hAnsi="Times New Roman" w:cs="Times New Roman"/>
+                <w:sz w:val="24"/>
+                <w:szCs w:val="24"/>
+                <w:lang w:eastAsia="ru-RU"/>
+              </w:rPr>
+              <m:t>д</m:t>
+            </m:r>
+          </m:sub>
+        </m:sSub>
+        <m:r>
+          <w:rPr>
+            <w:rFonts w:ascii="Cambria Math" w:eastAsia="Times New Roman" w:hAnsi="Cambria Math" w:cs="Times New Roman"/>
+            <w:sz w:val="24"/>
+            <w:szCs w:val="24"/>
+            <w:lang w:eastAsia="ru-RU"/>
+          </w:rPr>
+          <m:t>=φ</m:t>
+        </m:r>
+        <m:r>
+          <m:rPr>
+            <m:sty m:val="p"/>
+          </m:rPr>
+          <w:rPr>
+            <w:rFonts w:ascii="Cambria Math" w:eastAsia="Times New Roman" w:hAnsi="Cambria Math" w:cs="Times New Roman"/>
+            <w:sz w:val="24"/>
+            <w:szCs w:val="24"/>
+            <w:lang w:eastAsia="ru-RU"/>
+          </w:rPr>
+          <m:t>/</m:t>
+        </m:r>
+        <m:r>
+          <w:rPr>
+            <w:rFonts w:ascii="Cambria Math" w:eastAsia="Times New Roman" w:hAnsi="Cambria Math" w:cs="Times New Roman"/>
+            <w:sz w:val="24"/>
+            <w:szCs w:val="24"/>
+            <w:lang w:eastAsia="ru-RU"/>
+          </w:rPr>
+          <m:t>I</m:t>
+        </m:r>
+      </m:oMath>
+      <w:r>
+        <w:rPr>
+          <w:rFonts w:ascii="Times New Roman" w:eastAsia="Times New Roman" w:hAnsi="Times New Roman" w:cs="Times New Roman"/>
+          <w:sz w:val="24"/>
+          <w:szCs w:val="24"/>
+          <w:lang w:eastAsia="ru-RU"/>
+        </w:rPr>
+        <w:t>:</w:t>
+      </w:r>
+    </w:p>
+    <w:p>
+      <w:pPr>
+        <w:spacing w:after="0" w:line="240" w:lineRule="auto"/>
+        <w:rPr>
+          <w:rFonts w:ascii="Times New Roman" w:eastAsia="Times New Roman" w:hAnsi="Times New Roman" w:cs="Times New Roman"/>
+          <w:sz w:val="24"/>
+          <w:szCs w:val="24"/>
+          <w:lang w:val="en-US" w:eastAsia="ru-RU"/>
+        </w:rPr>
+      </w:pPr>
+      <m:oMathPara>
         <m:oMath>
           <m:sSub>
             <m:sSubPr>
@@ -3499,6 +5266,18 @@
                   <w:lang w:eastAsia="ru-RU"/>
                 </w:rPr>
                 <m:t>0.25</m:t>
+              </m:r>
+              <m:r>
+                <m:rPr>
+                  <m:nor/>
+                </m:rPr>
+                <w:rPr>
+                  <w:rFonts w:ascii="Times New Roman" w:eastAsia="Times New Roman" w:hAnsi="Times New Roman" w:cs="Times New Roman"/>
+                  <w:sz w:val="24"/>
+                  <w:szCs w:val="24"/>
+                  <w:lang w:eastAsia="ru-RU"/>
+                </w:rPr>
+                <m:t> В</m:t>
               </m:r>
             </m:num>
             <m:den>
@@ -3545,6 +5324,18 @@
                   </m:r>
                 </m:sup>
               </m:sSup>
+              <m:r>
+                <m:rPr>
+                  <m:nor/>
+                </m:rPr>
+                <w:rPr>
+                  <w:rFonts w:ascii="Times New Roman" w:eastAsia="Times New Roman" w:hAnsi="Times New Roman" w:cs="Times New Roman"/>
+                  <w:sz w:val="24"/>
+                  <w:szCs w:val="24"/>
+                  <w:lang w:eastAsia="ru-RU"/>
+                </w:rPr>
+                <m:t> А</m:t>
+              </m:r>
             </m:den>
           </m:f>
           <m:r>
@@ -3554,7 +5345,7 @@
               <w:szCs w:val="24"/>
               <w:lang w:eastAsia="ru-RU"/>
             </w:rPr>
-            <m:t>=41.7</m:t>
+            <m:t>≈41.7</m:t>
           </m:r>
           <m:r>
             <m:rPr>
@@ -3575,7 +5366,7 @@
               <w:szCs w:val="24"/>
               <w:lang w:eastAsia="ru-RU"/>
             </w:rPr>
-            <m:t>=0.042</m:t>
+            <m:t>=0.0417</m:t>
           </m:r>
           <m:r>
             <m:rPr>
@@ -3589,52 +5380,250 @@
             </w:rPr>
             <m:t> кОм</m:t>
           </m:r>
-          <m:r>
-            <w:rPr>
-              <w:rFonts w:ascii="Times New Roman" w:eastAsia="Times New Roman" w:hAnsi="Times New Roman" w:cs="Times New Roman"/>
-              <w:sz w:val="24"/>
-              <w:szCs w:val="24"/>
-              <w:lang w:eastAsia="ru-RU"/>
-            </w:rPr>
-            <w:br/>
-          </m:r>
         </m:oMath>
       </m:oMathPara>
     </w:p>
     <w:p>
       <w:pPr>
-        <w:spacing w:after="0" w:line="240" w:lineRule="auto"/>
-        <w:rPr>
-          <w:rFonts w:ascii="Times New Roman" w:eastAsia="Times New Roman" w:hAnsi="Times New Roman" w:cs="Times New Roman"/>
+        <w:spacing w:before="100" w:beforeAutospacing="1" w:after="100" w:afterAutospacing="1" w:line="240" w:lineRule="auto"/>
+        <w:outlineLvl w:val="3"/>
+        <w:rPr>
+          <w:rFonts w:ascii="Times New Roman" w:eastAsia="Times New Roman" w:hAnsi="Times New Roman" w:cs="Times New Roman"/>
+          <w:b/>
+          <w:bCs/>
           <w:sz w:val="24"/>
           <w:szCs w:val="24"/>
           <w:lang w:eastAsia="ru-RU"/>
         </w:rPr>
       </w:pPr>
+      <w:r>
+        <w:rPr>
+          <w:rFonts w:ascii="Times New Roman" w:eastAsia="Times New Roman" w:hAnsi="Times New Roman" w:cs="Times New Roman"/>
+          <w:b/>
+          <w:bCs/>
+          <w:sz w:val="24"/>
+          <w:szCs w:val="24"/>
+          <w:lang w:eastAsia="ru-RU"/>
+        </w:rPr>
+        <w:t>Расчет обратной ветви ВАХ</w:t>
+      </w:r>
     </w:p>
     <w:p>
       <w:pPr>
         <w:spacing w:before="100" w:beforeAutospacing="1" w:after="100" w:afterAutospacing="1" w:line="240" w:lineRule="auto"/>
-        <w:outlineLvl w:val="1"/>
+        <w:rPr>
+          <w:rFonts w:ascii="Times New Roman" w:eastAsia="Times New Roman" w:hAnsi="Times New Roman" w:cs="Times New Roman"/>
+          <w:sz w:val="24"/>
+          <w:szCs w:val="24"/>
+          <w:lang w:eastAsia="ru-RU"/>
+        </w:rPr>
+      </w:pPr>
+      <w:r>
         <w:rPr>
           <w:rFonts w:ascii="Times New Roman" w:eastAsia="Times New Roman" w:hAnsi="Times New Roman" w:cs="Times New Roman"/>
           <w:b/>
           <w:bCs/>
-          <w:sz w:val="36"/>
-          <w:szCs w:val="36"/>
+          <w:sz w:val="24"/>
+          <w:szCs w:val="24"/>
           <w:lang w:eastAsia="ru-RU"/>
         </w:rPr>
-      </w:pPr>
+        <w:t>PT3 (обратное смещение):</w:t>
+      </w:r>
+      <w:r>
+        <w:rPr>
+          <w:rFonts w:ascii="Times New Roman" w:eastAsia="Times New Roman" w:hAnsi="Times New Roman" w:cs="Times New Roman"/>
+          <w:sz w:val="24"/>
+          <w:szCs w:val="24"/>
+          <w:lang w:eastAsia="ru-RU"/>
+        </w:rPr>
+        <w:t xml:space="preserve"> точка задана напряжением </w:t>
+      </w:r>
+      <m:oMath>
+        <m:sSub>
+          <m:sSubPr>
+            <m:ctrlPr>
+              <w:rPr>
+                <w:rFonts w:ascii="Cambria Math" w:eastAsia="Times New Roman" w:hAnsi="Cambria Math" w:cs="Times New Roman"/>
+                <w:sz w:val="24"/>
+                <w:szCs w:val="24"/>
+                <w:lang w:eastAsia="ru-RU"/>
+              </w:rPr>
+            </m:ctrlPr>
+          </m:sSubPr>
+          <m:e>
+            <m:r>
+              <w:rPr>
+                <w:rFonts w:ascii="Cambria Math" w:eastAsia="Times New Roman" w:hAnsi="Cambria Math" w:cs="Times New Roman"/>
+                <w:sz w:val="24"/>
+                <w:szCs w:val="24"/>
+                <w:lang w:eastAsia="ru-RU"/>
+              </w:rPr>
+              <m:t>U</m:t>
+            </m:r>
+          </m:e>
+          <m:sub>
+            <m:r>
+              <w:rPr>
+                <w:rFonts w:ascii="Cambria Math" w:eastAsia="Times New Roman" w:hAnsi="Cambria Math" w:cs="Times New Roman"/>
+                <w:sz w:val="24"/>
+                <w:szCs w:val="24"/>
+                <w:lang w:eastAsia="ru-RU"/>
+              </w:rPr>
+              <m:t>5</m:t>
+            </m:r>
+          </m:sub>
+        </m:sSub>
+        <m:r>
+          <w:rPr>
+            <w:rFonts w:ascii="Cambria Math" w:eastAsia="Times New Roman" w:hAnsi="Cambria Math" w:cs="Times New Roman"/>
+            <w:sz w:val="24"/>
+            <w:szCs w:val="24"/>
+            <w:lang w:eastAsia="ru-RU"/>
+          </w:rPr>
+          <m:t>=14</m:t>
+        </m:r>
+      </m:oMath>
+      <w:r>
+        <w:rPr>
+          <w:rFonts w:ascii="Times New Roman" w:eastAsia="Times New Roman" w:hAnsi="Times New Roman" w:cs="Times New Roman"/>
+          <w:sz w:val="24"/>
+          <w:szCs w:val="24"/>
+          <w:lang w:eastAsia="ru-RU"/>
+        </w:rPr>
+        <w:t xml:space="preserve">В и обратным током </w:t>
+      </w:r>
+      <m:oMath>
+        <m:sSub>
+          <m:sSubPr>
+            <m:ctrlPr>
+              <w:rPr>
+                <w:rFonts w:ascii="Cambria Math" w:eastAsia="Times New Roman" w:hAnsi="Cambria Math" w:cs="Times New Roman"/>
+                <w:sz w:val="24"/>
+                <w:szCs w:val="24"/>
+                <w:lang w:eastAsia="ru-RU"/>
+              </w:rPr>
+            </m:ctrlPr>
+          </m:sSubPr>
+          <m:e>
+            <m:r>
+              <w:rPr>
+                <w:rFonts w:ascii="Cambria Math" w:eastAsia="Times New Roman" w:hAnsi="Cambria Math" w:cs="Times New Roman"/>
+                <w:sz w:val="24"/>
+                <w:szCs w:val="24"/>
+                <w:lang w:eastAsia="ru-RU"/>
+              </w:rPr>
+              <m:t>I</m:t>
+            </m:r>
+          </m:e>
+          <m:sub>
+            <m:r>
+              <w:rPr>
+                <w:rFonts w:ascii="Cambria Math" w:eastAsia="Times New Roman" w:hAnsi="Cambria Math" w:cs="Times New Roman"/>
+                <w:sz w:val="24"/>
+                <w:szCs w:val="24"/>
+                <w:lang w:eastAsia="ru-RU"/>
+              </w:rPr>
+              <m:t>0</m:t>
+            </m:r>
+          </m:sub>
+        </m:sSub>
+        <m:r>
+          <w:rPr>
+            <w:rFonts w:ascii="Cambria Math" w:eastAsia="Times New Roman" w:hAnsi="Cambria Math" w:cs="Times New Roman"/>
+            <w:sz w:val="24"/>
+            <w:szCs w:val="24"/>
+            <w:lang w:eastAsia="ru-RU"/>
+          </w:rPr>
+          <m:t>=0.2</m:t>
+        </m:r>
+      </m:oMath>
+      <w:r>
+        <w:rPr>
+          <w:rFonts w:ascii="Times New Roman" w:eastAsia="Times New Roman" w:hAnsi="Times New Roman" w:cs="Times New Roman"/>
+          <w:sz w:val="24"/>
+          <w:szCs w:val="24"/>
+          <w:lang w:eastAsia="ru-RU"/>
+        </w:rPr>
+        <w:t>мкА.</w:t>
+      </w:r>
+      <w:r>
+        <w:rPr>
+          <w:rFonts w:ascii="Times New Roman" w:eastAsia="Times New Roman" w:hAnsi="Times New Roman" w:cs="Times New Roman"/>
+          <w:sz w:val="24"/>
+          <w:szCs w:val="24"/>
+          <w:lang w:eastAsia="ru-RU"/>
+        </w:rPr>
+        <w:br/>
+      </w:r>
       <w:r>
         <w:rPr>
           <w:rFonts w:ascii="Times New Roman" w:eastAsia="Times New Roman" w:hAnsi="Times New Roman" w:cs="Times New Roman"/>
           <w:b/>
           <w:bCs/>
-          <w:sz w:val="36"/>
-          <w:szCs w:val="36"/>
+          <w:sz w:val="24"/>
+          <w:szCs w:val="24"/>
           <w:lang w:eastAsia="ru-RU"/>
         </w:rPr>
-        <w:t>Расчёт статического сопротивления в РТ3:</w:t>
+        <w:t xml:space="preserve">Статическое сопротивление </w:t>
+      </w:r>
+      <m:oMath>
+        <m:sSub>
+          <m:sSubPr>
+            <m:ctrlPr>
+              <w:rPr>
+                <w:rFonts w:ascii="Cambria Math" w:eastAsia="Times New Roman" w:hAnsi="Cambria Math" w:cs="Times New Roman"/>
+                <w:sz w:val="24"/>
+                <w:szCs w:val="24"/>
+                <w:lang w:eastAsia="ru-RU"/>
+              </w:rPr>
+            </m:ctrlPr>
+          </m:sSubPr>
+          <m:e>
+            <m:r>
+              <w:rPr>
+                <w:rFonts w:ascii="Cambria Math" w:eastAsia="Times New Roman" w:hAnsi="Cambria Math" w:cs="Times New Roman"/>
+                <w:sz w:val="24"/>
+                <w:szCs w:val="24"/>
+                <w:lang w:eastAsia="ru-RU"/>
+              </w:rPr>
+              <m:t>R</m:t>
+            </m:r>
+          </m:e>
+          <m:sub>
+            <m:r>
+              <m:rPr>
+                <m:nor/>
+              </m:rPr>
+              <w:rPr>
+                <w:rFonts w:ascii="Times New Roman" w:eastAsia="Times New Roman" w:hAnsi="Times New Roman" w:cs="Times New Roman"/>
+                <w:sz w:val="24"/>
+                <w:szCs w:val="24"/>
+                <w:lang w:eastAsia="ru-RU"/>
+              </w:rPr>
+              <m:t>ст</m:t>
+            </m:r>
+            <m:r>
+              <w:rPr>
+                <w:rFonts w:ascii="Cambria Math" w:eastAsia="Times New Roman" w:hAnsi="Cambria Math" w:cs="Times New Roman"/>
+                <w:sz w:val="24"/>
+                <w:szCs w:val="24"/>
+                <w:lang w:eastAsia="ru-RU"/>
+              </w:rPr>
+              <m:t>3</m:t>
+            </m:r>
+          </m:sub>
+        </m:sSub>
+      </m:oMath>
+      <w:r>
+        <w:rPr>
+          <w:rFonts w:ascii="Times New Roman" w:eastAsia="Times New Roman" w:hAnsi="Times New Roman" w:cs="Times New Roman"/>
+          <w:b/>
+          <w:bCs/>
+          <w:sz w:val="24"/>
+          <w:szCs w:val="24"/>
+          <w:lang w:eastAsia="ru-RU"/>
+        </w:rPr>
+        <w:t>:</w:t>
       </w:r>
     </w:p>
     <w:p>
@@ -3644,7 +5633,7 @@
           <w:rFonts w:ascii="Times New Roman" w:eastAsia="Times New Roman" w:hAnsi="Times New Roman" w:cs="Times New Roman"/>
           <w:sz w:val="24"/>
           <w:szCs w:val="24"/>
-          <w:lang w:eastAsia="ru-RU"/>
+          <w:lang w:val="en-US" w:eastAsia="ru-RU"/>
         </w:rPr>
       </w:pPr>
       <m:oMathPara>
@@ -3716,26 +5705,76 @@
               </m:ctrlPr>
             </m:fPr>
             <m:num>
-              <m:r>
-                <w:rPr>
-                  <w:rFonts w:ascii="Cambria Math" w:eastAsia="Times New Roman" w:hAnsi="Cambria Math" w:cs="Times New Roman"/>
-                  <w:sz w:val="24"/>
-                  <w:szCs w:val="24"/>
-                  <w:lang w:eastAsia="ru-RU"/>
-                </w:rPr>
-                <m:t>U5</m:t>
-              </m:r>
+              <m:sSub>
+                <m:sSubPr>
+                  <m:ctrlPr>
+                    <w:rPr>
+                      <w:rFonts w:ascii="Cambria Math" w:eastAsia="Times New Roman" w:hAnsi="Cambria Math" w:cs="Times New Roman"/>
+                      <w:sz w:val="24"/>
+                      <w:szCs w:val="24"/>
+                      <w:lang w:eastAsia="ru-RU"/>
+                    </w:rPr>
+                  </m:ctrlPr>
+                </m:sSubPr>
+                <m:e>
+                  <m:r>
+                    <w:rPr>
+                      <w:rFonts w:ascii="Cambria Math" w:eastAsia="Times New Roman" w:hAnsi="Cambria Math" w:cs="Times New Roman"/>
+                      <w:sz w:val="24"/>
+                      <w:szCs w:val="24"/>
+                      <w:lang w:eastAsia="ru-RU"/>
+                    </w:rPr>
+                    <m:t>U</m:t>
+                  </m:r>
+                </m:e>
+                <m:sub>
+                  <m:r>
+                    <w:rPr>
+                      <w:rFonts w:ascii="Cambria Math" w:eastAsia="Times New Roman" w:hAnsi="Cambria Math" w:cs="Times New Roman"/>
+                      <w:sz w:val="24"/>
+                      <w:szCs w:val="24"/>
+                      <w:lang w:eastAsia="ru-RU"/>
+                    </w:rPr>
+                    <m:t>5</m:t>
+                  </m:r>
+                </m:sub>
+              </m:sSub>
             </m:num>
             <m:den>
-              <m:r>
-                <w:rPr>
-                  <w:rFonts w:ascii="Cambria Math" w:eastAsia="Times New Roman" w:hAnsi="Cambria Math" w:cs="Times New Roman"/>
-                  <w:sz w:val="24"/>
-                  <w:szCs w:val="24"/>
-                  <w:lang w:eastAsia="ru-RU"/>
-                </w:rPr>
-                <m:t>I0</m:t>
-              </m:r>
+              <m:sSub>
+                <m:sSubPr>
+                  <m:ctrlPr>
+                    <w:rPr>
+                      <w:rFonts w:ascii="Cambria Math" w:eastAsia="Times New Roman" w:hAnsi="Cambria Math" w:cs="Times New Roman"/>
+                      <w:sz w:val="24"/>
+                      <w:szCs w:val="24"/>
+                      <w:lang w:eastAsia="ru-RU"/>
+                    </w:rPr>
+                  </m:ctrlPr>
+                </m:sSubPr>
+                <m:e>
+                  <m:r>
+                    <w:rPr>
+                      <w:rFonts w:ascii="Cambria Math" w:eastAsia="Times New Roman" w:hAnsi="Cambria Math" w:cs="Times New Roman"/>
+                      <w:sz w:val="24"/>
+                      <w:szCs w:val="24"/>
+                      <w:lang w:eastAsia="ru-RU"/>
+                    </w:rPr>
+                    <m:t>I</m:t>
+                  </m:r>
+                </m:e>
+                <m:sub>
+                  <m:r>
+                    <w:rPr>
+                      <w:rFonts w:ascii="Cambria Math" w:eastAsia="Times New Roman" w:hAnsi="Cambria Math" w:cs="Times New Roman"/>
+                      <w:sz w:val="24"/>
+                      <w:szCs w:val="24"/>
+                      <w:lang w:eastAsia="ru-RU"/>
+                    </w:rPr>
+                    <m:t>0</m:t>
+                  </m:r>
+                </m:sub>
+              </m:sSub>
             </m:den>
           </m:f>
           <m:r>
@@ -3767,6 +5806,18 @@
                   <w:lang w:eastAsia="ru-RU"/>
                 </w:rPr>
                 <m:t>14</m:t>
+              </m:r>
+              <m:r>
+                <m:rPr>
+                  <m:nor/>
+                </m:rPr>
+                <w:rPr>
+                  <w:rFonts w:ascii="Times New Roman" w:eastAsia="Times New Roman" w:hAnsi="Times New Roman" w:cs="Times New Roman"/>
+                  <w:sz w:val="24"/>
+                  <w:szCs w:val="24"/>
+                  <w:lang w:eastAsia="ru-RU"/>
+                </w:rPr>
+                <m:t> В</m:t>
               </m:r>
             </m:num>
             <m:den>
@@ -3813,6 +5864,18 @@
                   </m:r>
                 </m:sup>
               </m:sSup>
+              <m:r>
+                <m:rPr>
+                  <m:nor/>
+                </m:rPr>
+                <w:rPr>
+                  <w:rFonts w:ascii="Times New Roman" w:eastAsia="Times New Roman" w:hAnsi="Times New Roman" w:cs="Times New Roman"/>
+                  <w:sz w:val="24"/>
+                  <w:szCs w:val="24"/>
+                  <w:lang w:eastAsia="ru-RU"/>
+                </w:rPr>
+                <m:t> А</m:t>
+              </m:r>
             </m:den>
           </m:f>
           <m:r>
@@ -3870,63 +5933,6 @@
             </w:rPr>
             <m:t> Ом</m:t>
           </m:r>
-          <m:r>
-            <w:rPr>
-              <w:rFonts w:ascii="Times New Roman" w:eastAsia="Times New Roman" w:hAnsi="Times New Roman" w:cs="Times New Roman"/>
-              <w:sz w:val="24"/>
-              <w:szCs w:val="24"/>
-              <w:lang w:eastAsia="ru-RU"/>
-            </w:rPr>
-            <w:br/>
-          </m:r>
-        </m:oMath>
-        <m:oMath>
-          <m:sSub>
-            <m:sSubPr>
-              <m:ctrlPr>
-                <w:rPr>
-                  <w:rFonts w:ascii="Cambria Math" w:eastAsia="Times New Roman" w:hAnsi="Cambria Math" w:cs="Times New Roman"/>
-                  <w:sz w:val="24"/>
-                  <w:szCs w:val="24"/>
-                  <w:lang w:eastAsia="ru-RU"/>
-                </w:rPr>
-              </m:ctrlPr>
-            </m:sSubPr>
-            <m:e>
-              <m:r>
-                <w:rPr>
-                  <w:rFonts w:ascii="Cambria Math" w:eastAsia="Times New Roman" w:hAnsi="Cambria Math" w:cs="Times New Roman"/>
-                  <w:sz w:val="24"/>
-                  <w:szCs w:val="24"/>
-                  <w:lang w:eastAsia="ru-RU"/>
-                </w:rPr>
-                <m:t>R</m:t>
-              </m:r>
-            </m:e>
-            <m:sub>
-              <m:r>
-                <m:rPr>
-                  <m:nor/>
-                </m:rPr>
-                <w:rPr>
-                  <w:rFonts w:ascii="Times New Roman" w:eastAsia="Times New Roman" w:hAnsi="Times New Roman" w:cs="Times New Roman"/>
-                  <w:sz w:val="24"/>
-                  <w:szCs w:val="24"/>
-                  <w:lang w:eastAsia="ru-RU"/>
-                </w:rPr>
-                <m:t>ст</m:t>
-              </m:r>
-              <m:r>
-                <w:rPr>
-                  <w:rFonts w:ascii="Cambria Math" w:eastAsia="Times New Roman" w:hAnsi="Cambria Math" w:cs="Times New Roman"/>
-                  <w:sz w:val="24"/>
-                  <w:szCs w:val="24"/>
-                  <w:lang w:eastAsia="ru-RU"/>
-                </w:rPr>
-                <m:t>3</m:t>
-              </m:r>
-            </m:sub>
-          </m:sSub>
           <m:r>
             <w:rPr>
               <w:rFonts w:ascii="Cambria Math" w:eastAsia="Times New Roman" w:hAnsi="Cambria Math" w:cs="Times New Roman"/>
@@ -3948,76 +5954,12 @@
             </w:rPr>
             <m:t> МОм</m:t>
           </m:r>
-          <m:r>
-            <w:rPr>
-              <w:rFonts w:ascii="Cambria Math" w:eastAsia="Times New Roman" w:hAnsi="Cambria Math" w:cs="Times New Roman"/>
-              <w:sz w:val="24"/>
-              <w:szCs w:val="24"/>
-              <w:lang w:eastAsia="ru-RU"/>
-            </w:rPr>
-            <m:t>=7⋅</m:t>
-          </m:r>
-          <m:sSup>
-            <m:sSupPr>
-              <m:ctrlPr>
-                <w:rPr>
-                  <w:rFonts w:ascii="Cambria Math" w:eastAsia="Times New Roman" w:hAnsi="Cambria Math" w:cs="Times New Roman"/>
-                  <w:sz w:val="24"/>
-                  <w:szCs w:val="24"/>
-                  <w:lang w:eastAsia="ru-RU"/>
-                </w:rPr>
-              </m:ctrlPr>
-            </m:sSupPr>
-            <m:e>
-              <m:r>
-                <w:rPr>
-                  <w:rFonts w:ascii="Cambria Math" w:eastAsia="Times New Roman" w:hAnsi="Cambria Math" w:cs="Times New Roman"/>
-                  <w:sz w:val="24"/>
-                  <w:szCs w:val="24"/>
-                  <w:lang w:eastAsia="ru-RU"/>
-                </w:rPr>
-                <m:t>10</m:t>
-              </m:r>
-            </m:e>
-            <m:sup>
-              <m:r>
-                <w:rPr>
-                  <w:rFonts w:ascii="Cambria Math" w:eastAsia="Times New Roman" w:hAnsi="Cambria Math" w:cs="Times New Roman"/>
-                  <w:sz w:val="24"/>
-                  <w:szCs w:val="24"/>
-                  <w:lang w:eastAsia="ru-RU"/>
-                </w:rPr>
-                <m:t>4</m:t>
-              </m:r>
-            </m:sup>
-          </m:sSup>
-          <m:r>
-            <m:rPr>
-              <m:nor/>
-            </m:rPr>
-            <w:rPr>
-              <w:rFonts w:ascii="Times New Roman" w:eastAsia="Times New Roman" w:hAnsi="Times New Roman" w:cs="Times New Roman"/>
-              <w:sz w:val="24"/>
-              <w:szCs w:val="24"/>
-              <w:lang w:eastAsia="ru-RU"/>
-            </w:rPr>
-            <m:t> кОм</m:t>
-          </m:r>
-          <m:r>
-            <w:rPr>
-              <w:rFonts w:ascii="Times New Roman" w:eastAsia="Times New Roman" w:hAnsi="Times New Roman" w:cs="Times New Roman"/>
-              <w:sz w:val="24"/>
-              <w:szCs w:val="24"/>
-              <w:lang w:eastAsia="ru-RU"/>
-            </w:rPr>
-            <w:br/>
-          </m:r>
         </m:oMath>
       </m:oMathPara>
     </w:p>
     <w:p>
       <w:pPr>
-        <w:spacing w:after="0" w:line="240" w:lineRule="auto"/>
+        <w:spacing w:before="100" w:beforeAutospacing="1" w:after="100" w:afterAutospacing="1" w:line="240" w:lineRule="auto"/>
         <w:rPr>
           <w:rFonts w:ascii="Times New Roman" w:eastAsia="Times New Roman" w:hAnsi="Times New Roman" w:cs="Times New Roman"/>
           <w:sz w:val="24"/>
@@ -4025,17 +5967,26 @@
           <w:lang w:eastAsia="ru-RU"/>
         </w:rPr>
       </w:pPr>
+      <w:r>
+        <w:rPr>
+          <w:rFonts w:ascii="Times New Roman" w:eastAsia="Times New Roman" w:hAnsi="Times New Roman" w:cs="Times New Roman"/>
+          <w:sz w:val="24"/>
+          <w:szCs w:val="24"/>
+          <w:lang w:eastAsia="ru-RU"/>
+        </w:rPr>
+        <w:t>В обратной ветви статическое и динамическое сопротивления равны (так как ВАХ линейна в данной области).</w:t>
+      </w:r>
     </w:p>
     <w:p>
       <w:pPr>
         <w:spacing w:before="100" w:beforeAutospacing="1" w:after="100" w:afterAutospacing="1" w:line="240" w:lineRule="auto"/>
-        <w:outlineLvl w:val="1"/>
+        <w:outlineLvl w:val="3"/>
         <w:rPr>
           <w:rFonts w:ascii="Times New Roman" w:eastAsia="Times New Roman" w:hAnsi="Times New Roman" w:cs="Times New Roman"/>
           <w:b/>
           <w:bCs/>
-          <w:sz w:val="36"/>
-          <w:szCs w:val="36"/>
+          <w:sz w:val="24"/>
+          <w:szCs w:val="24"/>
           <w:lang w:eastAsia="ru-RU"/>
         </w:rPr>
       </w:pPr>
@@ -4044,11 +5995,241 @@
           <w:rFonts w:ascii="Times New Roman" w:eastAsia="Times New Roman" w:hAnsi="Times New Roman" w:cs="Times New Roman"/>
           <w:b/>
           <w:bCs/>
-          <w:sz w:val="36"/>
-          <w:szCs w:val="36"/>
+          <w:sz w:val="24"/>
+          <w:szCs w:val="24"/>
           <w:lang w:eastAsia="ru-RU"/>
         </w:rPr>
-        <w:t>Расчёт статического и динамического сопротивления в РТ4:</w:t>
+        <w:t>Расчет параметров в режиме пробоя (4-й квадрант)</w:t>
+      </w:r>
+    </w:p>
+    <w:p>
+      <w:pPr>
+        <w:spacing w:before="100" w:beforeAutospacing="1" w:after="100" w:afterAutospacing="1" w:line="240" w:lineRule="auto"/>
+        <w:rPr>
+          <w:rFonts w:ascii="Times New Roman" w:eastAsia="Times New Roman" w:hAnsi="Times New Roman" w:cs="Times New Roman"/>
+          <w:sz w:val="24"/>
+          <w:szCs w:val="24"/>
+          <w:lang w:eastAsia="ru-RU"/>
+        </w:rPr>
+      </w:pPr>
+      <w:r>
+        <w:rPr>
+          <w:rFonts w:ascii="Times New Roman" w:eastAsia="Times New Roman" w:hAnsi="Times New Roman" w:cs="Times New Roman"/>
+          <w:b/>
+          <w:bCs/>
+          <w:sz w:val="24"/>
+          <w:szCs w:val="24"/>
+          <w:lang w:eastAsia="ru-RU"/>
+        </w:rPr>
+        <w:t>PT4:</w:t>
+      </w:r>
+      <w:r>
+        <w:rPr>
+          <w:rFonts w:ascii="Times New Roman" w:eastAsia="Times New Roman" w:hAnsi="Times New Roman" w:cs="Times New Roman"/>
+          <w:sz w:val="24"/>
+          <w:szCs w:val="24"/>
+          <w:lang w:eastAsia="ru-RU"/>
+        </w:rPr>
+        <w:t xml:space="preserve"> точка задана напряжением стабилизации </w:t>
+      </w:r>
+      <m:oMath>
+        <m:sSub>
+          <m:sSubPr>
+            <m:ctrlPr>
+              <w:rPr>
+                <w:rFonts w:ascii="Cambria Math" w:eastAsia="Times New Roman" w:hAnsi="Cambria Math" w:cs="Times New Roman"/>
+                <w:sz w:val="24"/>
+                <w:szCs w:val="24"/>
+                <w:lang w:eastAsia="ru-RU"/>
+              </w:rPr>
+            </m:ctrlPr>
+          </m:sSubPr>
+          <m:e>
+            <m:r>
+              <w:rPr>
+                <w:rFonts w:ascii="Cambria Math" w:eastAsia="Times New Roman" w:hAnsi="Cambria Math" w:cs="Times New Roman"/>
+                <w:sz w:val="24"/>
+                <w:szCs w:val="24"/>
+                <w:lang w:eastAsia="ru-RU"/>
+              </w:rPr>
+              <m:t>U</m:t>
+            </m:r>
+          </m:e>
+          <m:sub>
+            <m:r>
+              <m:rPr>
+                <m:nor/>
+              </m:rPr>
+              <w:rPr>
+                <w:rFonts w:ascii="Times New Roman" w:eastAsia="Times New Roman" w:hAnsi="Times New Roman" w:cs="Times New Roman"/>
+                <w:sz w:val="24"/>
+                <w:szCs w:val="24"/>
+                <w:lang w:eastAsia="ru-RU"/>
+              </w:rPr>
+              <m:t>ст</m:t>
+            </m:r>
+            <m:r>
+              <w:rPr>
+                <w:rFonts w:ascii="Cambria Math" w:eastAsia="Times New Roman" w:hAnsi="Cambria Math" w:cs="Times New Roman"/>
+                <w:sz w:val="24"/>
+                <w:szCs w:val="24"/>
+                <w:lang w:eastAsia="ru-RU"/>
+              </w:rPr>
+              <m:t>6</m:t>
+            </m:r>
+          </m:sub>
+        </m:sSub>
+        <m:r>
+          <w:rPr>
+            <w:rFonts w:ascii="Cambria Math" w:eastAsia="Times New Roman" w:hAnsi="Cambria Math" w:cs="Times New Roman"/>
+            <w:sz w:val="24"/>
+            <w:szCs w:val="24"/>
+            <w:lang w:eastAsia="ru-RU"/>
+          </w:rPr>
+          <m:t>=5.6</m:t>
+        </m:r>
+      </m:oMath>
+      <w:r>
+        <w:rPr>
+          <w:rFonts w:ascii="Times New Roman" w:eastAsia="Times New Roman" w:hAnsi="Times New Roman" w:cs="Times New Roman"/>
+          <w:sz w:val="24"/>
+          <w:szCs w:val="24"/>
+          <w:lang w:eastAsia="ru-RU"/>
+        </w:rPr>
+        <w:t xml:space="preserve">В и током </w:t>
+      </w:r>
+      <m:oMath>
+        <m:sSub>
+          <m:sSubPr>
+            <m:ctrlPr>
+              <w:rPr>
+                <w:rFonts w:ascii="Cambria Math" w:eastAsia="Times New Roman" w:hAnsi="Cambria Math" w:cs="Times New Roman"/>
+                <w:sz w:val="24"/>
+                <w:szCs w:val="24"/>
+                <w:lang w:eastAsia="ru-RU"/>
+              </w:rPr>
+            </m:ctrlPr>
+          </m:sSubPr>
+          <m:e>
+            <m:r>
+              <w:rPr>
+                <w:rFonts w:ascii="Cambria Math" w:eastAsia="Times New Roman" w:hAnsi="Cambria Math" w:cs="Times New Roman"/>
+                <w:sz w:val="24"/>
+                <w:szCs w:val="24"/>
+                <w:lang w:eastAsia="ru-RU"/>
+              </w:rPr>
+              <m:t>I</m:t>
+            </m:r>
+          </m:e>
+          <m:sub>
+            <m:r>
+              <w:rPr>
+                <w:rFonts w:ascii="Cambria Math" w:eastAsia="Times New Roman" w:hAnsi="Cambria Math" w:cs="Times New Roman"/>
+                <w:sz w:val="24"/>
+                <w:szCs w:val="24"/>
+                <w:lang w:eastAsia="ru-RU"/>
+              </w:rPr>
+              <m:t>3</m:t>
+            </m:r>
+          </m:sub>
+        </m:sSub>
+        <m:r>
+          <w:rPr>
+            <w:rFonts w:ascii="Cambria Math" w:eastAsia="Times New Roman" w:hAnsi="Cambria Math" w:cs="Times New Roman"/>
+            <w:sz w:val="24"/>
+            <w:szCs w:val="24"/>
+            <w:lang w:eastAsia="ru-RU"/>
+          </w:rPr>
+          <m:t>=7</m:t>
+        </m:r>
+      </m:oMath>
+      <w:r>
+        <w:rPr>
+          <w:rFonts w:ascii="Times New Roman" w:eastAsia="Times New Roman" w:hAnsi="Times New Roman" w:cs="Times New Roman"/>
+          <w:sz w:val="24"/>
+          <w:szCs w:val="24"/>
+          <w:lang w:eastAsia="ru-RU"/>
+        </w:rPr>
+        <w:t>мА.</w:t>
+      </w:r>
+      <w:r>
+        <w:rPr>
+          <w:rFonts w:ascii="Times New Roman" w:eastAsia="Times New Roman" w:hAnsi="Times New Roman" w:cs="Times New Roman"/>
+          <w:sz w:val="24"/>
+          <w:szCs w:val="24"/>
+          <w:lang w:eastAsia="ru-RU"/>
+        </w:rPr>
+        <w:br/>
+      </w:r>
+      <w:r>
+        <w:rPr>
+          <w:rFonts w:ascii="Times New Roman" w:eastAsia="Times New Roman" w:hAnsi="Times New Roman" w:cs="Times New Roman"/>
+          <w:b/>
+          <w:bCs/>
+          <w:sz w:val="24"/>
+          <w:szCs w:val="24"/>
+          <w:lang w:eastAsia="ru-RU"/>
+        </w:rPr>
+        <w:t xml:space="preserve">Статическое сопротивление </w:t>
+      </w:r>
+      <m:oMath>
+        <m:sSub>
+          <m:sSubPr>
+            <m:ctrlPr>
+              <w:rPr>
+                <w:rFonts w:ascii="Cambria Math" w:eastAsia="Times New Roman" w:hAnsi="Cambria Math" w:cs="Times New Roman"/>
+                <w:sz w:val="24"/>
+                <w:szCs w:val="24"/>
+                <w:lang w:eastAsia="ru-RU"/>
+              </w:rPr>
+            </m:ctrlPr>
+          </m:sSubPr>
+          <m:e>
+            <m:r>
+              <w:rPr>
+                <w:rFonts w:ascii="Cambria Math" w:eastAsia="Times New Roman" w:hAnsi="Cambria Math" w:cs="Times New Roman"/>
+                <w:sz w:val="24"/>
+                <w:szCs w:val="24"/>
+                <w:lang w:eastAsia="ru-RU"/>
+              </w:rPr>
+              <m:t>R</m:t>
+            </m:r>
+          </m:e>
+          <m:sub>
+            <m:r>
+              <m:rPr>
+                <m:nor/>
+              </m:rPr>
+              <w:rPr>
+                <w:rFonts w:ascii="Times New Roman" w:eastAsia="Times New Roman" w:hAnsi="Times New Roman" w:cs="Times New Roman"/>
+                <w:sz w:val="24"/>
+                <w:szCs w:val="24"/>
+                <w:lang w:eastAsia="ru-RU"/>
+              </w:rPr>
+              <m:t>ст</m:t>
+            </m:r>
+            <m:r>
+              <w:rPr>
+                <w:rFonts w:ascii="Cambria Math" w:eastAsia="Times New Roman" w:hAnsi="Cambria Math" w:cs="Times New Roman"/>
+                <w:sz w:val="24"/>
+                <w:szCs w:val="24"/>
+                <w:lang w:eastAsia="ru-RU"/>
+              </w:rPr>
+              <m:t>4</m:t>
+            </m:r>
+          </m:sub>
+        </m:sSub>
+      </m:oMath>
+      <w:r>
+        <w:rPr>
+          <w:rFonts w:ascii="Times New Roman" w:eastAsia="Times New Roman" w:hAnsi="Times New Roman" w:cs="Times New Roman"/>
+          <w:b/>
+          <w:bCs/>
+          <w:sz w:val="24"/>
+          <w:szCs w:val="24"/>
+          <w:lang w:eastAsia="ru-RU"/>
+        </w:rPr>
+        <w:t>:</w:t>
       </w:r>
     </w:p>
     <w:p>
@@ -4058,7 +6239,7 @@
           <w:rFonts w:ascii="Times New Roman" w:eastAsia="Times New Roman" w:hAnsi="Times New Roman" w:cs="Times New Roman"/>
           <w:sz w:val="24"/>
           <w:szCs w:val="24"/>
-          <w:lang w:eastAsia="ru-RU"/>
+          <w:lang w:val="en-US" w:eastAsia="ru-RU"/>
         </w:rPr>
       </w:pPr>
       <m:oMathPara>
@@ -4130,38 +6311,88 @@
               </m:ctrlPr>
             </m:fPr>
             <m:num>
-              <m:r>
-                <w:rPr>
-                  <w:rFonts w:ascii="Cambria Math" w:eastAsia="Times New Roman" w:hAnsi="Cambria Math" w:cs="Times New Roman"/>
-                  <w:sz w:val="24"/>
-                  <w:szCs w:val="24"/>
-                  <w:lang w:eastAsia="ru-RU"/>
-                </w:rPr>
-                <m:t>U</m:t>
-              </m:r>
-              <m:r>
-                <m:rPr>
-                  <m:nor/>
-                </m:rPr>
-                <w:rPr>
-                  <w:rFonts w:ascii="Times New Roman" w:eastAsia="Times New Roman" w:hAnsi="Times New Roman" w:cs="Times New Roman"/>
-                  <w:sz w:val="24"/>
-                  <w:szCs w:val="24"/>
-                  <w:lang w:eastAsia="ru-RU"/>
-                </w:rPr>
-                <m:t>стб</m:t>
-              </m:r>
+              <m:sSub>
+                <m:sSubPr>
+                  <m:ctrlPr>
+                    <w:rPr>
+                      <w:rFonts w:ascii="Cambria Math" w:eastAsia="Times New Roman" w:hAnsi="Cambria Math" w:cs="Times New Roman"/>
+                      <w:sz w:val="24"/>
+                      <w:szCs w:val="24"/>
+                      <w:lang w:eastAsia="ru-RU"/>
+                    </w:rPr>
+                  </m:ctrlPr>
+                </m:sSubPr>
+                <m:e>
+                  <m:r>
+                    <w:rPr>
+                      <w:rFonts w:ascii="Cambria Math" w:eastAsia="Times New Roman" w:hAnsi="Cambria Math" w:cs="Times New Roman"/>
+                      <w:sz w:val="24"/>
+                      <w:szCs w:val="24"/>
+                      <w:lang w:eastAsia="ru-RU"/>
+                    </w:rPr>
+                    <m:t>U</m:t>
+                  </m:r>
+                </m:e>
+                <m:sub>
+                  <m:r>
+                    <m:rPr>
+                      <m:nor/>
+                    </m:rPr>
+                    <w:rPr>
+                      <w:rFonts w:ascii="Times New Roman" w:eastAsia="Times New Roman" w:hAnsi="Times New Roman" w:cs="Times New Roman"/>
+                      <w:sz w:val="24"/>
+                      <w:szCs w:val="24"/>
+                      <w:lang w:eastAsia="ru-RU"/>
+                    </w:rPr>
+                    <m:t>ст</m:t>
+                  </m:r>
+                  <m:r>
+                    <w:rPr>
+                      <w:rFonts w:ascii="Cambria Math" w:eastAsia="Times New Roman" w:hAnsi="Cambria Math" w:cs="Times New Roman"/>
+                      <w:sz w:val="24"/>
+                      <w:szCs w:val="24"/>
+                      <w:lang w:eastAsia="ru-RU"/>
+                    </w:rPr>
+                    <m:t>6</m:t>
+                  </m:r>
+                </m:sub>
+              </m:sSub>
             </m:num>
             <m:den>
-              <m:r>
-                <w:rPr>
-                  <w:rFonts w:ascii="Cambria Math" w:eastAsia="Times New Roman" w:hAnsi="Cambria Math" w:cs="Times New Roman"/>
-                  <w:sz w:val="24"/>
-                  <w:szCs w:val="24"/>
-                  <w:lang w:eastAsia="ru-RU"/>
-                </w:rPr>
-                <m:t>I3</m:t>
-              </m:r>
+              <m:sSub>
+                <m:sSubPr>
+                  <m:ctrlPr>
+                    <w:rPr>
+                      <w:rFonts w:ascii="Cambria Math" w:eastAsia="Times New Roman" w:hAnsi="Cambria Math" w:cs="Times New Roman"/>
+                      <w:sz w:val="24"/>
+                      <w:szCs w:val="24"/>
+                      <w:lang w:eastAsia="ru-RU"/>
+                    </w:rPr>
+                  </m:ctrlPr>
+                </m:sSubPr>
+                <m:e>
+                  <m:r>
+                    <w:rPr>
+                      <w:rFonts w:ascii="Cambria Math" w:eastAsia="Times New Roman" w:hAnsi="Cambria Math" w:cs="Times New Roman"/>
+                      <w:sz w:val="24"/>
+                      <w:szCs w:val="24"/>
+                      <w:lang w:eastAsia="ru-RU"/>
+                    </w:rPr>
+                    <m:t>I</m:t>
+                  </m:r>
+                </m:e>
+                <m:sub>
+                  <m:r>
+                    <w:rPr>
+                      <w:rFonts w:ascii="Cambria Math" w:eastAsia="Times New Roman" w:hAnsi="Cambria Math" w:cs="Times New Roman"/>
+                      <w:sz w:val="24"/>
+                      <w:szCs w:val="24"/>
+                      <w:lang w:eastAsia="ru-RU"/>
+                    </w:rPr>
+                    <m:t>3</m:t>
+                  </m:r>
+                </m:sub>
+              </m:sSub>
             </m:den>
           </m:f>
           <m:r>
@@ -4193,6 +6424,18 @@
                   <w:lang w:eastAsia="ru-RU"/>
                 </w:rPr>
                 <m:t>5.6</m:t>
+              </m:r>
+              <m:r>
+                <m:rPr>
+                  <m:nor/>
+                </m:rPr>
+                <w:rPr>
+                  <w:rFonts w:ascii="Times New Roman" w:eastAsia="Times New Roman" w:hAnsi="Times New Roman" w:cs="Times New Roman"/>
+                  <w:sz w:val="24"/>
+                  <w:szCs w:val="24"/>
+                  <w:lang w:eastAsia="ru-RU"/>
+                </w:rPr>
+                <m:t> В</m:t>
               </m:r>
             </m:num>
             <m:den>
@@ -4239,6 +6482,18 @@
                   </m:r>
                 </m:sup>
               </m:sSup>
+              <m:r>
+                <m:rPr>
+                  <m:nor/>
+                </m:rPr>
+                <w:rPr>
+                  <w:rFonts w:ascii="Times New Roman" w:eastAsia="Times New Roman" w:hAnsi="Times New Roman" w:cs="Times New Roman"/>
+                  <w:sz w:val="24"/>
+                  <w:szCs w:val="24"/>
+                  <w:lang w:eastAsia="ru-RU"/>
+                </w:rPr>
+                <m:t> А</m:t>
+              </m:r>
             </m:den>
           </m:f>
           <m:r>
@@ -4283,21 +6538,12 @@
             </w:rPr>
             <m:t> кОм</m:t>
           </m:r>
-          <m:r>
-            <w:rPr>
-              <w:rFonts w:ascii="Times New Roman" w:eastAsia="Times New Roman" w:hAnsi="Times New Roman" w:cs="Times New Roman"/>
-              <w:sz w:val="24"/>
-              <w:szCs w:val="24"/>
-              <w:lang w:eastAsia="ru-RU"/>
-            </w:rPr>
-            <w:br/>
-          </m:r>
         </m:oMath>
       </m:oMathPara>
     </w:p>
     <w:p>
       <w:pPr>
-        <w:spacing w:after="0" w:line="240" w:lineRule="auto"/>
+        <w:spacing w:before="100" w:beforeAutospacing="1" w:after="100" w:afterAutospacing="1" w:line="240" w:lineRule="auto"/>
         <w:rPr>
           <w:rFonts w:ascii="Times New Roman" w:eastAsia="Times New Roman" w:hAnsi="Times New Roman" w:cs="Times New Roman"/>
           <w:sz w:val="24"/>
@@ -4305,6 +6551,208 @@
           <w:lang w:eastAsia="ru-RU"/>
         </w:rPr>
       </w:pPr>
+      <w:r>
+        <w:rPr>
+          <w:rFonts w:ascii="Times New Roman" w:eastAsia="Times New Roman" w:hAnsi="Times New Roman" w:cs="Times New Roman"/>
+          <w:b/>
+          <w:bCs/>
+          <w:sz w:val="24"/>
+          <w:szCs w:val="24"/>
+          <w:lang w:eastAsia="ru-RU"/>
+        </w:rPr>
+        <w:t xml:space="preserve">Динамическое сопротивление </w:t>
+      </w:r>
+      <m:oMath>
+        <m:sSub>
+          <m:sSubPr>
+            <m:ctrlPr>
+              <w:rPr>
+                <w:rFonts w:ascii="Cambria Math" w:eastAsia="Times New Roman" w:hAnsi="Cambria Math" w:cs="Times New Roman"/>
+                <w:sz w:val="24"/>
+                <w:szCs w:val="24"/>
+                <w:lang w:eastAsia="ru-RU"/>
+              </w:rPr>
+            </m:ctrlPr>
+          </m:sSubPr>
+          <m:e>
+            <m:r>
+              <w:rPr>
+                <w:rFonts w:ascii="Cambria Math" w:eastAsia="Times New Roman" w:hAnsi="Cambria Math" w:cs="Times New Roman"/>
+                <w:sz w:val="24"/>
+                <w:szCs w:val="24"/>
+                <w:lang w:eastAsia="ru-RU"/>
+              </w:rPr>
+              <m:t>R</m:t>
+            </m:r>
+          </m:e>
+          <m:sub>
+            <m:r>
+              <m:rPr>
+                <m:nor/>
+              </m:rPr>
+              <w:rPr>
+                <w:rFonts w:ascii="Times New Roman" w:eastAsia="Times New Roman" w:hAnsi="Times New Roman" w:cs="Times New Roman"/>
+                <w:sz w:val="24"/>
+                <w:szCs w:val="24"/>
+                <w:lang w:eastAsia="ru-RU"/>
+              </w:rPr>
+              <m:t>д</m:t>
+            </m:r>
+            <m:r>
+              <w:rPr>
+                <w:rFonts w:ascii="Cambria Math" w:eastAsia="Times New Roman" w:hAnsi="Cambria Math" w:cs="Times New Roman"/>
+                <w:sz w:val="24"/>
+                <w:szCs w:val="24"/>
+                <w:lang w:eastAsia="ru-RU"/>
+              </w:rPr>
+              <m:t>4</m:t>
+            </m:r>
+          </m:sub>
+        </m:sSub>
+      </m:oMath>
+      <w:r>
+        <w:rPr>
+          <w:rFonts w:ascii="Times New Roman" w:eastAsia="Times New Roman" w:hAnsi="Times New Roman" w:cs="Times New Roman"/>
+          <w:b/>
+          <w:bCs/>
+          <w:sz w:val="24"/>
+          <w:szCs w:val="24"/>
+          <w:lang w:eastAsia="ru-RU"/>
+        </w:rPr>
+        <w:t>:</w:t>
+      </w:r>
+      <w:r>
+        <w:rPr>
+          <w:rFonts w:ascii="Times New Roman" w:eastAsia="Times New Roman" w:hAnsi="Times New Roman" w:cs="Times New Roman"/>
+          <w:sz w:val="24"/>
+          <w:szCs w:val="24"/>
+          <w:lang w:eastAsia="ru-RU"/>
+        </w:rPr>
+        <w:br/>
+        <w:t xml:space="preserve">Сначала найдем приращение напряжения </w:t>
+      </w:r>
+      <m:oMath>
+        <m:r>
+          <m:rPr>
+            <m:sty m:val="p"/>
+          </m:rPr>
+          <w:rPr>
+            <w:rFonts w:ascii="Cambria Math" w:eastAsia="Times New Roman" w:hAnsi="Cambria Math" w:cs="Times New Roman"/>
+            <w:sz w:val="24"/>
+            <w:szCs w:val="24"/>
+            <w:lang w:eastAsia="ru-RU"/>
+          </w:rPr>
+          <m:t>Δ</m:t>
+        </m:r>
+        <m:r>
+          <w:rPr>
+            <w:rFonts w:ascii="Cambria Math" w:eastAsia="Times New Roman" w:hAnsi="Cambria Math" w:cs="Times New Roman"/>
+            <w:sz w:val="24"/>
+            <w:szCs w:val="24"/>
+            <w:lang w:eastAsia="ru-RU"/>
+          </w:rPr>
+          <m:t>U</m:t>
+        </m:r>
+      </m:oMath>
+      <w:r>
+        <w:rPr>
+          <w:rFonts w:ascii="Times New Roman" w:eastAsia="Times New Roman" w:hAnsi="Times New Roman" w:cs="Times New Roman"/>
+          <w:sz w:val="24"/>
+          <w:szCs w:val="24"/>
+          <w:lang w:eastAsia="ru-RU"/>
+        </w:rPr>
+        <w:t xml:space="preserve">, соответствующее </w:t>
+      </w:r>
+      <m:oMath>
+        <m:r>
+          <m:rPr>
+            <m:sty m:val="p"/>
+          </m:rPr>
+          <w:rPr>
+            <w:rFonts w:ascii="Cambria Math" w:eastAsia="Times New Roman" w:hAnsi="Cambria Math" w:cs="Times New Roman"/>
+            <w:sz w:val="24"/>
+            <w:szCs w:val="24"/>
+            <w:lang w:eastAsia="ru-RU"/>
+          </w:rPr>
+          <m:t>Δ</m:t>
+        </m:r>
+        <m:sSub>
+          <m:sSubPr>
+            <m:ctrlPr>
+              <w:rPr>
+                <w:rFonts w:ascii="Cambria Math" w:eastAsia="Times New Roman" w:hAnsi="Cambria Math" w:cs="Times New Roman"/>
+                <w:sz w:val="24"/>
+                <w:szCs w:val="24"/>
+                <w:lang w:eastAsia="ru-RU"/>
+              </w:rPr>
+            </m:ctrlPr>
+          </m:sSubPr>
+          <m:e>
+            <m:r>
+              <w:rPr>
+                <w:rFonts w:ascii="Cambria Math" w:eastAsia="Times New Roman" w:hAnsi="Cambria Math" w:cs="Times New Roman"/>
+                <w:sz w:val="24"/>
+                <w:szCs w:val="24"/>
+                <w:lang w:eastAsia="ru-RU"/>
+              </w:rPr>
+              <m:t>U</m:t>
+            </m:r>
+          </m:e>
+          <m:sub>
+            <m:r>
+              <m:rPr>
+                <m:nor/>
+              </m:rPr>
+              <w:rPr>
+                <w:rFonts w:ascii="Times New Roman" w:eastAsia="Times New Roman" w:hAnsi="Times New Roman" w:cs="Times New Roman"/>
+                <w:sz w:val="24"/>
+                <w:szCs w:val="24"/>
+                <w:lang w:eastAsia="ru-RU"/>
+              </w:rPr>
+              <m:t>ст</m:t>
+            </m:r>
+            <m:r>
+              <w:rPr>
+                <w:rFonts w:ascii="Cambria Math" w:eastAsia="Times New Roman" w:hAnsi="Cambria Math" w:cs="Times New Roman"/>
+                <w:sz w:val="24"/>
+                <w:szCs w:val="24"/>
+                <w:lang w:eastAsia="ru-RU"/>
+              </w:rPr>
+              <m:t>6</m:t>
+            </m:r>
+          </m:sub>
+        </m:sSub>
+        <m:r>
+          <w:rPr>
+            <w:rFonts w:ascii="Cambria Math" w:eastAsia="Times New Roman" w:hAnsi="Cambria Math" w:cs="Times New Roman"/>
+            <w:sz w:val="24"/>
+            <w:szCs w:val="24"/>
+            <w:lang w:eastAsia="ru-RU"/>
+          </w:rPr>
+          <m:t>=0.8</m:t>
+        </m:r>
+        <m:r>
+          <m:rPr>
+            <m:sty m:val="p"/>
+          </m:rPr>
+          <w:rPr>
+            <w:rFonts w:ascii="Cambria Math" w:eastAsia="Times New Roman" w:hAnsi="Cambria Math" w:cs="Times New Roman"/>
+            <w:sz w:val="24"/>
+            <w:szCs w:val="24"/>
+            <w:lang w:eastAsia="ru-RU"/>
+          </w:rPr>
+          <m:t>%</m:t>
+        </m:r>
+      </m:oMath>
+      <w:r>
+        <w:rPr>
+          <w:rFonts w:ascii="Times New Roman" w:eastAsia="Times New Roman" w:hAnsi="Times New Roman" w:cs="Times New Roman"/>
+          <w:sz w:val="24"/>
+          <w:szCs w:val="24"/>
+          <w:lang w:eastAsia="ru-RU"/>
+        </w:rPr>
+        <w:t>:</w:t>
+      </w:r>
     </w:p>
     <w:p>
       <w:pPr>
@@ -4313,7 +6761,7 @@
           <w:rFonts w:ascii="Times New Roman" w:eastAsia="Times New Roman" w:hAnsi="Times New Roman" w:cs="Times New Roman"/>
           <w:sz w:val="24"/>
           <w:szCs w:val="24"/>
-          <w:lang w:eastAsia="ru-RU"/>
+          <w:lang w:val="en-US" w:eastAsia="ru-RU"/>
         </w:rPr>
       </w:pPr>
       <m:oMathPara>
@@ -4328,6 +6776,7 @@
               <w:szCs w:val="24"/>
               <w:lang w:eastAsia="ru-RU"/>
             </w:rPr>
+            <w:lastRenderedPageBreak/>
             <m:t>Δ</m:t>
           </m:r>
           <m:r>
@@ -4337,7 +6786,154 @@
               <w:szCs w:val="24"/>
               <w:lang w:eastAsia="ru-RU"/>
             </w:rPr>
-            <m:t>U=0.008⋅5.6=0.0448</m:t>
+            <m:t>U=</m:t>
+          </m:r>
+          <m:sSub>
+            <m:sSubPr>
+              <m:ctrlPr>
+                <w:rPr>
+                  <w:rFonts w:ascii="Cambria Math" w:eastAsia="Times New Roman" w:hAnsi="Cambria Math" w:cs="Times New Roman"/>
+                  <w:sz w:val="24"/>
+                  <w:szCs w:val="24"/>
+                  <w:lang w:eastAsia="ru-RU"/>
+                </w:rPr>
+              </m:ctrlPr>
+            </m:sSubPr>
+            <m:e>
+              <m:r>
+                <w:rPr>
+                  <w:rFonts w:ascii="Cambria Math" w:eastAsia="Times New Roman" w:hAnsi="Cambria Math" w:cs="Times New Roman"/>
+                  <w:sz w:val="24"/>
+                  <w:szCs w:val="24"/>
+                  <w:lang w:eastAsia="ru-RU"/>
+                </w:rPr>
+                <m:t>U</m:t>
+              </m:r>
+            </m:e>
+            <m:sub>
+              <m:r>
+                <m:rPr>
+                  <m:nor/>
+                </m:rPr>
+                <w:rPr>
+                  <w:rFonts w:ascii="Times New Roman" w:eastAsia="Times New Roman" w:hAnsi="Times New Roman" w:cs="Times New Roman"/>
+                  <w:sz w:val="24"/>
+                  <w:szCs w:val="24"/>
+                  <w:lang w:eastAsia="ru-RU"/>
+                </w:rPr>
+                <m:t>ст</m:t>
+              </m:r>
+              <m:r>
+                <w:rPr>
+                  <w:rFonts w:ascii="Cambria Math" w:eastAsia="Times New Roman" w:hAnsi="Cambria Math" w:cs="Times New Roman"/>
+                  <w:sz w:val="24"/>
+                  <w:szCs w:val="24"/>
+                  <w:lang w:eastAsia="ru-RU"/>
+                </w:rPr>
+                <m:t>6</m:t>
+              </m:r>
+            </m:sub>
+          </m:sSub>
+          <m:r>
+            <w:rPr>
+              <w:rFonts w:ascii="Cambria Math" w:eastAsia="Times New Roman" w:hAnsi="Cambria Math" w:cs="Times New Roman"/>
+              <w:sz w:val="24"/>
+              <w:szCs w:val="24"/>
+              <w:lang w:eastAsia="ru-RU"/>
+            </w:rPr>
+            <m:t>⋅</m:t>
+          </m:r>
+          <m:f>
+            <m:fPr>
+              <m:ctrlPr>
+                <w:rPr>
+                  <w:rFonts w:ascii="Cambria Math" w:eastAsia="Times New Roman" w:hAnsi="Cambria Math" w:cs="Times New Roman"/>
+                  <w:sz w:val="24"/>
+                  <w:szCs w:val="24"/>
+                  <w:lang w:eastAsia="ru-RU"/>
+                </w:rPr>
+              </m:ctrlPr>
+            </m:fPr>
+            <m:num>
+              <m:r>
+                <m:rPr>
+                  <m:sty m:val="p"/>
+                </m:rPr>
+                <w:rPr>
+                  <w:rFonts w:ascii="Cambria Math" w:eastAsia="Times New Roman" w:hAnsi="Cambria Math" w:cs="Times New Roman"/>
+                  <w:sz w:val="24"/>
+                  <w:szCs w:val="24"/>
+                  <w:lang w:eastAsia="ru-RU"/>
+                </w:rPr>
+                <m:t>Δ</m:t>
+              </m:r>
+              <m:sSub>
+                <m:sSubPr>
+                  <m:ctrlPr>
+                    <w:rPr>
+                      <w:rFonts w:ascii="Cambria Math" w:eastAsia="Times New Roman" w:hAnsi="Cambria Math" w:cs="Times New Roman"/>
+                      <w:sz w:val="24"/>
+                      <w:szCs w:val="24"/>
+                      <w:lang w:eastAsia="ru-RU"/>
+                    </w:rPr>
+                  </m:ctrlPr>
+                </m:sSubPr>
+                <m:e>
+                  <m:r>
+                    <w:rPr>
+                      <w:rFonts w:ascii="Cambria Math" w:eastAsia="Times New Roman" w:hAnsi="Cambria Math" w:cs="Times New Roman"/>
+                      <w:sz w:val="24"/>
+                      <w:szCs w:val="24"/>
+                      <w:lang w:eastAsia="ru-RU"/>
+                    </w:rPr>
+                    <m:t>U</m:t>
+                  </m:r>
+                </m:e>
+                <m:sub>
+                  <m:r>
+                    <m:rPr>
+                      <m:nor/>
+                    </m:rPr>
+                    <w:rPr>
+                      <w:rFonts w:ascii="Times New Roman" w:eastAsia="Times New Roman" w:hAnsi="Times New Roman" w:cs="Times New Roman"/>
+                      <w:sz w:val="24"/>
+                      <w:szCs w:val="24"/>
+                      <w:lang w:eastAsia="ru-RU"/>
+                    </w:rPr>
+                    <m:t>ст</m:t>
+                  </m:r>
+                  <m:r>
+                    <w:rPr>
+                      <w:rFonts w:ascii="Cambria Math" w:eastAsia="Times New Roman" w:hAnsi="Cambria Math" w:cs="Times New Roman"/>
+                      <w:sz w:val="24"/>
+                      <w:szCs w:val="24"/>
+                      <w:lang w:eastAsia="ru-RU"/>
+                    </w:rPr>
+                    <m:t>6</m:t>
+                  </m:r>
+                </m:sub>
+              </m:sSub>
+            </m:num>
+            <m:den>
+              <m:r>
+                <w:rPr>
+                  <w:rFonts w:ascii="Cambria Math" w:eastAsia="Times New Roman" w:hAnsi="Cambria Math" w:cs="Times New Roman"/>
+                  <w:sz w:val="24"/>
+                  <w:szCs w:val="24"/>
+                  <w:lang w:eastAsia="ru-RU"/>
+                </w:rPr>
+                <m:t>100</m:t>
+              </m:r>
+            </m:den>
+          </m:f>
+          <m:r>
+            <w:rPr>
+              <w:rFonts w:ascii="Cambria Math" w:eastAsia="Times New Roman" w:hAnsi="Cambria Math" w:cs="Times New Roman"/>
+              <w:sz w:val="24"/>
+              <w:szCs w:val="24"/>
+              <w:lang w:eastAsia="ru-RU"/>
+            </w:rPr>
+            <m:t>=5.6⋅0.008=0.0448</m:t>
           </m:r>
           <m:r>
             <m:rPr>
@@ -4349,18 +6945,38 @@
               <w:szCs w:val="24"/>
               <w:lang w:eastAsia="ru-RU"/>
             </w:rPr>
-            <m:t>В</m:t>
-          </m:r>
-          <m:r>
-            <w:rPr>
-              <w:rFonts w:ascii="Times New Roman" w:eastAsia="Times New Roman" w:hAnsi="Times New Roman" w:cs="Times New Roman"/>
-              <w:sz w:val="24"/>
-              <w:szCs w:val="24"/>
-              <w:lang w:eastAsia="ru-RU"/>
-            </w:rPr>
-            <w:br/>
+            <m:t> В</m:t>
           </m:r>
         </m:oMath>
+      </m:oMathPara>
+    </w:p>
+    <w:p>
+      <w:pPr>
+        <w:spacing w:before="100" w:beforeAutospacing="1" w:after="100" w:afterAutospacing="1" w:line="240" w:lineRule="auto"/>
+        <w:rPr>
+          <w:rFonts w:ascii="Times New Roman" w:eastAsia="Times New Roman" w:hAnsi="Times New Roman" w:cs="Times New Roman"/>
+          <w:sz w:val="24"/>
+          <w:szCs w:val="24"/>
+          <w:lang w:eastAsia="ru-RU"/>
+        </w:rPr>
+      </w:pPr>
+      <w:r>
+        <w:rPr>
+          <w:rFonts w:ascii="Times New Roman" w:eastAsia="Times New Roman" w:hAnsi="Times New Roman" w:cs="Times New Roman"/>
+          <w:sz w:val="24"/>
+          <w:szCs w:val="24"/>
+          <w:lang w:eastAsia="ru-RU"/>
+        </w:rPr>
+        <w:t>Динамическое сопротивление в зоне пробоя:</w:t>
+      </w:r>
+    </w:p>
+    <w:p>
+      <w:pPr>
+        <w:rPr>
+          <w:lang w:val="en-US" w:eastAsia="ru-RU"/>
+        </w:rPr>
+      </w:pPr>
+      <m:oMathPara>
         <m:oMath>
           <m:sSub>
             <m:sSubPr>
@@ -4452,15 +7068,40 @@
               </m:r>
             </m:num>
             <m:den>
-              <m:r>
-                <w:rPr>
-                  <w:rFonts w:ascii="Cambria Math" w:eastAsia="Times New Roman" w:hAnsi="Cambria Math" w:cs="Times New Roman"/>
-                  <w:sz w:val="24"/>
-                  <w:szCs w:val="24"/>
-                  <w:lang w:eastAsia="ru-RU"/>
-                </w:rPr>
-                <m:t>I3</m:t>
-              </m:r>
+              <m:sSub>
+                <m:sSubPr>
+                  <m:ctrlPr>
+                    <w:rPr>
+                      <w:rFonts w:ascii="Cambria Math" w:eastAsia="Times New Roman" w:hAnsi="Cambria Math" w:cs="Times New Roman"/>
+                      <w:sz w:val="24"/>
+                      <w:szCs w:val="24"/>
+                      <w:lang w:eastAsia="ru-RU"/>
+                    </w:rPr>
+                  </m:ctrlPr>
+                </m:sSubPr>
+                <m:e>
+                  <m:r>
+                    <w:rPr>
+                      <w:rFonts w:ascii="Cambria Math" w:eastAsia="Times New Roman" w:hAnsi="Cambria Math" w:cs="Times New Roman"/>
+                      <w:sz w:val="24"/>
+                      <w:szCs w:val="24"/>
+                      <w:lang w:eastAsia="ru-RU"/>
+                    </w:rPr>
+                    <m:t>I</m:t>
+                  </m:r>
+                </m:e>
+                <m:sub>
+                  <m:r>
+                    <w:rPr>
+                      <w:rFonts w:ascii="Cambria Math" w:eastAsia="Times New Roman" w:hAnsi="Cambria Math" w:cs="Times New Roman"/>
+                      <w:sz w:val="24"/>
+                      <w:szCs w:val="24"/>
+                      <w:lang w:eastAsia="ru-RU"/>
+                    </w:rPr>
+                    <m:t>3</m:t>
+                  </m:r>
+                </m:sub>
+              </m:sSub>
             </m:den>
           </m:f>
           <m:r>
@@ -4492,6 +7133,18 @@
                   <w:lang w:eastAsia="ru-RU"/>
                 </w:rPr>
                 <m:t>0.0448</m:t>
+              </m:r>
+              <m:r>
+                <m:rPr>
+                  <m:nor/>
+                </m:rPr>
+                <w:rPr>
+                  <w:rFonts w:ascii="Times New Roman" w:eastAsia="Times New Roman" w:hAnsi="Times New Roman" w:cs="Times New Roman"/>
+                  <w:sz w:val="24"/>
+                  <w:szCs w:val="24"/>
+                  <w:lang w:eastAsia="ru-RU"/>
+                </w:rPr>
+                <m:t> В</m:t>
               </m:r>
             </m:num>
             <m:den>
@@ -4538,6 +7191,18 @@
                   </m:r>
                 </m:sup>
               </m:sSup>
+              <m:r>
+                <m:rPr>
+                  <m:nor/>
+                </m:rPr>
+                <w:rPr>
+                  <w:rFonts w:ascii="Times New Roman" w:eastAsia="Times New Roman" w:hAnsi="Times New Roman" w:cs="Times New Roman"/>
+                  <w:sz w:val="24"/>
+                  <w:szCs w:val="24"/>
+                  <w:lang w:eastAsia="ru-RU"/>
+                </w:rPr>
+                <m:t> А</m:t>
+              </m:r>
             </m:den>
           </m:f>
           <m:r>
@@ -4582,28 +7247,8 @@
             </w:rPr>
             <m:t> кОм</m:t>
           </m:r>
-          <m:r>
-            <w:rPr>
-              <w:rFonts w:ascii="Times New Roman" w:eastAsia="Times New Roman" w:hAnsi="Times New Roman" w:cs="Times New Roman"/>
-              <w:sz w:val="24"/>
-              <w:szCs w:val="24"/>
-              <w:lang w:eastAsia="ru-RU"/>
-            </w:rPr>
-            <w:br/>
-          </m:r>
         </m:oMath>
       </m:oMathPara>
-    </w:p>
-    <w:p>
-      <w:pPr>
-        <w:spacing w:after="0" w:line="240" w:lineRule="auto"/>
-        <w:rPr>
-          <w:rFonts w:ascii="Times New Roman" w:eastAsia="Times New Roman" w:hAnsi="Times New Roman" w:cs="Times New Roman"/>
-          <w:sz w:val="24"/>
-          <w:szCs w:val="24"/>
-          <w:lang w:eastAsia="ru-RU"/>
-        </w:rPr>
-      </w:pPr>
     </w:p>
     <w:p>
       <w:pPr>
@@ -4638,13 +7283,13 @@
       </w:tblPr>
       <w:tblGrid>
         <w:gridCol w:w="1298"/>
-        <w:gridCol w:w="1283"/>
-        <w:gridCol w:w="1180"/>
-        <w:gridCol w:w="1283"/>
-        <w:gridCol w:w="1180"/>
-        <w:gridCol w:w="1283"/>
-        <w:gridCol w:w="1283"/>
-        <w:gridCol w:w="1180"/>
+        <w:gridCol w:w="1168"/>
+        <w:gridCol w:w="1099"/>
+        <w:gridCol w:w="1168"/>
+        <w:gridCol w:w="1099"/>
+        <w:gridCol w:w="1168"/>
+        <w:gridCol w:w="1168"/>
+        <w:gridCol w:w="1099"/>
       </w:tblGrid>
       <w:tr>
         <w:tc>
@@ -4701,7 +7346,28 @@
                 <w:sz w:val="24"/>
                 <w:szCs w:val="24"/>
               </w:rPr>
-              <w:t>Rст1 кОм</w:t>
+              <w:t>R</w:t>
+            </w:r>
+            <w:r>
+              <w:rPr>
+                <w:rFonts w:ascii="Times New Roman" w:eastAsia="Times New Roman" w:hAnsi="Times New Roman"/>
+                <w:b/>
+                <w:bCs/>
+                <w:sz w:val="24"/>
+                <w:szCs w:val="24"/>
+                <w:vertAlign w:val="subscript"/>
+              </w:rPr>
+              <w:t>ст1</w:t>
+            </w:r>
+            <w:r>
+              <w:rPr>
+                <w:rFonts w:ascii="Times New Roman" w:eastAsia="Times New Roman" w:hAnsi="Times New Roman"/>
+                <w:b/>
+                <w:bCs/>
+                <w:sz w:val="24"/>
+                <w:szCs w:val="24"/>
+              </w:rPr>
+              <w:t xml:space="preserve"> кОм</w:t>
             </w:r>
           </w:p>
         </w:tc>
@@ -4730,7 +7396,28 @@
                 <w:sz w:val="24"/>
                 <w:szCs w:val="24"/>
               </w:rPr>
-              <w:t>Rд1 кОм</w:t>
+              <w:t>R</w:t>
+            </w:r>
+            <w:r>
+              <w:rPr>
+                <w:rFonts w:ascii="Times New Roman" w:eastAsia="Times New Roman" w:hAnsi="Times New Roman"/>
+                <w:b/>
+                <w:bCs/>
+                <w:sz w:val="24"/>
+                <w:szCs w:val="24"/>
+                <w:vertAlign w:val="subscript"/>
+              </w:rPr>
+              <w:t>д1</w:t>
+            </w:r>
+            <w:r>
+              <w:rPr>
+                <w:rFonts w:ascii="Times New Roman" w:eastAsia="Times New Roman" w:hAnsi="Times New Roman"/>
+                <w:b/>
+                <w:bCs/>
+                <w:sz w:val="24"/>
+                <w:szCs w:val="24"/>
+              </w:rPr>
+              <w:t xml:space="preserve"> кОм</w:t>
             </w:r>
           </w:p>
         </w:tc>
@@ -4759,7 +7446,28 @@
                 <w:sz w:val="24"/>
                 <w:szCs w:val="24"/>
               </w:rPr>
-              <w:t>Rст2 кОм</w:t>
+              <w:t>R</w:t>
+            </w:r>
+            <w:r>
+              <w:rPr>
+                <w:rFonts w:ascii="Times New Roman" w:eastAsia="Times New Roman" w:hAnsi="Times New Roman"/>
+                <w:b/>
+                <w:bCs/>
+                <w:sz w:val="24"/>
+                <w:szCs w:val="24"/>
+                <w:vertAlign w:val="subscript"/>
+              </w:rPr>
+              <w:t>ст2</w:t>
+            </w:r>
+            <w:r>
+              <w:rPr>
+                <w:rFonts w:ascii="Times New Roman" w:eastAsia="Times New Roman" w:hAnsi="Times New Roman"/>
+                <w:b/>
+                <w:bCs/>
+                <w:sz w:val="24"/>
+                <w:szCs w:val="24"/>
+              </w:rPr>
+              <w:t xml:space="preserve"> кОм</w:t>
             </w:r>
           </w:p>
         </w:tc>
@@ -4788,7 +7496,28 @@
                 <w:sz w:val="24"/>
                 <w:szCs w:val="24"/>
               </w:rPr>
-              <w:t>Rд2 кОм</w:t>
+              <w:t>R</w:t>
+            </w:r>
+            <w:r>
+              <w:rPr>
+                <w:rFonts w:ascii="Times New Roman" w:eastAsia="Times New Roman" w:hAnsi="Times New Roman"/>
+                <w:b/>
+                <w:bCs/>
+                <w:sz w:val="24"/>
+                <w:szCs w:val="24"/>
+                <w:vertAlign w:val="subscript"/>
+              </w:rPr>
+              <w:t>д2</w:t>
+            </w:r>
+            <w:r>
+              <w:rPr>
+                <w:rFonts w:ascii="Times New Roman" w:eastAsia="Times New Roman" w:hAnsi="Times New Roman"/>
+                <w:b/>
+                <w:bCs/>
+                <w:sz w:val="24"/>
+                <w:szCs w:val="24"/>
+              </w:rPr>
+              <w:t xml:space="preserve"> кОм</w:t>
             </w:r>
           </w:p>
         </w:tc>
@@ -4817,7 +7546,28 @@
                 <w:sz w:val="24"/>
                 <w:szCs w:val="24"/>
               </w:rPr>
-              <w:t>Rст3 кОм</w:t>
+              <w:t>R</w:t>
+            </w:r>
+            <w:r>
+              <w:rPr>
+                <w:rFonts w:ascii="Times New Roman" w:eastAsia="Times New Roman" w:hAnsi="Times New Roman"/>
+                <w:b/>
+                <w:bCs/>
+                <w:sz w:val="24"/>
+                <w:szCs w:val="24"/>
+                <w:vertAlign w:val="subscript"/>
+              </w:rPr>
+              <w:t>ст3</w:t>
+            </w:r>
+            <w:r>
+              <w:rPr>
+                <w:rFonts w:ascii="Times New Roman" w:eastAsia="Times New Roman" w:hAnsi="Times New Roman"/>
+                <w:b/>
+                <w:bCs/>
+                <w:sz w:val="24"/>
+                <w:szCs w:val="24"/>
+              </w:rPr>
+              <w:t xml:space="preserve"> кОм</w:t>
             </w:r>
           </w:p>
         </w:tc>
@@ -4846,7 +7596,28 @@
                 <w:sz w:val="24"/>
                 <w:szCs w:val="24"/>
               </w:rPr>
-              <w:t>Rст4 кОм</w:t>
+              <w:t>R</w:t>
+            </w:r>
+            <w:r>
+              <w:rPr>
+                <w:rFonts w:ascii="Times New Roman" w:eastAsia="Times New Roman" w:hAnsi="Times New Roman"/>
+                <w:b/>
+                <w:bCs/>
+                <w:sz w:val="24"/>
+                <w:szCs w:val="24"/>
+                <w:vertAlign w:val="subscript"/>
+              </w:rPr>
+              <w:t>ст4</w:t>
+            </w:r>
+            <w:r>
+              <w:rPr>
+                <w:rFonts w:ascii="Times New Roman" w:eastAsia="Times New Roman" w:hAnsi="Times New Roman"/>
+                <w:b/>
+                <w:bCs/>
+                <w:sz w:val="24"/>
+                <w:szCs w:val="24"/>
+              </w:rPr>
+              <w:t xml:space="preserve"> кОм</w:t>
             </w:r>
           </w:p>
         </w:tc>
@@ -4875,7 +7646,28 @@
                 <w:sz w:val="24"/>
                 <w:szCs w:val="24"/>
               </w:rPr>
-              <w:t>Rд4 кОм</w:t>
+              <w:t>R</w:t>
+            </w:r>
+            <w:r>
+              <w:rPr>
+                <w:rFonts w:ascii="Times New Roman" w:eastAsia="Times New Roman" w:hAnsi="Times New Roman"/>
+                <w:b/>
+                <w:bCs/>
+                <w:sz w:val="24"/>
+                <w:szCs w:val="24"/>
+                <w:vertAlign w:val="subscript"/>
+              </w:rPr>
+              <w:t>д4</w:t>
+            </w:r>
+            <w:r>
+              <w:rPr>
+                <w:rFonts w:ascii="Times New Roman" w:eastAsia="Times New Roman" w:hAnsi="Times New Roman"/>
+                <w:b/>
+                <w:bCs/>
+                <w:sz w:val="24"/>
+                <w:szCs w:val="24"/>
+              </w:rPr>
+              <w:t xml:space="preserve"> кОм</w:t>
             </w:r>
           </w:p>
         </w:tc>
@@ -5077,13 +7869,81 @@
     </w:tbl>
     <w:p>
       <w:pPr>
-        <w:jc w:val="center"/>
         <w:rPr>
           <w:rFonts w:ascii="Times New Roman" w:hAnsi="Times New Roman" w:cs="Times New Roman"/>
           <w:sz w:val="32"/>
           <w:szCs w:val="32"/>
+          <w:lang w:val="en-US"/>
         </w:rPr>
       </w:pPr>
+      <w:r>
+        <w:rPr>
+          <w:rFonts w:ascii="Times New Roman" w:hAnsi="Times New Roman" w:cs="Times New Roman"/>
+          <w:noProof/>
+          <w:sz w:val="32"/>
+          <w:szCs w:val="32"/>
+          <w:lang w:val="en-US"/>
+        </w:rPr>
+        <w:drawing>
+          <wp:anchor distT="0" distB="0" distL="114300" distR="114300" simplePos="0" relativeHeight="251658240" behindDoc="1" locked="0" layoutInCell="1" allowOverlap="1" wp14:anchorId="5CA2F206" wp14:editId="5E139C11">
+            <wp:simplePos x="0" y="0"/>
+            <wp:positionH relativeFrom="column">
+              <wp:posOffset>-732057</wp:posOffset>
+            </wp:positionH>
+            <wp:positionV relativeFrom="paragraph">
+              <wp:posOffset>1741071</wp:posOffset>
+            </wp:positionV>
+            <wp:extent cx="7341431" cy="4193781"/>
+            <wp:effectExtent l="0" t="7302" r="4762" b="4763"/>
+            <wp:wrapNone/>
+            <wp:docPr id="1726034493" name="Picture 3"/>
+            <wp:cNvGraphicFramePr>
+              <a:graphicFrameLocks xmlns:a="http://schemas.openxmlformats.org/drawingml/2006/main" noChangeAspect="1"/>
+            </wp:cNvGraphicFramePr>
+            <a:graphic xmlns:a="http://schemas.openxmlformats.org/drawingml/2006/main">
+              <a:graphicData uri="http://schemas.openxmlformats.org/drawingml/2006/picture">
+                <pic:pic xmlns:pic="http://schemas.openxmlformats.org/drawingml/2006/picture">
+                  <pic:nvPicPr>
+                    <pic:cNvPr id="0" name="Picture 4"/>
+                    <pic:cNvPicPr>
+                      <a:picLocks noChangeAspect="1" noChangeArrowheads="1"/>
+                    </pic:cNvPicPr>
+                  </pic:nvPicPr>
+                  <pic:blipFill>
+                    <a:blip r:embed="rId5">
+                      <a:extLst>
+                        <a:ext uri="{28A0092B-C50C-407E-A947-70E740481C1C}">
+                          <a14:useLocalDpi xmlns:a14="http://schemas.microsoft.com/office/drawing/2010/main" val="0"/>
+                        </a:ext>
+                      </a:extLst>
+                    </a:blip>
+                    <a:srcRect/>
+                    <a:stretch>
+                      <a:fillRect/>
+                    </a:stretch>
+                  </pic:blipFill>
+                  <pic:spPr bwMode="auto">
+                    <a:xfrm rot="5400000">
+                      <a:off x="0" y="0"/>
+                      <a:ext cx="7345286" cy="4195983"/>
+                    </a:xfrm>
+                    <a:prstGeom prst="rect">
+                      <a:avLst/>
+                    </a:prstGeom>
+                    <a:noFill/>
+                  </pic:spPr>
+                </pic:pic>
+              </a:graphicData>
+            </a:graphic>
+            <wp14:sizeRelH relativeFrom="page">
+              <wp14:pctWidth>0</wp14:pctWidth>
+            </wp14:sizeRelH>
+            <wp14:sizeRelV relativeFrom="page">
+              <wp14:pctHeight>0</wp14:pctHeight>
+            </wp14:sizeRelV>
+          </wp:anchor>
+        </w:drawing>
+      </w:r>
     </w:p>
     <w:sectPr>
       <w:pgSz w:w="11906" w:h="16838"/>

</xml_diff>

<commit_message>
Finished with all cgws and almost done with course paper
</commit_message>
<xml_diff>
--- a/cgw/cgw_1[var11].docx
+++ b/cgw/cgw_1[var11].docx
@@ -297,11 +297,7 @@
         </w:rPr>
         <w:t>о выполнении РГР</w:t>
       </w:r>
-    </w:p>
-    <w:p>
-      <w:pPr>
-        <w:spacing w:after="0" w:line="240" w:lineRule="auto"/>
-        <w:jc w:val="center"/>
+      <w:r>
         <w:rPr>
           <w:rFonts w:ascii="Times New Roman" w:hAnsi="Times New Roman" w:cs="Times New Roman"/>
           <w:b/>
@@ -311,8 +307,13 @@
           <w:szCs w:val="32"/>
           <w14:ligatures w14:val="standardContextual"/>
         </w:rPr>
-      </w:pPr>
-      <w:r>
+        <w:t xml:space="preserve"> №1</w:t>
+      </w:r>
+    </w:p>
+    <w:p>
+      <w:pPr>
+        <w:spacing w:after="0" w:line="240" w:lineRule="auto"/>
+        <w:jc w:val="center"/>
         <w:rPr>
           <w:rFonts w:ascii="Times New Roman" w:hAnsi="Times New Roman" w:cs="Times New Roman"/>
           <w:b/>
@@ -322,6 +323,17 @@
           <w:szCs w:val="32"/>
           <w14:ligatures w14:val="standardContextual"/>
         </w:rPr>
+      </w:pPr>
+      <w:r>
+        <w:rPr>
+          <w:rFonts w:ascii="Times New Roman" w:hAnsi="Times New Roman" w:cs="Times New Roman"/>
+          <w:b/>
+          <w:bCs/>
+          <w:kern w:val="2"/>
+          <w:sz w:val="32"/>
+          <w:szCs w:val="32"/>
+          <w14:ligatures w14:val="standardContextual"/>
+        </w:rPr>
         <w:t>по дисциплине</w:t>
       </w:r>
     </w:p>
@@ -726,81 +738,18 @@
     </w:p>
     <w:p>
       <w:pPr>
-        <w:jc w:val="center"/>
-        <w:rPr>
-          <w:rFonts w:ascii="Times New Roman" w:hAnsi="Times New Roman" w:cs="Times New Roman"/>
-          <w:b/>
-          <w:sz w:val="32"/>
-          <w:szCs w:val="32"/>
+        <w:pStyle w:val="Heading2"/>
+        <w:rPr>
+          <w:rFonts w:eastAsia="Times New Roman"/>
+          <w:lang w:eastAsia="ru-RU"/>
         </w:rPr>
       </w:pPr>
       <w:r>
         <w:rPr>
-          <w:rFonts w:ascii="Times New Roman" w:hAnsi="Times New Roman" w:cs="Times New Roman"/>
-          <w:b/>
-          <w:sz w:val="32"/>
-          <w:szCs w:val="32"/>
+          <w:rFonts w:eastAsia="Times New Roman"/>
+          <w:lang w:eastAsia="ru-RU"/>
         </w:rPr>
         <w:lastRenderedPageBreak/>
-        <w:t>Вариант 1</w:t>
-      </w:r>
-      <w:r>
-        <w:rPr>
-          <w:rFonts w:ascii="Times New Roman" w:hAnsi="Times New Roman" w:cs="Times New Roman"/>
-          <w:b/>
-          <w:sz w:val="32"/>
-          <w:szCs w:val="32"/>
-        </w:rPr>
-        <w:t>1</w:t>
-      </w:r>
-    </w:p>
-    <w:p>
-      <w:pPr>
-        <w:spacing w:before="100" w:beforeAutospacing="1" w:after="100" w:afterAutospacing="1" w:line="240" w:lineRule="auto"/>
-        <w:outlineLvl w:val="1"/>
-        <w:rPr>
-          <w:rFonts w:ascii="Times New Roman" w:eastAsia="Times New Roman" w:hAnsi="Times New Roman" w:cs="Times New Roman"/>
-          <w:b/>
-          <w:bCs/>
-          <w:sz w:val="36"/>
-          <w:szCs w:val="36"/>
-          <w:lang w:eastAsia="ru-RU"/>
-        </w:rPr>
-      </w:pPr>
-      <w:r>
-        <w:rPr>
-          <w:rFonts w:ascii="Times New Roman" w:eastAsia="Times New Roman" w:hAnsi="Times New Roman" w:cs="Times New Roman"/>
-          <w:b/>
-          <w:bCs/>
-          <w:sz w:val="36"/>
-          <w:szCs w:val="36"/>
-          <w:lang w:eastAsia="ru-RU"/>
-        </w:rPr>
-        <w:t>Работа №1</w:t>
-      </w:r>
-    </w:p>
-    <w:p>
-      <w:pPr>
-        <w:spacing w:before="100" w:beforeAutospacing="1" w:after="100" w:afterAutospacing="1" w:line="240" w:lineRule="auto"/>
-        <w:outlineLvl w:val="2"/>
-        <w:rPr>
-          <w:rFonts w:ascii="Times New Roman" w:eastAsia="Times New Roman" w:hAnsi="Times New Roman" w:cs="Times New Roman"/>
-          <w:b/>
-          <w:bCs/>
-          <w:sz w:val="27"/>
-          <w:szCs w:val="27"/>
-          <w:lang w:eastAsia="ru-RU"/>
-        </w:rPr>
-      </w:pPr>
-      <w:r>
-        <w:rPr>
-          <w:rFonts w:ascii="Times New Roman" w:eastAsia="Times New Roman" w:hAnsi="Times New Roman" w:cs="Times New Roman"/>
-          <w:b/>
-          <w:bCs/>
-          <w:sz w:val="27"/>
-          <w:szCs w:val="27"/>
-          <w:lang w:eastAsia="ru-RU"/>
-        </w:rPr>
         <w:t>Таблица с исходными данными:</w:t>
       </w:r>
     </w:p>
@@ -1514,24 +1463,15 @@
     </w:p>
     <w:p>
       <w:pPr>
-        <w:spacing w:before="100" w:beforeAutospacing="1" w:after="100" w:afterAutospacing="1" w:line="240" w:lineRule="auto"/>
-        <w:outlineLvl w:val="1"/>
-        <w:rPr>
-          <w:rFonts w:ascii="Times New Roman" w:eastAsia="Times New Roman" w:hAnsi="Times New Roman" w:cs="Times New Roman"/>
-          <w:b/>
-          <w:bCs/>
-          <w:sz w:val="36"/>
-          <w:szCs w:val="36"/>
+        <w:pStyle w:val="Heading2"/>
+        <w:rPr>
+          <w:rFonts w:eastAsia="Times New Roman"/>
           <w:lang w:eastAsia="ru-RU"/>
         </w:rPr>
       </w:pPr>
       <w:r>
         <w:rPr>
-          <w:rFonts w:ascii="Times New Roman" w:eastAsia="Times New Roman" w:hAnsi="Times New Roman" w:cs="Times New Roman"/>
-          <w:b/>
-          <w:bCs/>
-          <w:sz w:val="36"/>
-          <w:szCs w:val="36"/>
+          <w:rFonts w:eastAsia="Times New Roman"/>
           <w:lang w:eastAsia="ru-RU"/>
         </w:rPr>
         <w:t>Функция, описывающая прямую ветвь ВАХ:</w:t>
@@ -1817,8 +1757,8 @@
           <w:rFonts w:ascii="Times New Roman" w:eastAsia="Times New Roman" w:hAnsi="Times New Roman" w:cs="Times New Roman"/>
           <w:b/>
           <w:bCs/>
-          <w:sz w:val="36"/>
-          <w:szCs w:val="36"/>
+          <w:sz w:val="30"/>
+          <w:szCs w:val="30"/>
           <w:lang w:eastAsia="ru-RU"/>
         </w:rPr>
       </w:pPr>
@@ -1827,8 +1767,8 @@
           <w:rFonts w:ascii="Times New Roman" w:eastAsia="Times New Roman" w:hAnsi="Times New Roman" w:cs="Times New Roman"/>
           <w:b/>
           <w:bCs/>
-          <w:sz w:val="36"/>
-          <w:szCs w:val="36"/>
+          <w:sz w:val="30"/>
+          <w:szCs w:val="30"/>
           <w:lang w:eastAsia="ru-RU"/>
         </w:rPr>
         <w:t>Максимальный ток:</w:t>
@@ -2104,8 +2044,8 @@
           <w:rFonts w:ascii="Times New Roman" w:eastAsia="Times New Roman" w:hAnsi="Times New Roman" w:cs="Times New Roman"/>
           <w:b/>
           <w:bCs/>
-          <w:sz w:val="36"/>
-          <w:szCs w:val="36"/>
+          <w:sz w:val="30"/>
+          <w:szCs w:val="30"/>
           <w:lang w:eastAsia="ru-RU"/>
         </w:rPr>
       </w:pPr>
@@ -2115,8 +2055,8 @@
           <w:rFonts w:ascii="Times New Roman" w:eastAsia="Times New Roman" w:hAnsi="Times New Roman" w:cs="Times New Roman"/>
           <w:b/>
           <w:bCs/>
-          <w:sz w:val="36"/>
-          <w:szCs w:val="36"/>
+          <w:sz w:val="30"/>
+          <w:szCs w:val="30"/>
           <w:lang w:eastAsia="ru-RU"/>
         </w:rPr>
         <w:t>Расчитаем</w:t>
@@ -2127,8 +2067,8 @@
           <w:rFonts w:ascii="Times New Roman" w:eastAsia="Times New Roman" w:hAnsi="Times New Roman" w:cs="Times New Roman"/>
           <w:b/>
           <w:bCs/>
-          <w:sz w:val="36"/>
-          <w:szCs w:val="36"/>
+          <w:sz w:val="30"/>
+          <w:szCs w:val="30"/>
           <w:lang w:eastAsia="ru-RU"/>
         </w:rPr>
         <w:t xml:space="preserve"> точки для построения графика:</w:t>
@@ -2544,8 +2484,8 @@
           <w:rFonts w:ascii="Times New Roman" w:eastAsia="Times New Roman" w:hAnsi="Times New Roman" w:cs="Times New Roman"/>
           <w:b/>
           <w:bCs/>
-          <w:sz w:val="24"/>
-          <w:szCs w:val="24"/>
+          <w:sz w:val="26"/>
+          <w:szCs w:val="26"/>
           <w:lang w:eastAsia="ru-RU"/>
         </w:rPr>
         <w:t>Расчет параметров в рабочей точке PT1</w:t>
@@ -2677,7 +2617,7 @@
           <w:rFonts w:ascii="Times New Roman" w:eastAsia="Times New Roman" w:hAnsi="Times New Roman" w:cs="Times New Roman"/>
           <w:sz w:val="24"/>
           <w:szCs w:val="24"/>
-          <w:lang w:val="en-US" w:eastAsia="ru-RU"/>
+          <w:lang w:eastAsia="ru-RU"/>
         </w:rPr>
       </w:pPr>
       <m:oMathPara>
@@ -2862,8 +2802,8 @@
           <w:rFonts w:ascii="Times New Roman" w:eastAsia="Times New Roman" w:hAnsi="Times New Roman" w:cs="Times New Roman"/>
           <w:b/>
           <w:bCs/>
-          <w:sz w:val="24"/>
-          <w:szCs w:val="24"/>
+          <w:sz w:val="26"/>
+          <w:szCs w:val="26"/>
           <w:lang w:eastAsia="ru-RU"/>
         </w:rPr>
         <w:t xml:space="preserve">Статическое сопротивление </w:t>
@@ -2874,8 +2814,8 @@
             <m:ctrlPr>
               <w:rPr>
                 <w:rFonts w:ascii="Cambria Math" w:eastAsia="Times New Roman" w:hAnsi="Cambria Math" w:cs="Times New Roman"/>
-                <w:sz w:val="24"/>
-                <w:szCs w:val="24"/>
+                <w:sz w:val="26"/>
+                <w:szCs w:val="26"/>
                 <w:lang w:eastAsia="ru-RU"/>
               </w:rPr>
             </m:ctrlPr>
@@ -2884,8 +2824,8 @@
             <m:r>
               <w:rPr>
                 <w:rFonts w:ascii="Cambria Math" w:eastAsia="Times New Roman" w:hAnsi="Cambria Math" w:cs="Times New Roman"/>
-                <w:sz w:val="24"/>
-                <w:szCs w:val="24"/>
+                <w:sz w:val="26"/>
+                <w:szCs w:val="26"/>
                 <w:lang w:eastAsia="ru-RU"/>
               </w:rPr>
               <m:t>R</m:t>
@@ -2898,8 +2838,8 @@
               </m:rPr>
               <w:rPr>
                 <w:rFonts w:ascii="Times New Roman" w:eastAsia="Times New Roman" w:hAnsi="Times New Roman" w:cs="Times New Roman"/>
-                <w:sz w:val="24"/>
-                <w:szCs w:val="24"/>
+                <w:sz w:val="26"/>
+                <w:szCs w:val="26"/>
                 <w:lang w:eastAsia="ru-RU"/>
               </w:rPr>
               <m:t>ст</m:t>
@@ -2907,8 +2847,8 @@
             <m:r>
               <w:rPr>
                 <w:rFonts w:ascii="Cambria Math" w:eastAsia="Times New Roman" w:hAnsi="Cambria Math" w:cs="Times New Roman"/>
-                <w:sz w:val="24"/>
-                <w:szCs w:val="24"/>
+                <w:sz w:val="26"/>
+                <w:szCs w:val="26"/>
                 <w:lang w:eastAsia="ru-RU"/>
               </w:rPr>
               <m:t>1</m:t>
@@ -2921,8 +2861,8 @@
           <w:rFonts w:ascii="Times New Roman" w:eastAsia="Times New Roman" w:hAnsi="Times New Roman" w:cs="Times New Roman"/>
           <w:b/>
           <w:bCs/>
-          <w:sz w:val="24"/>
-          <w:szCs w:val="24"/>
+          <w:sz w:val="26"/>
+          <w:szCs w:val="26"/>
           <w:lang w:eastAsia="ru-RU"/>
         </w:rPr>
         <w:t>:</w:t>
@@ -2945,7 +2885,7 @@
           <w:rFonts w:ascii="Times New Roman" w:eastAsia="Times New Roman" w:hAnsi="Times New Roman" w:cs="Times New Roman"/>
           <w:sz w:val="24"/>
           <w:szCs w:val="24"/>
-          <w:lang w:val="en-US" w:eastAsia="ru-RU"/>
+          <w:lang w:eastAsia="ru-RU"/>
         </w:rPr>
       </w:pPr>
       <m:oMathPara>
@@ -3250,8 +3190,8 @@
           <w:rFonts w:ascii="Times New Roman" w:eastAsia="Times New Roman" w:hAnsi="Times New Roman" w:cs="Times New Roman"/>
           <w:b/>
           <w:bCs/>
-          <w:sz w:val="24"/>
-          <w:szCs w:val="24"/>
+          <w:sz w:val="26"/>
+          <w:szCs w:val="26"/>
           <w:lang w:eastAsia="ru-RU"/>
         </w:rPr>
         <w:t xml:space="preserve">Динамическое сопротивление </w:t>
@@ -3262,8 +3202,8 @@
             <m:ctrlPr>
               <w:rPr>
                 <w:rFonts w:ascii="Cambria Math" w:eastAsia="Times New Roman" w:hAnsi="Cambria Math" w:cs="Times New Roman"/>
-                <w:sz w:val="24"/>
-                <w:szCs w:val="24"/>
+                <w:sz w:val="26"/>
+                <w:szCs w:val="26"/>
                 <w:lang w:eastAsia="ru-RU"/>
               </w:rPr>
             </m:ctrlPr>
@@ -3272,8 +3212,8 @@
             <m:r>
               <w:rPr>
                 <w:rFonts w:ascii="Cambria Math" w:eastAsia="Times New Roman" w:hAnsi="Cambria Math" w:cs="Times New Roman"/>
-                <w:sz w:val="24"/>
-                <w:szCs w:val="24"/>
+                <w:sz w:val="26"/>
+                <w:szCs w:val="26"/>
                 <w:lang w:eastAsia="ru-RU"/>
               </w:rPr>
               <m:t>R</m:t>
@@ -3286,8 +3226,8 @@
               </m:rPr>
               <w:rPr>
                 <w:rFonts w:ascii="Times New Roman" w:eastAsia="Times New Roman" w:hAnsi="Times New Roman" w:cs="Times New Roman"/>
-                <w:sz w:val="24"/>
-                <w:szCs w:val="24"/>
+                <w:sz w:val="26"/>
+                <w:szCs w:val="26"/>
                 <w:lang w:eastAsia="ru-RU"/>
               </w:rPr>
               <m:t>д</m:t>
@@ -3295,8 +3235,8 @@
             <m:r>
               <w:rPr>
                 <w:rFonts w:ascii="Cambria Math" w:eastAsia="Times New Roman" w:hAnsi="Cambria Math" w:cs="Times New Roman"/>
-                <w:sz w:val="24"/>
-                <w:szCs w:val="24"/>
+                <w:sz w:val="26"/>
+                <w:szCs w:val="26"/>
                 <w:lang w:eastAsia="ru-RU"/>
               </w:rPr>
               <m:t>1</m:t>
@@ -3309,8 +3249,8 @@
           <w:rFonts w:ascii="Times New Roman" w:eastAsia="Times New Roman" w:hAnsi="Times New Roman" w:cs="Times New Roman"/>
           <w:b/>
           <w:bCs/>
-          <w:sz w:val="24"/>
-          <w:szCs w:val="24"/>
+          <w:sz w:val="26"/>
+          <w:szCs w:val="26"/>
           <w:lang w:eastAsia="ru-RU"/>
         </w:rPr>
         <w:t>:</w:t>
@@ -3323,25 +3263,7 @@
           <w:lang w:eastAsia="ru-RU"/>
         </w:rPr>
         <w:br/>
-        <w:t>Динамическое сопротивление определяется как производная напряжения по току в рабочей точке</w:t>
-      </w:r>
-      <w:r>
-        <w:rPr>
-          <w:rFonts w:ascii="Times New Roman" w:eastAsia="Times New Roman" w:hAnsi="Times New Roman" w:cs="Times New Roman"/>
-          <w:sz w:val="24"/>
-          <w:szCs w:val="24"/>
-          <w:lang w:eastAsia="ru-RU"/>
-        </w:rPr>
-        <w:t xml:space="preserve">. </w:t>
-      </w:r>
-      <w:r>
-        <w:rPr>
-          <w:rFonts w:ascii="Times New Roman" w:eastAsia="Times New Roman" w:hAnsi="Times New Roman" w:cs="Times New Roman"/>
-          <w:sz w:val="24"/>
-          <w:szCs w:val="24"/>
-          <w:lang w:eastAsia="ru-RU"/>
-        </w:rPr>
-        <w:t xml:space="preserve">Для диода </w:t>
+        <w:t xml:space="preserve">Динамическое сопротивление определяется как производная напряжения по току в рабочей точке. Для диода </w:t>
       </w:r>
       <m:oMath>
         <m:sSub>
@@ -3703,7 +3625,7 @@
           <w:rFonts w:ascii="Times New Roman" w:eastAsia="Times New Roman" w:hAnsi="Times New Roman" w:cs="Times New Roman"/>
           <w:sz w:val="24"/>
           <w:szCs w:val="24"/>
-          <w:lang w:val="en-US" w:eastAsia="ru-RU"/>
+          <w:lang w:eastAsia="ru-RU"/>
         </w:rPr>
       </w:pPr>
       <m:oMathPara>
@@ -3928,7 +3850,7 @@
           <w:rFonts w:ascii="Times New Roman" w:eastAsia="Times New Roman" w:hAnsi="Times New Roman" w:cs="Times New Roman"/>
           <w:sz w:val="24"/>
           <w:szCs w:val="24"/>
-          <w:lang w:val="en-US" w:eastAsia="ru-RU"/>
+          <w:lang w:eastAsia="ru-RU"/>
         </w:rPr>
       </w:pPr>
       <m:oMathPara>
@@ -4140,8 +4062,8 @@
           <w:rFonts w:ascii="Times New Roman" w:eastAsia="Times New Roman" w:hAnsi="Times New Roman" w:cs="Times New Roman"/>
           <w:b/>
           <w:bCs/>
-          <w:sz w:val="24"/>
-          <w:szCs w:val="24"/>
+          <w:sz w:val="26"/>
+          <w:szCs w:val="26"/>
           <w:lang w:eastAsia="ru-RU"/>
         </w:rPr>
         <w:t>Расчет параметров в рабочей точке PT2</w:t>
@@ -4273,7 +4195,7 @@
           <w:rFonts w:ascii="Times New Roman" w:eastAsia="Times New Roman" w:hAnsi="Times New Roman" w:cs="Times New Roman"/>
           <w:sz w:val="24"/>
           <w:szCs w:val="24"/>
-          <w:lang w:val="en-US" w:eastAsia="ru-RU"/>
+          <w:lang w:eastAsia="ru-RU"/>
         </w:rPr>
       </w:pPr>
       <m:oMathPara>
@@ -4542,9 +4464,11 @@
             <m:t>+1=151</m:t>
           </m:r>
           <m:r>
+            <m:rPr>
+              <m:sty m:val="p"/>
+            </m:rPr>
             <w:rPr>
               <w:rFonts w:ascii="Cambria Math" w:eastAsia="Times New Roman" w:hAnsi="Cambria Math" w:cs="Times New Roman"/>
-              <w:i/>
               <w:sz w:val="24"/>
               <w:szCs w:val="24"/>
               <w:lang w:eastAsia="ru-RU"/>
@@ -4637,8 +4561,8 @@
         <w:spacing w:before="100" w:beforeAutospacing="1" w:after="100" w:afterAutospacing="1" w:line="240" w:lineRule="auto"/>
         <w:rPr>
           <w:rFonts w:ascii="Times New Roman" w:eastAsia="Times New Roman" w:hAnsi="Times New Roman" w:cs="Times New Roman"/>
-          <w:sz w:val="24"/>
-          <w:szCs w:val="24"/>
+          <w:sz w:val="26"/>
+          <w:szCs w:val="26"/>
           <w:lang w:eastAsia="ru-RU"/>
         </w:rPr>
       </w:pPr>
@@ -4647,8 +4571,8 @@
           <w:rFonts w:ascii="Times New Roman" w:eastAsia="Times New Roman" w:hAnsi="Times New Roman" w:cs="Times New Roman"/>
           <w:b/>
           <w:bCs/>
-          <w:sz w:val="24"/>
-          <w:szCs w:val="24"/>
+          <w:sz w:val="26"/>
+          <w:szCs w:val="26"/>
           <w:lang w:eastAsia="ru-RU"/>
         </w:rPr>
         <w:t xml:space="preserve">Статическое сопротивление </w:t>
@@ -4659,8 +4583,8 @@
             <m:ctrlPr>
               <w:rPr>
                 <w:rFonts w:ascii="Cambria Math" w:eastAsia="Times New Roman" w:hAnsi="Cambria Math" w:cs="Times New Roman"/>
-                <w:sz w:val="24"/>
-                <w:szCs w:val="24"/>
+                <w:sz w:val="26"/>
+                <w:szCs w:val="26"/>
                 <w:lang w:eastAsia="ru-RU"/>
               </w:rPr>
             </m:ctrlPr>
@@ -4669,8 +4593,8 @@
             <m:r>
               <w:rPr>
                 <w:rFonts w:ascii="Cambria Math" w:eastAsia="Times New Roman" w:hAnsi="Cambria Math" w:cs="Times New Roman"/>
-                <w:sz w:val="24"/>
-                <w:szCs w:val="24"/>
+                <w:sz w:val="26"/>
+                <w:szCs w:val="26"/>
                 <w:lang w:eastAsia="ru-RU"/>
               </w:rPr>
               <m:t>R</m:t>
@@ -4683,8 +4607,8 @@
               </m:rPr>
               <w:rPr>
                 <w:rFonts w:ascii="Times New Roman" w:eastAsia="Times New Roman" w:hAnsi="Times New Roman" w:cs="Times New Roman"/>
-                <w:sz w:val="24"/>
-                <w:szCs w:val="24"/>
+                <w:sz w:val="26"/>
+                <w:szCs w:val="26"/>
                 <w:lang w:eastAsia="ru-RU"/>
               </w:rPr>
               <m:t>ст</m:t>
@@ -4692,8 +4616,8 @@
             <m:r>
               <w:rPr>
                 <w:rFonts w:ascii="Cambria Math" w:eastAsia="Times New Roman" w:hAnsi="Cambria Math" w:cs="Times New Roman"/>
-                <w:sz w:val="24"/>
-                <w:szCs w:val="24"/>
+                <w:sz w:val="26"/>
+                <w:szCs w:val="26"/>
                 <w:lang w:eastAsia="ru-RU"/>
               </w:rPr>
               <m:t>2</m:t>
@@ -4706,8 +4630,8 @@
           <w:rFonts w:ascii="Times New Roman" w:eastAsia="Times New Roman" w:hAnsi="Times New Roman" w:cs="Times New Roman"/>
           <w:b/>
           <w:bCs/>
-          <w:sz w:val="24"/>
-          <w:szCs w:val="24"/>
+          <w:sz w:val="26"/>
+          <w:szCs w:val="26"/>
           <w:lang w:eastAsia="ru-RU"/>
         </w:rPr>
         <w:t>:</w:t>
@@ -4720,7 +4644,7 @@
           <w:rFonts w:ascii="Times New Roman" w:eastAsia="Times New Roman" w:hAnsi="Times New Roman" w:cs="Times New Roman"/>
           <w:sz w:val="24"/>
           <w:szCs w:val="24"/>
-          <w:lang w:val="en-US" w:eastAsia="ru-RU"/>
+          <w:lang w:eastAsia="ru-RU"/>
         </w:rPr>
       </w:pPr>
       <m:oMathPara>
@@ -5025,8 +4949,8 @@
           <w:rFonts w:ascii="Times New Roman" w:eastAsia="Times New Roman" w:hAnsi="Times New Roman" w:cs="Times New Roman"/>
           <w:b/>
           <w:bCs/>
-          <w:sz w:val="24"/>
-          <w:szCs w:val="24"/>
+          <w:sz w:val="26"/>
+          <w:szCs w:val="26"/>
           <w:lang w:eastAsia="ru-RU"/>
         </w:rPr>
         <w:t xml:space="preserve">Динамическое сопротивление </w:t>
@@ -5037,8 +4961,8 @@
             <m:ctrlPr>
               <w:rPr>
                 <w:rFonts w:ascii="Cambria Math" w:eastAsia="Times New Roman" w:hAnsi="Cambria Math" w:cs="Times New Roman"/>
-                <w:sz w:val="24"/>
-                <w:szCs w:val="24"/>
+                <w:sz w:val="26"/>
+                <w:szCs w:val="26"/>
                 <w:lang w:eastAsia="ru-RU"/>
               </w:rPr>
             </m:ctrlPr>
@@ -5047,8 +4971,8 @@
             <m:r>
               <w:rPr>
                 <w:rFonts w:ascii="Cambria Math" w:eastAsia="Times New Roman" w:hAnsi="Cambria Math" w:cs="Times New Roman"/>
-                <w:sz w:val="24"/>
-                <w:szCs w:val="24"/>
+                <w:sz w:val="26"/>
+                <w:szCs w:val="26"/>
                 <w:lang w:eastAsia="ru-RU"/>
               </w:rPr>
               <m:t>R</m:t>
@@ -5061,8 +4985,8 @@
               </m:rPr>
               <w:rPr>
                 <w:rFonts w:ascii="Times New Roman" w:eastAsia="Times New Roman" w:hAnsi="Times New Roman" w:cs="Times New Roman"/>
-                <w:sz w:val="24"/>
-                <w:szCs w:val="24"/>
+                <w:sz w:val="26"/>
+                <w:szCs w:val="26"/>
                 <w:lang w:eastAsia="ru-RU"/>
               </w:rPr>
               <m:t>д</m:t>
@@ -5070,8 +4994,8 @@
             <m:r>
               <w:rPr>
                 <w:rFonts w:ascii="Cambria Math" w:eastAsia="Times New Roman" w:hAnsi="Cambria Math" w:cs="Times New Roman"/>
-                <w:sz w:val="24"/>
-                <w:szCs w:val="24"/>
+                <w:sz w:val="26"/>
+                <w:szCs w:val="26"/>
                 <w:lang w:eastAsia="ru-RU"/>
               </w:rPr>
               <m:t>2</m:t>
@@ -5084,8 +5008,8 @@
           <w:rFonts w:ascii="Times New Roman" w:eastAsia="Times New Roman" w:hAnsi="Times New Roman" w:cs="Times New Roman"/>
           <w:b/>
           <w:bCs/>
-          <w:sz w:val="24"/>
-          <w:szCs w:val="24"/>
+          <w:sz w:val="26"/>
+          <w:szCs w:val="26"/>
           <w:lang w:eastAsia="ru-RU"/>
         </w:rPr>
         <w:t>:</w:t>
@@ -5186,7 +5110,7 @@
           <w:rFonts w:ascii="Times New Roman" w:eastAsia="Times New Roman" w:hAnsi="Times New Roman" w:cs="Times New Roman"/>
           <w:sz w:val="24"/>
           <w:szCs w:val="24"/>
-          <w:lang w:val="en-US" w:eastAsia="ru-RU"/>
+          <w:lang w:eastAsia="ru-RU"/>
         </w:rPr>
       </w:pPr>
       <m:oMathPara>
@@ -5391,8 +5315,8 @@
           <w:rFonts w:ascii="Times New Roman" w:eastAsia="Times New Roman" w:hAnsi="Times New Roman" w:cs="Times New Roman"/>
           <w:b/>
           <w:bCs/>
-          <w:sz w:val="24"/>
-          <w:szCs w:val="24"/>
+          <w:sz w:val="26"/>
+          <w:szCs w:val="26"/>
           <w:lang w:eastAsia="ru-RU"/>
         </w:rPr>
       </w:pPr>
@@ -5401,8 +5325,8 @@
           <w:rFonts w:ascii="Times New Roman" w:eastAsia="Times New Roman" w:hAnsi="Times New Roman" w:cs="Times New Roman"/>
           <w:b/>
           <w:bCs/>
-          <w:sz w:val="24"/>
-          <w:szCs w:val="24"/>
+          <w:sz w:val="26"/>
+          <w:szCs w:val="26"/>
           <w:lang w:eastAsia="ru-RU"/>
         </w:rPr>
         <w:t>Расчет обратной ветви ВАХ</w:t>
@@ -5633,7 +5557,7 @@
           <w:rFonts w:ascii="Times New Roman" w:eastAsia="Times New Roman" w:hAnsi="Times New Roman" w:cs="Times New Roman"/>
           <w:sz w:val="24"/>
           <w:szCs w:val="24"/>
-          <w:lang w:val="en-US" w:eastAsia="ru-RU"/>
+          <w:lang w:eastAsia="ru-RU"/>
         </w:rPr>
       </w:pPr>
       <m:oMathPara>
@@ -5985,8 +5909,8 @@
           <w:rFonts w:ascii="Times New Roman" w:eastAsia="Times New Roman" w:hAnsi="Times New Roman" w:cs="Times New Roman"/>
           <w:b/>
           <w:bCs/>
-          <w:sz w:val="24"/>
-          <w:szCs w:val="24"/>
+          <w:sz w:val="26"/>
+          <w:szCs w:val="26"/>
           <w:lang w:eastAsia="ru-RU"/>
         </w:rPr>
       </w:pPr>
@@ -5995,8 +5919,8 @@
           <w:rFonts w:ascii="Times New Roman" w:eastAsia="Times New Roman" w:hAnsi="Times New Roman" w:cs="Times New Roman"/>
           <w:b/>
           <w:bCs/>
-          <w:sz w:val="24"/>
-          <w:szCs w:val="24"/>
+          <w:sz w:val="26"/>
+          <w:szCs w:val="26"/>
           <w:lang w:eastAsia="ru-RU"/>
         </w:rPr>
         <w:t>Расчет параметров в режиме пробоя (4-й квадрант)</w:t>
@@ -6239,7 +6163,7 @@
           <w:rFonts w:ascii="Times New Roman" w:eastAsia="Times New Roman" w:hAnsi="Times New Roman" w:cs="Times New Roman"/>
           <w:sz w:val="24"/>
           <w:szCs w:val="24"/>
-          <w:lang w:val="en-US" w:eastAsia="ru-RU"/>
+          <w:lang w:eastAsia="ru-RU"/>
         </w:rPr>
       </w:pPr>
       <m:oMathPara>
@@ -6761,7 +6685,7 @@
           <w:rFonts w:ascii="Times New Roman" w:eastAsia="Times New Roman" w:hAnsi="Times New Roman" w:cs="Times New Roman"/>
           <w:sz w:val="24"/>
           <w:szCs w:val="24"/>
-          <w:lang w:val="en-US" w:eastAsia="ru-RU"/>
+          <w:lang w:eastAsia="ru-RU"/>
         </w:rPr>
       </w:pPr>
       <m:oMathPara>
@@ -6776,7 +6700,6 @@
               <w:szCs w:val="24"/>
               <w:lang w:eastAsia="ru-RU"/>
             </w:rPr>
-            <w:lastRenderedPageBreak/>
             <m:t>Δ</m:t>
           </m:r>
           <m:r>
@@ -6973,7 +6896,8 @@
     <w:p>
       <w:pPr>
         <w:rPr>
-          <w:lang w:val="en-US" w:eastAsia="ru-RU"/>
+          <w:rFonts w:ascii="Times New Roman" w:hAnsi="Times New Roman" w:cs="Times New Roman"/>
+          <w:lang w:eastAsia="ru-RU"/>
         </w:rPr>
       </w:pPr>
       <m:oMathPara>
@@ -7252,24 +7176,15 @@
     </w:p>
     <w:p>
       <w:pPr>
-        <w:spacing w:before="100" w:beforeAutospacing="1" w:after="100" w:afterAutospacing="1" w:line="240" w:lineRule="auto"/>
-        <w:outlineLvl w:val="1"/>
-        <w:rPr>
-          <w:rFonts w:ascii="Times New Roman" w:eastAsia="Times New Roman" w:hAnsi="Times New Roman" w:cs="Times New Roman"/>
-          <w:b/>
-          <w:bCs/>
-          <w:sz w:val="36"/>
-          <w:szCs w:val="36"/>
+        <w:pStyle w:val="Heading2"/>
+        <w:rPr>
+          <w:rFonts w:eastAsia="Times New Roman"/>
           <w:lang w:eastAsia="ru-RU"/>
         </w:rPr>
       </w:pPr>
       <w:r>
         <w:rPr>
-          <w:rFonts w:ascii="Times New Roman" w:eastAsia="Times New Roman" w:hAnsi="Times New Roman" w:cs="Times New Roman"/>
-          <w:b/>
-          <w:bCs/>
-          <w:sz w:val="36"/>
-          <w:szCs w:val="36"/>
+          <w:rFonts w:eastAsia="Times New Roman"/>
           <w:lang w:eastAsia="ru-RU"/>
         </w:rPr>
         <w:t>Таблица 1:</w:t>
@@ -7869,34 +7784,29 @@
     </w:tbl>
     <w:p>
       <w:pPr>
+        <w:spacing w:line="278" w:lineRule="auto"/>
         <w:rPr>
           <w:rFonts w:ascii="Times New Roman" w:hAnsi="Times New Roman" w:cs="Times New Roman"/>
-          <w:sz w:val="32"/>
-          <w:szCs w:val="32"/>
-          <w:lang w:val="en-US"/>
         </w:rPr>
       </w:pPr>
       <w:r>
         <w:rPr>
           <w:rFonts w:ascii="Times New Roman" w:hAnsi="Times New Roman" w:cs="Times New Roman"/>
           <w:noProof/>
-          <w:sz w:val="32"/>
-          <w:szCs w:val="32"/>
-          <w:lang w:val="en-US"/>
         </w:rPr>
         <w:drawing>
-          <wp:anchor distT="0" distB="0" distL="114300" distR="114300" simplePos="0" relativeHeight="251658240" behindDoc="1" locked="0" layoutInCell="1" allowOverlap="1" wp14:anchorId="5CA2F206" wp14:editId="5E139C11">
+          <wp:anchor distT="0" distB="0" distL="114300" distR="114300" simplePos="0" relativeHeight="251659264" behindDoc="1" locked="0" layoutInCell="1" allowOverlap="1" wp14:anchorId="1E81BBB8" wp14:editId="539A4272">
             <wp:simplePos x="0" y="0"/>
-            <wp:positionH relativeFrom="column">
-              <wp:posOffset>-732057</wp:posOffset>
+            <wp:positionH relativeFrom="margin">
+              <wp:posOffset>-648970</wp:posOffset>
             </wp:positionH>
             <wp:positionV relativeFrom="paragraph">
-              <wp:posOffset>1741071</wp:posOffset>
+              <wp:posOffset>1424940</wp:posOffset>
             </wp:positionV>
-            <wp:extent cx="7341431" cy="4193781"/>
-            <wp:effectExtent l="0" t="7302" r="4762" b="4763"/>
+            <wp:extent cx="4700905" cy="2052955"/>
+            <wp:effectExtent l="9525" t="0" r="0" b="0"/>
             <wp:wrapNone/>
-            <wp:docPr id="1726034493" name="Picture 3"/>
+            <wp:docPr id="784187775" name="Picture 1"/>
             <wp:cNvGraphicFramePr>
               <a:graphicFrameLocks xmlns:a="http://schemas.openxmlformats.org/drawingml/2006/main" noChangeAspect="1"/>
             </wp:cNvGraphicFramePr>
@@ -7904,13 +7814,13 @@
               <a:graphicData uri="http://schemas.openxmlformats.org/drawingml/2006/picture">
                 <pic:pic xmlns:pic="http://schemas.openxmlformats.org/drawingml/2006/picture">
                   <pic:nvPicPr>
-                    <pic:cNvPr id="0" name="Picture 4"/>
+                    <pic:cNvPr id="0" name="Picture 1"/>
                     <pic:cNvPicPr>
                       <a:picLocks noChangeAspect="1" noChangeArrowheads="1"/>
                     </pic:cNvPicPr>
                   </pic:nvPicPr>
                   <pic:blipFill>
-                    <a:blip r:embed="rId5">
+                    <a:blip r:embed="rId5" cstate="print">
                       <a:extLst>
                         <a:ext uri="{28A0092B-C50C-407E-A947-70E740481C1C}">
                           <a14:useLocalDpi xmlns:a14="http://schemas.microsoft.com/office/drawing/2010/main" val="0"/>
@@ -7925,12 +7835,79 @@
                   <pic:spPr bwMode="auto">
                     <a:xfrm rot="5400000">
                       <a:off x="0" y="0"/>
-                      <a:ext cx="7345286" cy="4195983"/>
+                      <a:ext cx="4700905" cy="2052955"/>
                     </a:xfrm>
                     <a:prstGeom prst="rect">
                       <a:avLst/>
                     </a:prstGeom>
                     <a:noFill/>
+                    <a:ln>
+                      <a:noFill/>
+                    </a:ln>
+                  </pic:spPr>
+                </pic:pic>
+              </a:graphicData>
+            </a:graphic>
+            <wp14:sizeRelH relativeFrom="page">
+              <wp14:pctWidth>0</wp14:pctWidth>
+            </wp14:sizeRelH>
+            <wp14:sizeRelV relativeFrom="page">
+              <wp14:pctHeight>0</wp14:pctHeight>
+            </wp14:sizeRelV>
+          </wp:anchor>
+        </w:drawing>
+      </w:r>
+      <w:r>
+        <w:rPr>
+          <w:rFonts w:ascii="Times New Roman" w:hAnsi="Times New Roman" w:cs="Times New Roman"/>
+          <w:noProof/>
+          <w:sz w:val="32"/>
+          <w:szCs w:val="32"/>
+          <w:lang w:val="en-US"/>
+        </w:rPr>
+        <w:drawing>
+          <wp:anchor distT="0" distB="0" distL="114300" distR="114300" simplePos="0" relativeHeight="251661312" behindDoc="1" locked="0" layoutInCell="1" allowOverlap="1" wp14:anchorId="235E254E" wp14:editId="206FD302">
+            <wp:simplePos x="0" y="0"/>
+            <wp:positionH relativeFrom="column">
+              <wp:posOffset>1599420</wp:posOffset>
+            </wp:positionH>
+            <wp:positionV relativeFrom="paragraph">
+              <wp:posOffset>5674043</wp:posOffset>
+            </wp:positionV>
+            <wp:extent cx="4060109" cy="2297843"/>
+            <wp:effectExtent l="4763" t="0" r="2857" b="2858"/>
+            <wp:wrapNone/>
+            <wp:docPr id="265023947" name="Picture 1"/>
+            <wp:cNvGraphicFramePr>
+              <a:graphicFrameLocks xmlns:a="http://schemas.openxmlformats.org/drawingml/2006/main" noChangeAspect="1"/>
+            </wp:cNvGraphicFramePr>
+            <a:graphic xmlns:a="http://schemas.openxmlformats.org/drawingml/2006/main">
+              <a:graphicData uri="http://schemas.openxmlformats.org/drawingml/2006/picture">
+                <pic:pic xmlns:pic="http://schemas.openxmlformats.org/drawingml/2006/picture">
+                  <pic:nvPicPr>
+                    <pic:cNvPr id="265023947" name=""/>
+                    <pic:cNvPicPr/>
+                  </pic:nvPicPr>
+                  <pic:blipFill>
+                    <a:blip r:embed="rId6">
+                      <a:extLst>
+                        <a:ext uri="{28A0092B-C50C-407E-A947-70E740481C1C}">
+                          <a14:useLocalDpi xmlns:a14="http://schemas.microsoft.com/office/drawing/2010/main" val="0"/>
+                        </a:ext>
+                      </a:extLst>
+                    </a:blip>
+                    <a:stretch>
+                      <a:fillRect/>
+                    </a:stretch>
+                  </pic:blipFill>
+                  <pic:spPr>
+                    <a:xfrm rot="5400000">
+                      <a:off x="0" y="0"/>
+                      <a:ext cx="4060109" cy="2297843"/>
+                    </a:xfrm>
+                    <a:prstGeom prst="rect">
+                      <a:avLst/>
+                    </a:prstGeom>
                   </pic:spPr>
                 </pic:pic>
               </a:graphicData>
@@ -8393,10 +8370,9 @@
     <w:next w:val="Normal"/>
     <w:link w:val="Heading2Char"/>
     <w:uiPriority w:val="9"/>
-    <w:semiHidden/>
     <w:unhideWhenUsed/>
     <w:qFormat/>
-    <w:rsid w:val="006949B1"/>
+    <w:rsid w:val="003424A4"/>
     <w:pPr>
       <w:keepNext/>
       <w:keepLines/>
@@ -8405,7 +8381,7 @@
     </w:pPr>
     <w:rPr>
       <w:rFonts w:asciiTheme="majorHAnsi" w:eastAsiaTheme="majorEastAsia" w:hAnsiTheme="majorHAnsi" w:cstheme="majorBidi"/>
-      <w:color w:val="0F4761" w:themeColor="accent1" w:themeShade="BF"/>
+      <w:color w:val="008080"/>
       <w:sz w:val="32"/>
       <w:szCs w:val="32"/>
     </w:rPr>
@@ -8568,6 +8544,7 @@
   <w:style w:type="character" w:default="1" w:styleId="DefaultParagraphFont">
     <w:name w:val="Default Paragraph Font"/>
     <w:uiPriority w:val="1"/>
+    <w:semiHidden/>
     <w:unhideWhenUsed/>
   </w:style>
   <w:style w:type="table" w:default="1" w:styleId="TableNormal">
@@ -8609,13 +8586,14 @@
     <w:basedOn w:val="DefaultParagraphFont"/>
     <w:link w:val="Heading2"/>
     <w:uiPriority w:val="9"/>
-    <w:semiHidden/>
-    <w:rsid w:val="006949B1"/>
+    <w:rsid w:val="003424A4"/>
     <w:rPr>
       <w:rFonts w:asciiTheme="majorHAnsi" w:eastAsiaTheme="majorEastAsia" w:hAnsiTheme="majorHAnsi" w:cstheme="majorBidi"/>
-      <w:color w:val="0F4761" w:themeColor="accent1" w:themeShade="BF"/>
+      <w:color w:val="008080"/>
+      <w:kern w:val="0"/>
       <w:sz w:val="32"/>
       <w:szCs w:val="32"/>
+      <w14:ligatures w14:val="none"/>
     </w:rPr>
   </w:style>
   <w:style w:type="character" w:customStyle="1" w:styleId="Heading3Char">

</xml_diff>